<commit_message>
Started evaluation of retrieval and RAG content generation
</commit_message>
<xml_diff>
--- a/eval/preguntas_validacion.docx
+++ b/eval/preguntas_validacion.docx
@@ -9,17 +9,21 @@
       </w:pPr>
       <w:bookmarkStart w:id="0" w:name="_Toc231500538"/>
       <w:r>
-        <w:t xml:space="preserve">Preguntas validación </w:t>
-      </w:r>
-      <w:proofErr w:type="spellStart"/>
-      <w:r>
-        <w:t>ChatBot</w:t>
+        <w:t>Preguntas validación ChatBot</w:t>
       </w:r>
       <w:bookmarkEnd w:id="0"/>
-      <w:proofErr w:type="spellEnd"/>
     </w:p>
     <w:sdt>
       <w:sdtPr>
+        <w:rPr>
+          <w:rFonts w:asciiTheme="minorHAnsi" w:eastAsiaTheme="minorHAnsi" w:hAnsiTheme="minorHAnsi" w:cstheme="minorBidi"/>
+          <w:color w:val="auto"/>
+          <w:kern w:val="2"/>
+          <w:sz w:val="24"/>
+          <w:szCs w:val="24"/>
+          <w:lang w:eastAsia="en-US"/>
+          <w14:ligatures w14:val="standardContextual"/>
+        </w:rPr>
         <w:id w:val="-1328359981"/>
         <w:docPartObj>
           <w:docPartGallery w:val="Table of Contents"/>
@@ -28,15 +32,8 @@
       </w:sdtPr>
       <w:sdtEndPr>
         <w:rPr>
-          <w:rFonts w:asciiTheme="minorHAnsi" w:eastAsiaTheme="minorHAnsi" w:hAnsiTheme="minorHAnsi" w:cstheme="minorBidi"/>
           <w:b/>
           <w:bCs/>
-          <w:color w:val="auto"/>
-          <w:kern w:val="2"/>
-          <w:sz w:val="24"/>
-          <w:szCs w:val="24"/>
-          <w:lang w:eastAsia="en-US"/>
-          <w14:ligatures w14:val="standardContextual"/>
         </w:rPr>
       </w:sdtEndPr>
       <w:sdtContent>
@@ -2371,7 +2368,10 @@
           </w:tcPr>
           <w:p>
             <w:r>
-              <w:t>general_es_gepac_guia-toxicidad-quimioterapia_v1.pdf</w:t>
+              <w:t>general_es_gepac_guia-toxicidad-quimioterapia_v1</w:t>
+            </w:r>
+            <w:r>
+              <w:t>.pdf</w:t>
             </w:r>
           </w:p>
         </w:tc>
@@ -2381,7 +2381,7 @@
           </w:tcPr>
           <w:p>
             <w:r>
-              <w:t>7</w:t>
+              <w:t>9</w:t>
             </w:r>
           </w:p>
         </w:tc>
@@ -2448,23 +2448,7 @@
           </w:tcPr>
           <w:p>
             <w:r>
-              <w:t>Si fiebre de más de 38º C, hay que tomar un antipirético (paracetamol, ibuprofeno, metamizol</w:t>
-            </w:r>
-            <w:proofErr w:type="gramStart"/>
-            <w:r>
-              <w:t>… )</w:t>
-            </w:r>
-            <w:proofErr w:type="gramEnd"/>
-            <w:r>
-              <w:t xml:space="preserve"> si tras 6-8 horas vuelve a subir la fi </w:t>
-            </w:r>
-            <w:proofErr w:type="spellStart"/>
-            <w:r>
-              <w:t>ebre</w:t>
-            </w:r>
-            <w:proofErr w:type="spellEnd"/>
-            <w:r>
-              <w:t>, hay que acudir a urgencias para realizar las pruebas pertinentes.</w:t>
+              <w:t>Si fiebre de más de 38º C, hay que tomar un antipirético (paracetamol, ibuprofeno, metamizol… ) si tras 6-8 horas vuelve a subir la fi ebre, hay que acudir a urgencias para realizar las pruebas pertinentes.</w:t>
             </w:r>
           </w:p>
         </w:tc>
@@ -2484,7 +2468,10 @@
           </w:tcPr>
           <w:p>
             <w:r>
-              <w:t>40</w:t>
+              <w:t>4</w:t>
+            </w:r>
+            <w:r>
+              <w:t>2</w:t>
             </w:r>
           </w:p>
         </w:tc>
@@ -2521,7 +2508,10 @@
           </w:tcPr>
           <w:p>
             <w:r>
-              <w:t>33</w:t>
+              <w:t>3</w:t>
+            </w:r>
+            <w:r>
+              <w:t>4</w:t>
             </w:r>
           </w:p>
         </w:tc>
@@ -2541,7 +2531,11 @@
           <w:tcPr>
             <w:tcW w:w="3260" w:type="dxa"/>
           </w:tcPr>
-          <w:p/>
+          <w:p>
+            <w:r>
+              <w:t>general_es_pfizer_manual-pacientes_2007.pdf</w:t>
+            </w:r>
+          </w:p>
         </w:tc>
         <w:tc>
           <w:tcPr>
@@ -2549,7 +2543,10 @@
           </w:tcPr>
           <w:p>
             <w:r>
-              <w:t>149</w:t>
+              <w:t>1</w:t>
+            </w:r>
+            <w:r>
+              <w:t>50</w:t>
             </w:r>
           </w:p>
         </w:tc>
@@ -2639,7 +2636,10 @@
           </w:tcPr>
           <w:p>
             <w:r>
-              <w:t>45</w:t>
+              <w:t>4</w:t>
+            </w:r>
+            <w:r>
+              <w:t>7</w:t>
             </w:r>
           </w:p>
         </w:tc>
@@ -2736,7 +2736,10 @@
           </w:tcPr>
           <w:p>
             <w:r>
-              <w:t>12</w:t>
+              <w:t>1</w:t>
+            </w:r>
+            <w:r>
+              <w:t>4</w:t>
             </w:r>
           </w:p>
         </w:tc>
@@ -2832,7 +2835,10 @@
           </w:tcPr>
           <w:p>
             <w:r>
-              <w:t>32</w:t>
+              <w:t>3</w:t>
+            </w:r>
+            <w:r>
+              <w:t>3</w:t>
             </w:r>
           </w:p>
         </w:tc>
@@ -2925,7 +2931,10 @@
           </w:tcPr>
           <w:p>
             <w:r>
-              <w:t>40</w:t>
+              <w:t>4</w:t>
+            </w:r>
+            <w:r>
+              <w:t>1</w:t>
             </w:r>
           </w:p>
         </w:tc>
@@ -3012,7 +3021,7 @@
           </w:tcPr>
           <w:p>
             <w:r>
-              <w:t>39</w:t>
+              <w:t>40</w:t>
             </w:r>
           </w:p>
         </w:tc>
@@ -3044,7 +3053,10 @@
           </w:tcPr>
           <w:p>
             <w:r>
-              <w:t>20</w:t>
+              <w:t>2</w:t>
+            </w:r>
+            <w:r>
+              <w:t>2</w:t>
             </w:r>
           </w:p>
         </w:tc>
@@ -3140,7 +3152,7 @@
           </w:tcPr>
           <w:p>
             <w:r>
-              <w:t>39</w:t>
+              <w:t>40</w:t>
             </w:r>
           </w:p>
         </w:tc>
@@ -3152,23 +3164,7 @@
           </w:tcPr>
           <w:p>
             <w:r>
-              <w:t xml:space="preserve">La caída del cabello suele comenzar a las 2-3 semanas del tratamiento y </w:t>
-            </w:r>
-            <w:proofErr w:type="spellStart"/>
-            <w:r>
-              <w:t>co</w:t>
-            </w:r>
-            <w:proofErr w:type="spellEnd"/>
-            <w:r>
-              <w:t xml:space="preserve"> </w:t>
-            </w:r>
-            <w:proofErr w:type="spellStart"/>
-            <w:r>
-              <w:t>mienza</w:t>
-            </w:r>
-            <w:proofErr w:type="spellEnd"/>
-            <w:r>
-              <w:t xml:space="preserve"> a recuperarse a partir de los 3-6 meses del cese de la quimioterapia. En ocasiones el nuevo cabello es de características diferentes.</w:t>
+              <w:t>La caída del cabello suele comenzar a las 2-3 semanas del tratamiento y co mienza a recuperarse a partir de los 3-6 meses del cese de la quimioterapia. En ocasiones el nuevo cabello es de características diferentes.</w:t>
             </w:r>
           </w:p>
         </w:tc>
@@ -3188,7 +3184,10 @@
           </w:tcPr>
           <w:p>
             <w:r>
-              <w:t>20</w:t>
+              <w:t>2</w:t>
+            </w:r>
+            <w:r>
+              <w:t>2</w:t>
             </w:r>
           </w:p>
         </w:tc>
@@ -3205,23 +3204,10 @@
         <w:t>Pregunta 9: ¿Qué medicamento de quimioterapia se asocia a la TDA en el</w:t>
       </w:r>
       <w:r>
-        <w:t xml:space="preserve"> cáncer de próstata hormono-sensible </w:t>
-      </w:r>
-      <w:proofErr w:type="spellStart"/>
-      <w:r>
-        <w:t>meastásica</w:t>
-      </w:r>
-      <w:proofErr w:type="spellEnd"/>
-      <w:r>
-        <w:t xml:space="preserve"> </w:t>
-      </w:r>
-      <w:proofErr w:type="spellStart"/>
-      <w:r>
-        <w:t>CPHSm</w:t>
-      </w:r>
-      <w:proofErr w:type="spellEnd"/>
-      <w:r>
-        <w:t>?</w:t>
+        <w:t xml:space="preserve"> cáncer de próstata hormono-sensible meastásica</w:t>
+      </w:r>
+      <w:r>
+        <w:t xml:space="preserve"> CPHSm?</w:t>
       </w:r>
       <w:bookmarkEnd w:id="9"/>
     </w:p>
@@ -3274,21 +3260,8 @@
             <w:tcW w:w="4520" w:type="dxa"/>
           </w:tcPr>
           <w:p>
-            <w:proofErr w:type="spellStart"/>
-            <w:r>
-              <w:t>Docetaxel</w:t>
-            </w:r>
-            <w:proofErr w:type="spellEnd"/>
-            <w:r>
-              <w:t xml:space="preserve"> es el único tratamiento de quimioterapia que se utiliza asociado a la TDA en el </w:t>
-            </w:r>
-            <w:proofErr w:type="spellStart"/>
-            <w:r>
-              <w:t>CPHSm</w:t>
-            </w:r>
-            <w:proofErr w:type="spellEnd"/>
-            <w:r>
-              <w:t>.</w:t>
+            <w:r>
+              <w:t>Docetaxel es el único tratamiento de quimioterapia que se utiliza asociado a la TDA en el CPHSm.</w:t>
             </w:r>
             <w:r>
               <w:t xml:space="preserve"> </w:t>
@@ -3351,7 +3324,7 @@
       <w:tr>
         <w:tc>
           <w:tcPr>
-            <w:tcW w:w="4520" w:type="dxa"/>
+            <w:tcW w:w="4439" w:type="dxa"/>
           </w:tcPr>
           <w:p>
             <w:r>
@@ -3361,7 +3334,7 @@
         </w:tc>
         <w:tc>
           <w:tcPr>
-            <w:tcW w:w="2992" w:type="dxa"/>
+            <w:tcW w:w="3075" w:type="dxa"/>
           </w:tcPr>
           <w:p>
             <w:r>
@@ -3371,7 +3344,7 @@
         </w:tc>
         <w:tc>
           <w:tcPr>
-            <w:tcW w:w="982" w:type="dxa"/>
+            <w:tcW w:w="980" w:type="dxa"/>
           </w:tcPr>
           <w:p>
             <w:r>
@@ -3383,7 +3356,7 @@
       <w:tr>
         <w:tc>
           <w:tcPr>
-            <w:tcW w:w="4520" w:type="dxa"/>
+            <w:tcW w:w="4439" w:type="dxa"/>
           </w:tcPr>
           <w:p>
             <w:r>
@@ -3393,7 +3366,7 @@
         </w:tc>
         <w:tc>
           <w:tcPr>
-            <w:tcW w:w="2992" w:type="dxa"/>
+            <w:tcW w:w="3075" w:type="dxa"/>
           </w:tcPr>
           <w:p>
             <w:r>
@@ -3403,19 +3376,19 @@
         </w:tc>
         <w:tc>
           <w:tcPr>
-            <w:tcW w:w="982" w:type="dxa"/>
-          </w:tcPr>
-          <w:p>
-            <w:r>
-              <w:t>72</w:t>
-            </w:r>
-          </w:p>
-        </w:tc>
-      </w:tr>
-      <w:tr>
-        <w:tc>
-          <w:tcPr>
-            <w:tcW w:w="4520" w:type="dxa"/>
+            <w:tcW w:w="980" w:type="dxa"/>
+          </w:tcPr>
+          <w:p>
+            <w:r>
+              <w:t>69</w:t>
+            </w:r>
+          </w:p>
+        </w:tc>
+      </w:tr>
+      <w:tr>
+        <w:tc>
+          <w:tcPr>
+            <w:tcW w:w="4439" w:type="dxa"/>
           </w:tcPr>
           <w:p>
             <w:r>
@@ -3425,7 +3398,7 @@
         </w:tc>
         <w:tc>
           <w:tcPr>
-            <w:tcW w:w="2992" w:type="dxa"/>
+            <w:tcW w:w="3075" w:type="dxa"/>
           </w:tcPr>
           <w:p>
             <w:r>
@@ -3436,7 +3409,7 @@
         </w:tc>
         <w:tc>
           <w:tcPr>
-            <w:tcW w:w="982" w:type="dxa"/>
+            <w:tcW w:w="980" w:type="dxa"/>
           </w:tcPr>
           <w:p>
             <w:r>
@@ -3448,7 +3421,7 @@
       <w:tr>
         <w:tc>
           <w:tcPr>
-            <w:tcW w:w="4520" w:type="dxa"/>
+            <w:tcW w:w="4439" w:type="dxa"/>
           </w:tcPr>
           <w:p>
             <w:r>
@@ -3458,7 +3431,7 @@
         </w:tc>
         <w:tc>
           <w:tcPr>
-            <w:tcW w:w="2992" w:type="dxa"/>
+            <w:tcW w:w="3075" w:type="dxa"/>
           </w:tcPr>
           <w:p>
             <w:r>
@@ -3468,7 +3441,7 @@
         </w:tc>
         <w:tc>
           <w:tcPr>
-            <w:tcW w:w="982" w:type="dxa"/>
+            <w:tcW w:w="980" w:type="dxa"/>
           </w:tcPr>
           <w:p>
             <w:r>
@@ -3480,33 +3453,20 @@
       <w:tr>
         <w:tc>
           <w:tcPr>
-            <w:tcW w:w="4520" w:type="dxa"/>
-          </w:tcPr>
-          <w:p>
-            <w:r>
-              <w:t>Denosumab (</w:t>
-            </w:r>
-            <w:proofErr w:type="spellStart"/>
-            <w:r>
-              <w:t>Xgeva</w:t>
-            </w:r>
-            <w:proofErr w:type="spellEnd"/>
-            <w:r>
-              <w:t xml:space="preserve">®, </w:t>
-            </w:r>
-            <w:proofErr w:type="spellStart"/>
-            <w:r>
-              <w:t>Prolia</w:t>
-            </w:r>
-            <w:proofErr w:type="spellEnd"/>
-            <w:r>
-              <w:t>®) [...] puede ayudar a prevenir o retrasar algunos problemas, como las fracturas [...] Al igual que los bifosfonatos, el denosumab también bloquea las células de los huesos llamadas osteoclastos</w:t>
-            </w:r>
-          </w:p>
-        </w:tc>
-        <w:tc>
-          <w:tcPr>
-            <w:tcW w:w="2992" w:type="dxa"/>
+            <w:tcW w:w="4439" w:type="dxa"/>
+          </w:tcPr>
+          <w:p>
+            <w:r>
+              <w:t>Denosumab (Xgeva®, Prolia®) [...] puede ayudar a prevenir o retrasar algunos problemas, como las fracturas</w:t>
+            </w:r>
+            <w:r>
+              <w:t xml:space="preserve">. </w:t>
+            </w:r>
+          </w:p>
+        </w:tc>
+        <w:tc>
+          <w:tcPr>
+            <w:tcW w:w="3075" w:type="dxa"/>
           </w:tcPr>
           <w:p>
             <w:r>
@@ -3517,7 +3477,7 @@
         </w:tc>
         <w:tc>
           <w:tcPr>
-            <w:tcW w:w="982" w:type="dxa"/>
+            <w:tcW w:w="980" w:type="dxa"/>
           </w:tcPr>
           <w:p>
             <w:pPr>
@@ -3530,6 +3490,39 @@
             </w:r>
             <w:r>
               <w:t>10</w:t>
+            </w:r>
+          </w:p>
+        </w:tc>
+      </w:tr>
+      <w:tr>
+        <w:tc>
+          <w:tcPr>
+            <w:tcW w:w="4439" w:type="dxa"/>
+          </w:tcPr>
+          <w:p>
+            <w:r>
+              <w:t>Al igual que los bifosfonatos, el denosumab también bloquea las células de los huesos llamadas osteoclastos</w:t>
+            </w:r>
+          </w:p>
+        </w:tc>
+        <w:tc>
+          <w:tcPr>
+            <w:tcW w:w="3075" w:type="dxa"/>
+          </w:tcPr>
+          <w:p>
+            <w:r>
+              <w:t>prostata_es_gepac_guia-cancer-de-prostata_2020.pdf</w:t>
+            </w:r>
+          </w:p>
+          <w:p/>
+        </w:tc>
+        <w:tc>
+          <w:tcPr>
+            <w:tcW w:w="980" w:type="dxa"/>
+          </w:tcPr>
+          <w:p>
+            <w:r>
+              <w:t>110</w:t>
             </w:r>
           </w:p>
         </w:tc>
@@ -3544,11 +3537,9 @@
       <w:r>
         <w:t xml:space="preserve">Pregunta 11: ¿Cuál es el principal efecto adverso de la </w:t>
       </w:r>
-      <w:proofErr w:type="spellStart"/>
       <w:r>
         <w:t>Apalutamida</w:t>
       </w:r>
-      <w:proofErr w:type="spellEnd"/>
       <w:r>
         <w:t>?</w:t>
       </w:r>
@@ -3604,23 +3595,7 @@
           </w:tcPr>
           <w:p>
             <w:r>
-              <w:t xml:space="preserve">El principal efecto adverso de </w:t>
-            </w:r>
-            <w:proofErr w:type="spellStart"/>
-            <w:r>
-              <w:t>Apalutamida</w:t>
-            </w:r>
-            <w:proofErr w:type="spellEnd"/>
-            <w:r>
-              <w:t xml:space="preserve"> es la aparición de un </w:t>
-            </w:r>
-            <w:proofErr w:type="spellStart"/>
-            <w:r>
-              <w:t>rash</w:t>
-            </w:r>
-            <w:proofErr w:type="spellEnd"/>
-            <w:r>
-              <w:t xml:space="preserve"> o exantema en la piel además de leve cansancio.</w:t>
+              <w:t>El principal efecto adverso de Apalutamida es la aparición de un rash o exantema en la piel además de leve cansancio.</w:t>
             </w:r>
           </w:p>
         </w:tc>
@@ -3794,23 +3769,7 @@
           </w:tcPr>
           <w:p>
             <w:r>
-              <w:t xml:space="preserve">El cáncer de próstata no metastásico que sigue creciendo a pesar del tratamiento con terapia de privación de andrógenos (cáncer de próstata resistente a la castración [CPRC]) suele tratarse con los medicamentos antiandrógenos </w:t>
-            </w:r>
-            <w:proofErr w:type="spellStart"/>
-            <w:r>
-              <w:t>apalutamida</w:t>
-            </w:r>
-            <w:proofErr w:type="spellEnd"/>
-            <w:r>
-              <w:t xml:space="preserve">, </w:t>
-            </w:r>
-            <w:proofErr w:type="spellStart"/>
-            <w:r>
-              <w:t>darolutamida</w:t>
-            </w:r>
-            <w:proofErr w:type="spellEnd"/>
-            <w:r>
-              <w:t xml:space="preserve"> o enzalutamida.</w:t>
+              <w:t>El cáncer de próstata no metastásico que sigue creciendo a pesar del tratamiento con terapia de privación de andrógenos (cáncer de próstata resistente a la castración [CPRC]) suele tratarse con los medicamentos antiandrógenos apalutamida, darolutamida o enzalutamida.</w:t>
             </w:r>
           </w:p>
         </w:tc>
@@ -3900,16 +3859,7 @@
           </w:tcPr>
           <w:p>
             <w:r>
-              <w:t>La enfermedad metastásica</w:t>
-            </w:r>
-            <w:r>
-              <w:t xml:space="preserve"> (cáncer de próstata metastásico)</w:t>
-            </w:r>
-            <w:r>
-              <w:t xml:space="preserve"> suele tratarse con terapia de privación de andrógenos</w:t>
-            </w:r>
-            <w:r>
-              <w:t>.</w:t>
+              <w:t>La enfermedad metastásica suele tratarse con terapia de privación de andrógenos</w:t>
             </w:r>
           </w:p>
           <w:p/>
@@ -4125,7 +4075,10 @@
           </w:tcPr>
           <w:p>
             <w:r>
-              <w:t>12</w:t>
+              <w:t>1</w:t>
+            </w:r>
+            <w:r>
+              <w:t>3</w:t>
             </w:r>
           </w:p>
         </w:tc>
@@ -4202,15 +4155,7 @@
               <w:t xml:space="preserve"> </w:t>
             </w:r>
             <w:r>
-              <w:t xml:space="preserve">mejorar la supervivencia de pacientes con </w:t>
-            </w:r>
-            <w:proofErr w:type="spellStart"/>
-            <w:r>
-              <w:t>CPRCm</w:t>
-            </w:r>
-            <w:proofErr w:type="spellEnd"/>
-            <w:r>
-              <w:t xml:space="preserve"> y lesiones únicamente óseas.</w:t>
+              <w:t>mejorar la supervivencia de pacientes con CPRCm y lesiones únicamente óseas.</w:t>
             </w:r>
           </w:p>
         </w:tc>
@@ -4245,117 +4190,8 @@
           </w:tcPr>
           <w:p>
             <w:r>
-              <w:t xml:space="preserve">In </w:t>
-            </w:r>
-            <w:proofErr w:type="spellStart"/>
-            <w:r>
-              <w:t>mCRPC</w:t>
-            </w:r>
-            <w:proofErr w:type="spellEnd"/>
-            <w:r>
-              <w:t xml:space="preserve"> </w:t>
-            </w:r>
-            <w:proofErr w:type="spellStart"/>
-            <w:r>
-              <w:t>patients</w:t>
-            </w:r>
-            <w:proofErr w:type="spellEnd"/>
-            <w:r>
-              <w:t xml:space="preserve"> </w:t>
-            </w:r>
-            <w:proofErr w:type="spellStart"/>
-            <w:r>
-              <w:t>with</w:t>
-            </w:r>
-            <w:proofErr w:type="spellEnd"/>
-            <w:r>
-              <w:t xml:space="preserve"> </w:t>
-            </w:r>
-            <w:proofErr w:type="spellStart"/>
-            <w:r>
-              <w:t>symptomatic</w:t>
-            </w:r>
-            <w:proofErr w:type="spellEnd"/>
-            <w:r>
-              <w:t xml:space="preserve"> </w:t>
-            </w:r>
-            <w:proofErr w:type="spellStart"/>
-            <w:r>
-              <w:t>bone</w:t>
-            </w:r>
-            <w:proofErr w:type="spellEnd"/>
-            <w:r>
-              <w:t xml:space="preserve"> </w:t>
-            </w:r>
-            <w:proofErr w:type="spellStart"/>
-            <w:r>
-              <w:t>metasta</w:t>
-            </w:r>
-            <w:proofErr w:type="spellEnd"/>
-            <w:r>
-              <w:t xml:space="preserve"> </w:t>
-            </w:r>
-            <w:proofErr w:type="spellStart"/>
-            <w:r>
-              <w:t>ses</w:t>
-            </w:r>
-            <w:proofErr w:type="spellEnd"/>
-            <w:r>
-              <w:t xml:space="preserve"> and </w:t>
-            </w:r>
-            <w:proofErr w:type="spellStart"/>
-            <w:r>
-              <w:t>contraindication</w:t>
-            </w:r>
-            <w:proofErr w:type="spellEnd"/>
-            <w:r>
-              <w:t xml:space="preserve"> </w:t>
-            </w:r>
-            <w:proofErr w:type="spellStart"/>
-            <w:r>
-              <w:t>or</w:t>
-            </w:r>
-            <w:proofErr w:type="spellEnd"/>
-            <w:r>
-              <w:t xml:space="preserve"> </w:t>
-            </w:r>
-            <w:proofErr w:type="spellStart"/>
-            <w:r>
-              <w:t>progression</w:t>
-            </w:r>
-            <w:proofErr w:type="spellEnd"/>
-            <w:r>
-              <w:t xml:space="preserve"> </w:t>
-            </w:r>
-            <w:proofErr w:type="spellStart"/>
-            <w:r>
-              <w:t>to</w:t>
-            </w:r>
-            <w:proofErr w:type="spellEnd"/>
-            <w:r>
-              <w:t xml:space="preserve"> </w:t>
-            </w:r>
-            <w:proofErr w:type="spellStart"/>
-            <w:r>
-              <w:t>docetaxel</w:t>
-            </w:r>
-            <w:proofErr w:type="spellEnd"/>
-            <w:r>
-              <w:t xml:space="preserve">, radium-223 </w:t>
-            </w:r>
-            <w:proofErr w:type="spellStart"/>
-            <w:r>
-              <w:t>may</w:t>
-            </w:r>
-            <w:proofErr w:type="spellEnd"/>
-            <w:r>
-              <w:t xml:space="preserve"> be </w:t>
-            </w:r>
-            <w:proofErr w:type="spellStart"/>
-            <w:r>
-              <w:t>considered</w:t>
-            </w:r>
-            <w:proofErr w:type="spellEnd"/>
+              <w:t>In mCRPC patients with symptomatic bone metasta ses and contraindication or progression to docetaxel, radium-223 may be considered</w:t>
+            </w:r>
           </w:p>
         </w:tc>
         <w:tc>
@@ -4447,6 +4283,33 @@
               <w:t>Los principales posibles efectos secundarios de la prostatectomía radical son la incontinencia urinaria (falta de control de la vejiga) e impotencia (el no poder lograr erecciones).</w:t>
             </w:r>
           </w:p>
+        </w:tc>
+        <w:tc>
+          <w:tcPr>
+            <w:tcW w:w="3075" w:type="dxa"/>
+          </w:tcPr>
+          <w:p>
+            <w:r>
+              <w:t>prostata_es_gepac_guia-cancer-de-prostata_2020.pdf</w:t>
+            </w:r>
+          </w:p>
+        </w:tc>
+        <w:tc>
+          <w:tcPr>
+            <w:tcW w:w="980" w:type="dxa"/>
+          </w:tcPr>
+          <w:p>
+            <w:r>
+              <w:t>71</w:t>
+            </w:r>
+          </w:p>
+        </w:tc>
+      </w:tr>
+      <w:tr>
+        <w:tc>
+          <w:tcPr>
+            <w:tcW w:w="4439" w:type="dxa"/>
+          </w:tcPr>
           <w:p>
             <w:r>
               <w:t xml:space="preserve">Después de esta operación, la capacidad de lograr erecciones depende de la edad, la capacidad que tenía usted de lograr erecciones antes de la operación, y si se cortaron los nervios. Todos los hombres pueden esperar una reducción en la capacidad de tener erecciones, pero cuanto más joven sea </w:t>
@@ -4456,16 +4319,6 @@
               <w:t>usted, hay más probabilidades de que conserve esta capacidad.</w:t>
             </w:r>
           </w:p>
-          <w:p>
-            <w:r>
-              <w:t>Si su capacidad para lograr erecciones regresa después de la cirugía, esto a menudo ocurre lentamente. De hecho, esto puede tardar desde unos pocos meses hasta dos años.</w:t>
-            </w:r>
-          </w:p>
-          <w:p>
-            <w:r>
-              <w:t>Si después de la cirugía regresa la potencia, la sensación del orgasmo debe continuar siendo placentera, pero no hay eyaculación de semen (el orgasmo es “seco”).</w:t>
-            </w:r>
-          </w:p>
         </w:tc>
         <w:tc>
           <w:tcPr>
@@ -4484,7 +4337,10 @@
           </w:tcPr>
           <w:p>
             <w:r>
-              <w:t>71, 73</w:t>
+              <w:t>7</w:t>
+            </w:r>
+            <w:r>
+              <w:t>3</w:t>
             </w:r>
           </w:p>
         </w:tc>
@@ -4496,6 +4352,46 @@
           </w:tcPr>
           <w:p>
             <w:r>
+              <w:t>Si su capacidad para lograr erecciones regresa después de la cirugía, esto a menudo ocurre lentamente. De hecho, esto puede tardar desde unos pocos meses hasta dos años.</w:t>
+            </w:r>
+          </w:p>
+          <w:p>
+            <w:r>
+              <w:t>Si después de la cirugía regresa la potencia, la sensación del orgasmo debe continuar siendo placentera, pero no hay eyaculación de semen (el orgasmo es “seco”).</w:t>
+            </w:r>
+          </w:p>
+        </w:tc>
+        <w:tc>
+          <w:tcPr>
+            <w:tcW w:w="3075" w:type="dxa"/>
+          </w:tcPr>
+          <w:p>
+            <w:r>
+              <w:t>prostata_es_gepac_guia-cancer-de-prostata_2020.pdf</w:t>
+            </w:r>
+          </w:p>
+        </w:tc>
+        <w:tc>
+          <w:tcPr>
+            <w:tcW w:w="980" w:type="dxa"/>
+          </w:tcPr>
+          <w:p>
+            <w:r>
+              <w:t>7</w:t>
+            </w:r>
+            <w:r>
+              <w:t>4</w:t>
+            </w:r>
+          </w:p>
+        </w:tc>
+      </w:tr>
+      <w:tr>
+        <w:tc>
+          <w:tcPr>
+            <w:tcW w:w="4439" w:type="dxa"/>
+          </w:tcPr>
+          <w:p>
+            <w:r>
               <w:t>Problemas de erección</w:t>
             </w:r>
           </w:p>
@@ -4506,6 +4402,50 @@
           </w:tcPr>
           <w:p>
             <w:r>
+              <w:t>prostata_es_seor_guia-para-</w:t>
+            </w:r>
+            <w:r>
+              <w:rPr>
+                <w:u w:val="single"/>
+              </w:rPr>
+              <w:t>pacientes</w:t>
+            </w:r>
+            <w:r>
+              <w:t>_v1.pdf</w:t>
+            </w:r>
+          </w:p>
+        </w:tc>
+        <w:tc>
+          <w:tcPr>
+            <w:tcW w:w="980" w:type="dxa"/>
+          </w:tcPr>
+          <w:p>
+            <w:r>
+              <w:t>1</w:t>
+            </w:r>
+            <w:r>
+              <w:t>6</w:t>
+            </w:r>
+          </w:p>
+        </w:tc>
+      </w:tr>
+      <w:tr>
+        <w:tc>
+          <w:tcPr>
+            <w:tcW w:w="4439" w:type="dxa"/>
+          </w:tcPr>
+          <w:p>
+            <w:r>
+              <w:t>Problemas de erección</w:t>
+            </w:r>
+          </w:p>
+        </w:tc>
+        <w:tc>
+          <w:tcPr>
+            <w:tcW w:w="3075" w:type="dxa"/>
+          </w:tcPr>
+          <w:p>
+            <w:r>
               <w:t>prostata_es_seor_guia-para-pacientes_v1.pdf</w:t>
             </w:r>
           </w:p>
@@ -4516,7 +4456,7 @@
           </w:tcPr>
           <w:p>
             <w:r>
-              <w:t>15</w:t>
+              <w:t>16</w:t>
             </w:r>
           </w:p>
         </w:tc>
@@ -4656,101 +4596,18 @@
           </w:tcPr>
           <w:p>
             <w:r>
-              <w:t xml:space="preserve">Mantener un estado nutritivo equilibrado ayuda, sin duda, a sobrellevar mejor la quimioterapia y tener mayor sensación de bienestar. Una dieta equilibrada incluye alimentos de todos los grupos (verduras, frutas, </w:t>
-            </w:r>
-            <w:proofErr w:type="spellStart"/>
-            <w:r>
-              <w:t>legum</w:t>
-            </w:r>
-            <w:proofErr w:type="spellEnd"/>
-            <w:r>
-              <w:t xml:space="preserve"> </w:t>
-            </w:r>
-            <w:proofErr w:type="spellStart"/>
-            <w:r>
-              <w:t>bres</w:t>
-            </w:r>
-            <w:proofErr w:type="spellEnd"/>
-            <w:r>
-              <w:t>, pescados y carnes) en cantidades suficientes.</w:t>
-            </w:r>
-          </w:p>
-          <w:p>
-            <w:r>
-              <w:t xml:space="preserve">Algunas personas en quimio o radioterapia mantienen un estado </w:t>
-            </w:r>
-            <w:proofErr w:type="spellStart"/>
-            <w:r>
-              <w:t>nutri</w:t>
-            </w:r>
-            <w:proofErr w:type="spellEnd"/>
-            <w:r>
-              <w:t xml:space="preserve"> </w:t>
-            </w:r>
-            <w:proofErr w:type="spellStart"/>
-            <w:r>
-              <w:t>tivo</w:t>
-            </w:r>
-            <w:proofErr w:type="spellEnd"/>
-            <w:r>
-              <w:t xml:space="preserve"> adecuado, sin padecer efectos secundarios (diarrea, estreñimiento, náuseas, etc.) o experimentándolos en forma muy leve.</w:t>
-            </w:r>
-          </w:p>
-          <w:p>
-            <w:r>
-              <w:t xml:space="preserve">Para prevenir los efectos secundarios digestivos de los tratamientos (náuseas, </w:t>
-            </w:r>
+              <w:t>Mantener un estado nutritivo equilibrado ayuda, sin duda, a sobrellevar mejor la quimioterapia y tener mayor sensación de bienestar. Una dieta equilibrada incluye alimentos de todos los grupos (verduras, frutas, legum bres, pescados y carnes) en cantidades suficientes.</w:t>
+            </w:r>
+          </w:p>
+          <w:p>
+            <w:r>
+              <w:t>Algunas personas en quimio o radioterapia mantienen un estado nutri tivo adecuado, sin padecer efectos secundarios (diarrea, estreñimiento, náuseas, etc.) o experimentándolos en forma muy leve.</w:t>
+            </w:r>
+          </w:p>
+          <w:p>
             <w:r>
               <w:lastRenderedPageBreak/>
-              <w:t xml:space="preserve">vómitos, etc.) es aconsejable comer una, dos o tres horas antes de la quimio o radioterapia. Para evitar o disminuir los efectos adversos de los tratamientos, se recomienda seguir una dieta baja en grasas, es decir, de fácil digestión, el día anterior a la quimioterapia, durante los días de </w:t>
-            </w:r>
-            <w:proofErr w:type="spellStart"/>
-            <w:r>
-              <w:t>tra</w:t>
-            </w:r>
-            <w:proofErr w:type="spellEnd"/>
-            <w:r>
-              <w:t xml:space="preserve"> </w:t>
-            </w:r>
-            <w:proofErr w:type="spellStart"/>
-            <w:r>
-              <w:t>tamiento</w:t>
-            </w:r>
-            <w:proofErr w:type="spellEnd"/>
-            <w:r>
-              <w:t xml:space="preserve"> y los dos o tres días posteriores, pasando progresivamente a la dieta habitual. En los casos de inapetencia o mala digestión, se puede fraccionar la dieta en unas seis tomas diarias (comidas frecuentes y de poco </w:t>
-            </w:r>
-            <w:proofErr w:type="spellStart"/>
-            <w:r>
-              <w:t>volu</w:t>
-            </w:r>
-            <w:proofErr w:type="spellEnd"/>
-            <w:r>
-              <w:t xml:space="preserve"> </w:t>
-            </w:r>
-            <w:proofErr w:type="spellStart"/>
-            <w:r>
-              <w:t>men</w:t>
-            </w:r>
-            <w:proofErr w:type="spellEnd"/>
-            <w:r>
-              <w:t xml:space="preserve">) sin que sea necesario realizar las tradicionales tres comidas </w:t>
-            </w:r>
-            <w:proofErr w:type="spellStart"/>
-            <w:r>
-              <w:t>prin</w:t>
-            </w:r>
-            <w:proofErr w:type="spellEnd"/>
-            <w:r>
-              <w:t xml:space="preserve"> </w:t>
-            </w:r>
-            <w:proofErr w:type="spellStart"/>
-            <w:r>
-              <w:t>cipales</w:t>
-            </w:r>
-            <w:proofErr w:type="spellEnd"/>
-            <w:r>
-              <w:t>.</w:t>
+              <w:t>Para prevenir los efectos secundarios digestivos de los tratamientos (náuseas, vómitos, etc.) es aconsejable comer una, dos o tres horas antes de la quimio o radioterapia. Para evitar o disminuir los efectos adversos de los tratamientos, se recomienda seguir una dieta baja en grasas, es decir, de fácil digestión, el día anterior a la quimioterapia, durante los días de tra tamiento y los dos o tres días posteriores, pasando progresivamente a la dieta habitual. En los casos de inapetencia o mala digestión, se puede fraccionar la dieta en unas seis tomas diarias (comidas frecuentes y de poco volu men) sin que sea necesario realizar las tradicionales tres comidas prin cipales.</w:t>
             </w:r>
           </w:p>
         </w:tc>
@@ -4771,7 +4628,10 @@
           </w:tcPr>
           <w:p>
             <w:r>
-              <w:t>97</w:t>
+              <w:t>9</w:t>
+            </w:r>
+            <w:r>
+              <w:t>8</w:t>
             </w:r>
           </w:p>
         </w:tc>
@@ -4787,15 +4647,7 @@
         <w:t xml:space="preserve">Pregunta 17: </w:t>
       </w:r>
       <w:r>
-        <w:t>¿Qué síntoma se denomina "</w:t>
-      </w:r>
-      <w:proofErr w:type="spellStart"/>
-      <w:r>
-        <w:t>tinnitus</w:t>
-      </w:r>
-      <w:proofErr w:type="spellEnd"/>
-      <w:r>
-        <w:t>"?</w:t>
+        <w:t>¿Qué síntoma se denomina "tinnitus"?</w:t>
       </w:r>
       <w:bookmarkEnd w:id="17"/>
     </w:p>
@@ -4886,23 +4738,7 @@
       </w:r>
       <w:r>
         <w:tab/>
-        <w:t xml:space="preserve">¿Para qué sirve </w:t>
-      </w:r>
-      <w:proofErr w:type="gramStart"/>
-      <w:r>
-        <w:t>el test</w:t>
-      </w:r>
-      <w:proofErr w:type="gramEnd"/>
-      <w:r>
-        <w:t xml:space="preserve"> PAM50 (</w:t>
-      </w:r>
-      <w:proofErr w:type="spellStart"/>
-      <w:r>
-        <w:t>Prosigna</w:t>
-      </w:r>
-      <w:proofErr w:type="spellEnd"/>
-      <w:r>
-        <w:t>)?</w:t>
+        <w:t>¿Para qué sirve el test PAM50 (Prosigna)?</w:t>
       </w:r>
       <w:bookmarkEnd w:id="18"/>
     </w:p>
@@ -4956,245 +4792,13 @@
           </w:tcPr>
           <w:p>
             <w:r>
-              <w:t xml:space="preserve">The 50-gene </w:t>
-            </w:r>
-            <w:proofErr w:type="spellStart"/>
-            <w:r>
-              <w:t>assay</w:t>
-            </w:r>
-            <w:proofErr w:type="spellEnd"/>
-            <w:r>
-              <w:t xml:space="preserve"> (PAM-50) </w:t>
-            </w:r>
-            <w:proofErr w:type="spellStart"/>
-            <w:r>
-              <w:t>risk</w:t>
-            </w:r>
-            <w:proofErr w:type="spellEnd"/>
-            <w:r>
-              <w:t xml:space="preserve"> </w:t>
-            </w:r>
-            <w:proofErr w:type="spellStart"/>
-            <w:r>
-              <w:t>of</w:t>
-            </w:r>
-            <w:proofErr w:type="spellEnd"/>
-            <w:r>
-              <w:t xml:space="preserve"> </w:t>
-            </w:r>
-            <w:proofErr w:type="spellStart"/>
-            <w:r>
-              <w:t>recurrence</w:t>
-            </w:r>
-            <w:proofErr w:type="spellEnd"/>
-            <w:r>
-              <w:t xml:space="preserve"> (ROR) score</w:t>
-            </w:r>
-            <w:r>
-              <w:t xml:space="preserve"> </w:t>
-            </w:r>
-            <w:proofErr w:type="spellStart"/>
-            <w:r>
-              <w:t>stratifies</w:t>
-            </w:r>
-            <w:proofErr w:type="spellEnd"/>
-            <w:r>
-              <w:t xml:space="preserve"> </w:t>
-            </w:r>
-            <w:proofErr w:type="spellStart"/>
-            <w:r>
-              <w:t>patients</w:t>
-            </w:r>
-            <w:proofErr w:type="spellEnd"/>
-            <w:r>
-              <w:t xml:space="preserve"> </w:t>
-            </w:r>
-            <w:proofErr w:type="spellStart"/>
-            <w:r>
-              <w:t>with</w:t>
-            </w:r>
-            <w:proofErr w:type="spellEnd"/>
-            <w:r>
-              <w:t xml:space="preserve"> HR-positive </w:t>
-            </w:r>
-            <w:proofErr w:type="spellStart"/>
-            <w:r>
-              <w:t>disease</w:t>
-            </w:r>
-            <w:proofErr w:type="spellEnd"/>
-            <w:r>
-              <w:t xml:space="preserve"> </w:t>
-            </w:r>
-            <w:proofErr w:type="spellStart"/>
-            <w:r>
-              <w:t>into</w:t>
-            </w:r>
-            <w:proofErr w:type="spellEnd"/>
-            <w:r>
-              <w:t xml:space="preserve"> </w:t>
-            </w:r>
-            <w:proofErr w:type="spellStart"/>
-            <w:r>
-              <w:t>high</w:t>
-            </w:r>
-            <w:proofErr w:type="spellEnd"/>
-            <w:r>
-              <w:t xml:space="preserve">-, </w:t>
-            </w:r>
-            <w:proofErr w:type="spellStart"/>
-            <w:r>
-              <w:t>medium</w:t>
-            </w:r>
-            <w:proofErr w:type="spellEnd"/>
-            <w:r>
-              <w:t>-,</w:t>
-            </w:r>
-            <w:r>
-              <w:t xml:space="preserve"> </w:t>
-            </w:r>
-            <w:r>
-              <w:t xml:space="preserve">and </w:t>
-            </w:r>
-            <w:proofErr w:type="spellStart"/>
-            <w:r>
-              <w:t>low-risk</w:t>
-            </w:r>
-            <w:proofErr w:type="spellEnd"/>
-            <w:r>
-              <w:t xml:space="preserve"> </w:t>
-            </w:r>
-            <w:proofErr w:type="spellStart"/>
-            <w:r>
-              <w:t>groups</w:t>
-            </w:r>
-            <w:proofErr w:type="spellEnd"/>
-            <w:r>
-              <w:t xml:space="preserve">. </w:t>
-            </w:r>
-            <w:proofErr w:type="spellStart"/>
-            <w:r>
-              <w:t>Several</w:t>
-            </w:r>
-            <w:proofErr w:type="spellEnd"/>
-            <w:r>
-              <w:t xml:space="preserve"> </w:t>
-            </w:r>
-            <w:proofErr w:type="spellStart"/>
-            <w:r>
-              <w:t>studie</w:t>
-            </w:r>
-            <w:r>
-              <w:t>s</w:t>
-            </w:r>
-            <w:proofErr w:type="spellEnd"/>
-            <w:r>
-              <w:t xml:space="preserve"> </w:t>
-            </w:r>
-            <w:proofErr w:type="spellStart"/>
-            <w:r>
-              <w:t>have</w:t>
-            </w:r>
-            <w:proofErr w:type="spellEnd"/>
-            <w:r>
-              <w:t xml:space="preserve"> </w:t>
-            </w:r>
-            <w:proofErr w:type="spellStart"/>
-            <w:r>
-              <w:t>shown</w:t>
-            </w:r>
-            <w:proofErr w:type="spellEnd"/>
-            <w:r>
-              <w:t xml:space="preserve"> </w:t>
-            </w:r>
-            <w:proofErr w:type="spellStart"/>
-            <w:r>
-              <w:t>the</w:t>
-            </w:r>
-            <w:proofErr w:type="spellEnd"/>
-            <w:r>
-              <w:t xml:space="preserve"> </w:t>
-            </w:r>
-            <w:proofErr w:type="spellStart"/>
-            <w:r>
-              <w:t>prognostic</w:t>
-            </w:r>
-            <w:proofErr w:type="spellEnd"/>
-          </w:p>
-          <w:p>
-            <w:proofErr w:type="spellStart"/>
-            <w:r>
-              <w:t>V</w:t>
-            </w:r>
-            <w:r>
-              <w:t>alue</w:t>
-            </w:r>
-            <w:proofErr w:type="spellEnd"/>
-            <w:r>
-              <w:t xml:space="preserve"> </w:t>
-            </w:r>
-            <w:proofErr w:type="spellStart"/>
-            <w:r>
-              <w:t>of</w:t>
-            </w:r>
-            <w:proofErr w:type="spellEnd"/>
-            <w:r>
-              <w:t xml:space="preserve"> </w:t>
-            </w:r>
-            <w:r>
-              <w:t>ROR</w:t>
-            </w:r>
-            <w:r>
-              <w:t xml:space="preserve"> </w:t>
-            </w:r>
-            <w:r>
-              <w:t>score</w:t>
-            </w:r>
-            <w:r>
-              <w:t xml:space="preserve"> </w:t>
-            </w:r>
-            <w:r>
-              <w:t>in</w:t>
-            </w:r>
-            <w:r>
-              <w:t xml:space="preserve"> </w:t>
-            </w:r>
-            <w:proofErr w:type="spellStart"/>
-            <w:r>
-              <w:t>estimating</w:t>
-            </w:r>
-            <w:proofErr w:type="spellEnd"/>
-            <w:r>
-              <w:t xml:space="preserve"> </w:t>
-            </w:r>
-            <w:proofErr w:type="spellStart"/>
-            <w:r>
-              <w:t>risk</w:t>
-            </w:r>
-            <w:proofErr w:type="spellEnd"/>
-            <w:r>
-              <w:t xml:space="preserve"> </w:t>
-            </w:r>
-            <w:proofErr w:type="spellStart"/>
-            <w:r>
-              <w:t>of</w:t>
-            </w:r>
-            <w:proofErr w:type="spellEnd"/>
-            <w:r>
-              <w:t xml:space="preserve"> </w:t>
-            </w:r>
-            <w:proofErr w:type="spellStart"/>
-            <w:r>
-              <w:t>disease</w:t>
-            </w:r>
-            <w:proofErr w:type="spellEnd"/>
-            <w:r>
-              <w:t xml:space="preserve"> </w:t>
-            </w:r>
-            <w:proofErr w:type="spellStart"/>
-            <w:r>
-              <w:t>recurrence</w:t>
-            </w:r>
-            <w:proofErr w:type="spellEnd"/>
+              <w:t>The 50-gene assay (PAM-50) risk of recurrence (ROR) score stratifies patients with HR-positive disease into high-, medium-, and low-risk groups. Several studies have shown the prognostic</w:t>
+            </w:r>
+          </w:p>
+          <w:p>
+            <w:r>
+              <w:t>Value of ROR score in estimating risk of disease recurrence</w:t>
+            </w:r>
           </w:p>
         </w:tc>
         <w:tc>
@@ -5229,197 +4833,12 @@
             <w:tcW w:w="4542" w:type="dxa"/>
           </w:tcPr>
           <w:p>
-            <w:proofErr w:type="spellStart"/>
-            <w:r>
-              <w:t>Different</w:t>
-            </w:r>
-            <w:proofErr w:type="spellEnd"/>
-            <w:r>
-              <w:t xml:space="preserve"> </w:t>
-            </w:r>
-            <w:proofErr w:type="spellStart"/>
-            <w:r>
-              <w:t>genetic</w:t>
-            </w:r>
-            <w:proofErr w:type="spellEnd"/>
-            <w:r>
-              <w:t xml:space="preserve"> </w:t>
-            </w:r>
-            <w:proofErr w:type="spellStart"/>
-            <w:r>
-              <w:t>signatures</w:t>
-            </w:r>
-            <w:proofErr w:type="spellEnd"/>
-            <w:r>
-              <w:t xml:space="preserve"> </w:t>
-            </w:r>
-            <w:proofErr w:type="spellStart"/>
-            <w:r>
-              <w:t>have</w:t>
-            </w:r>
-            <w:proofErr w:type="spellEnd"/>
-            <w:r>
-              <w:t xml:space="preserve"> </w:t>
-            </w:r>
-            <w:proofErr w:type="spellStart"/>
-            <w:r>
-              <w:t>been</w:t>
-            </w:r>
-            <w:proofErr w:type="spellEnd"/>
-            <w:r>
-              <w:t xml:space="preserve"> </w:t>
-            </w:r>
-            <w:proofErr w:type="spellStart"/>
-            <w:r>
-              <w:t>evaluated</w:t>
-            </w:r>
-            <w:proofErr w:type="spellEnd"/>
-            <w:r>
-              <w:t xml:space="preserve"> in core </w:t>
-            </w:r>
-            <w:proofErr w:type="spellStart"/>
-            <w:r>
-              <w:t>needle</w:t>
-            </w:r>
-            <w:proofErr w:type="spellEnd"/>
-            <w:r>
-              <w:t xml:space="preserve"> </w:t>
-            </w:r>
-            <w:proofErr w:type="spellStart"/>
-            <w:r>
-              <w:t>biopsy</w:t>
-            </w:r>
-            <w:proofErr w:type="spellEnd"/>
-            <w:r>
-              <w:t xml:space="preserve"> </w:t>
-            </w:r>
-            <w:proofErr w:type="spellStart"/>
-            <w:r>
-              <w:t>before</w:t>
-            </w:r>
-            <w:proofErr w:type="spellEnd"/>
-            <w:r>
-              <w:t xml:space="preserve"> </w:t>
-            </w:r>
-            <w:proofErr w:type="spellStart"/>
-            <w:r>
-              <w:t>neoadjuvant</w:t>
-            </w:r>
-            <w:proofErr w:type="spellEnd"/>
-            <w:r>
-              <w:t xml:space="preserve"> </w:t>
-            </w:r>
-            <w:proofErr w:type="spellStart"/>
-            <w:r>
-              <w:t>therapy</w:t>
-            </w:r>
-            <w:proofErr w:type="spellEnd"/>
-            <w:r>
-              <w:t xml:space="preserve">, as </w:t>
-            </w:r>
-            <w:proofErr w:type="spellStart"/>
-            <w:r>
-              <w:t>good</w:t>
-            </w:r>
-            <w:proofErr w:type="spellEnd"/>
-            <w:r>
-              <w:t xml:space="preserve"> pre </w:t>
-            </w:r>
-            <w:proofErr w:type="spellStart"/>
-            <w:r>
-              <w:t>dictors</w:t>
-            </w:r>
-            <w:proofErr w:type="spellEnd"/>
-            <w:r>
-              <w:t xml:space="preserve"> </w:t>
-            </w:r>
-            <w:proofErr w:type="spellStart"/>
-            <w:r>
-              <w:t>of</w:t>
-            </w:r>
-            <w:proofErr w:type="spellEnd"/>
-            <w:r>
-              <w:t xml:space="preserve"> response </w:t>
-            </w:r>
-            <w:proofErr w:type="spellStart"/>
-            <w:r>
-              <w:t>to</w:t>
-            </w:r>
-            <w:proofErr w:type="spellEnd"/>
-            <w:r>
-              <w:t xml:space="preserve"> </w:t>
-            </w:r>
-            <w:proofErr w:type="spellStart"/>
-            <w:r>
-              <w:t>neoadjuvant</w:t>
-            </w:r>
-            <w:proofErr w:type="spellEnd"/>
-            <w:r>
-              <w:t xml:space="preserve"> </w:t>
-            </w:r>
-            <w:proofErr w:type="spellStart"/>
-            <w:r>
-              <w:t>therapy</w:t>
-            </w:r>
-            <w:proofErr w:type="spellEnd"/>
-            <w:r>
-              <w:t xml:space="preserve">, </w:t>
-            </w:r>
-            <w:proofErr w:type="spellStart"/>
-            <w:r>
-              <w:t>especially</w:t>
-            </w:r>
-            <w:proofErr w:type="spellEnd"/>
-            <w:r>
-              <w:t xml:space="preserve"> PAM50 ROR score, </w:t>
-            </w:r>
-            <w:proofErr w:type="spellStart"/>
-            <w:r>
-              <w:t>although</w:t>
-            </w:r>
-            <w:proofErr w:type="spellEnd"/>
-            <w:r>
-              <w:t xml:space="preserve"> </w:t>
-            </w:r>
-            <w:proofErr w:type="spellStart"/>
-            <w:r>
-              <w:t>this</w:t>
-            </w:r>
-            <w:proofErr w:type="spellEnd"/>
-            <w:r>
-              <w:t xml:space="preserve"> </w:t>
-            </w:r>
-            <w:proofErr w:type="spellStart"/>
-            <w:r>
-              <w:t>approach</w:t>
-            </w:r>
-            <w:proofErr w:type="spellEnd"/>
-            <w:r>
-              <w:t xml:space="preserve"> </w:t>
-            </w:r>
-            <w:proofErr w:type="spellStart"/>
-            <w:r>
-              <w:t>is</w:t>
-            </w:r>
-            <w:proofErr w:type="spellEnd"/>
-            <w:r>
-              <w:t xml:space="preserve"> </w:t>
-            </w:r>
-            <w:proofErr w:type="spellStart"/>
-            <w:r>
-              <w:t>currently</w:t>
-            </w:r>
-            <w:proofErr w:type="spellEnd"/>
-            <w:r>
-              <w:t xml:space="preserve"> </w:t>
-            </w:r>
-            <w:proofErr w:type="spellStart"/>
-            <w:r>
-              <w:t>considered</w:t>
-            </w:r>
-            <w:proofErr w:type="spellEnd"/>
-            <w:r>
-              <w:t xml:space="preserve"> experimental</w:t>
+            <w:r>
+              <w:t xml:space="preserve">Different genetic signatures have been evaluated in core needle biopsy before neoadjuvant therapy, as good pre dictors of response to neoadjuvant therapy, especially PAM50 ROR score, although this </w:t>
+            </w:r>
+            <w:r>
+              <w:lastRenderedPageBreak/>
+              <w:t>approach is currently considered experimental</w:t>
             </w:r>
           </w:p>
         </w:tc>
@@ -5429,6 +4848,7 @@
           </w:tcPr>
           <w:p>
             <w:r>
+              <w:lastRenderedPageBreak/>
               <w:t>mama_en_SEOM-GEICAM-SOLTI_clinical-guidelines-early-stage-breast-cancer_2022.pdf</w:t>
             </w:r>
           </w:p>
@@ -5450,14 +4870,8 @@
             <w:tcW w:w="4542" w:type="dxa"/>
           </w:tcPr>
           <w:p>
-            <w:proofErr w:type="gramStart"/>
-            <w:r>
-              <w:lastRenderedPageBreak/>
-              <w:t>este test</w:t>
-            </w:r>
-            <w:proofErr w:type="gramEnd"/>
-            <w:r>
-              <w:t xml:space="preserve"> mide la expresión de 50 genes específicamente seleccionados, sobre material incluido en parafina y fijado en formol. Identifica subtipos intrínsecos de tumor y ofrece información pronóstica individualizada, determinando un Riesgo de Recurrencia (ROR) a 10 años, lo cual permite identificar pacientes con enfermedad luminal que no necesitan poliquimioterapia adyuvante (dado su bajo riesgo de recidiva a 10 años sin ella) y también pacientes con enfermedad luminal que no necesitan terapia endocrina más allá de 5 años (dado su bajo riesgo de recidiva tardía).</w:t>
+            <w:r>
+              <w:t>este test mide la expresión de 50 genes específicamente seleccionados, sobre material incluido en parafina y fijado en formol. Identifica subtipos intrínsecos de tumor y ofrece información pronóstica individualizada, determinando un Riesgo de Recurrencia (ROR) a 10 años, lo cual permite identificar pacientes con enfermedad luminal que no necesitan poliquimioterapia adyuvante (dado su bajo riesgo de recidiva a 10 años sin ella) y también pacientes con enfermedad luminal que no necesitan terapia endocrina más allá de 5 años (dado su bajo riesgo de recidiva tardía).</w:t>
             </w:r>
           </w:p>
         </w:tc>
@@ -5477,7 +4891,10 @@
           </w:tcPr>
           <w:p>
             <w:r>
-              <w:t>36</w:t>
+              <w:t>3</w:t>
+            </w:r>
+            <w:r>
+              <w:t>8</w:t>
             </w:r>
           </w:p>
         </w:tc>
@@ -5554,15 +4971,7 @@
           </w:tcPr>
           <w:p>
             <w:r>
-              <w:t xml:space="preserve">Trombosis venosa profunda (TVP) o tromboembolismo pulmonar puede ser un efecto secundario de tamoxifeno y con menor frecuencia de </w:t>
-            </w:r>
-            <w:proofErr w:type="spellStart"/>
-            <w:r>
-              <w:t>Ios</w:t>
-            </w:r>
-            <w:proofErr w:type="spellEnd"/>
-            <w:r>
-              <w:t xml:space="preserve"> inhibidores de la aromatasa.</w:t>
+              <w:t>Trombosis venosa profunda (TVP) o tromboembolismo pulmonar puede ser un efecto secundario de tamoxifeno y con menor frecuencia de Ios inhibidores de la aromatasa.</w:t>
             </w:r>
           </w:p>
           <w:p>
@@ -5570,6 +4979,33 @@
               <w:t>Si ocurre un episodio de TVP se recomienda suspender el tamoxifeno y remitir al oncólogo para valorar un posible cambio de tratamiento o su mantenimiento</w:t>
             </w:r>
           </w:p>
+        </w:tc>
+        <w:tc>
+          <w:tcPr>
+            <w:tcW w:w="4045" w:type="dxa"/>
+          </w:tcPr>
+          <w:p>
+            <w:r>
+              <w:t>mama_es_SEOM_recomendaciones-seguimiento-mujeres-supervivientes-cancer-mama_2017.pdf</w:t>
+            </w:r>
+          </w:p>
+        </w:tc>
+        <w:tc>
+          <w:tcPr>
+            <w:tcW w:w="934" w:type="dxa"/>
+          </w:tcPr>
+          <w:p>
+            <w:r>
+              <w:t>13</w:t>
+            </w:r>
+          </w:p>
+        </w:tc>
+      </w:tr>
+      <w:tr>
+        <w:tc>
+          <w:tcPr>
+            <w:tcW w:w="3515" w:type="dxa"/>
+          </w:tcPr>
           <w:p>
             <w:r>
               <w:t>Aunque poco frecuente, el tamoxifeno puede aumentar el riesgo de cataratas.</w:t>
@@ -5591,8 +5027,16 @@
             <w:tcW w:w="934" w:type="dxa"/>
           </w:tcPr>
           <w:p>
-            <w:r>
-              <w:t>13-14</w:t>
+            <w:pPr>
+              <w:rPr>
+                <w:u w:val="single"/>
+              </w:rPr>
+            </w:pPr>
+            <w:r>
+              <w:t>1</w:t>
+            </w:r>
+            <w:r>
+              <w:t>4</w:t>
             </w:r>
           </w:p>
         </w:tc>
@@ -5636,6 +5080,7 @@
           </w:tcPr>
           <w:p>
             <w:r>
+              <w:lastRenderedPageBreak/>
               <w:t>Aumento de la sudoración</w:t>
             </w:r>
             <w:r>
@@ -5654,7 +5099,6 @@
               <w:t xml:space="preserve">, </w:t>
             </w:r>
             <w:r>
-              <w:lastRenderedPageBreak/>
               <w:t>Fatiga</w:t>
             </w:r>
             <w:r>
@@ -5699,15 +5143,27 @@
           <w:tcPr>
             <w:tcW w:w="4045" w:type="dxa"/>
           </w:tcPr>
-          <w:p/>
+          <w:p>
+            <w:r>
+              <w:t>mama_es_esmo_guia-para-pacientes_v1.pdf</w:t>
+            </w:r>
+          </w:p>
         </w:tc>
         <w:tc>
           <w:tcPr>
             <w:tcW w:w="934" w:type="dxa"/>
           </w:tcPr>
           <w:p>
-            <w:r>
-              <w:t>52</w:t>
+            <w:pPr>
+              <w:rPr>
+                <w:u w:val="single"/>
+              </w:rPr>
+            </w:pPr>
+            <w:r>
+              <w:t>5</w:t>
+            </w:r>
+            <w:r>
+              <w:t>2</w:t>
             </w:r>
           </w:p>
         </w:tc>
@@ -5774,7 +5230,7 @@
           </w:tcPr>
           <w:p>
             <w:r>
-              <w:t xml:space="preserve">Determinados fármacos compiten con los sistemas de metabolización del tamoxifeno que es el sistema CYP2D6 y pueden disminuir la eficacia del tamoxifeno (entre ellos debemos destacar los antidepresivos tricíclicos). Sin embargo, algunos estudios no han podido evidenciar una reducción de la eficacia de tamoxifeno31. </w:t>
+              <w:t xml:space="preserve">Determinados fármacos compiten con los sistemas de metabolización del tamoxifeno que es el sistema CYP2D6 y pueden disminuir la eficacia del tamoxifeno (entre ellos debemos destacar los antidepresivos tricíclicos). Sin embargo, algunos estudios no han podido evidenciar una reducción de la eficacia de tamoxifeno. </w:t>
             </w:r>
           </w:p>
           <w:p>
@@ -5784,11 +5240,40 @@
           </w:p>
           <w:p>
             <w:r>
-              <w:t>Se recomienda control ginecológico periódico en las mujeres que reciben tamoxifeno.</w:t>
-            </w:r>
-            <w:r>
-              <w:t xml:space="preserve"> </w:t>
-            </w:r>
+              <w:t xml:space="preserve">Se recomienda control ginecológico periódico en las mujeres que reciben tamoxifeno. </w:t>
+            </w:r>
+          </w:p>
+        </w:tc>
+        <w:tc>
+          <w:tcPr>
+            <w:tcW w:w="4045" w:type="dxa"/>
+          </w:tcPr>
+          <w:p>
+            <w:r>
+              <w:t>mama_es_SEOM_recomendaciones-seguimiento-mujeres-supervivientes-cancer-mama_2017.pdf</w:t>
+            </w:r>
+          </w:p>
+        </w:tc>
+        <w:tc>
+          <w:tcPr>
+            <w:tcW w:w="934" w:type="dxa"/>
+          </w:tcPr>
+          <w:p>
+            <w:r>
+              <w:t>1</w:t>
+            </w:r>
+            <w:r>
+              <w:t>7</w:t>
+            </w:r>
+          </w:p>
+        </w:tc>
+      </w:tr>
+      <w:tr>
+        <w:tc>
+          <w:tcPr>
+            <w:tcW w:w="3515" w:type="dxa"/>
+          </w:tcPr>
+          <w:p>
             <w:r>
               <w:t>Las pacientes que reciben tamoxifeno se recomienda exploración ginecológica periódica anual.</w:t>
             </w:r>
@@ -5809,11 +5294,13 @@
             <w:tcW w:w="934" w:type="dxa"/>
           </w:tcPr>
           <w:p>
-            <w:r>
-              <w:t>1</w:t>
-            </w:r>
-            <w:r>
-              <w:t>7</w:t>
+            <w:pPr>
+              <w:rPr>
+                <w:u w:val="single"/>
+              </w:rPr>
+            </w:pPr>
+            <w:r>
+              <w:t>24</w:t>
             </w:r>
           </w:p>
         </w:tc>
@@ -5857,7 +5344,11 @@
           </w:tcPr>
           <w:p>
             <w:r>
-              <w:t>Si riesgo alto o antecedentes personales de ETV pautar I.A o realizar estudio de trombofilia previo al inicio de tratamiento; revisar interacciones con el uso de antidepresivos; se recomienda revisión ginecológica anual.</w:t>
+              <w:t xml:space="preserve">Si riesgo alto o antecedentes personales de ETV pautar I.A o realizar estudio de trombofilia </w:t>
+            </w:r>
+            <w:r>
+              <w:lastRenderedPageBreak/>
+              <w:t>previo al inicio de tratamiento; revisar interacciones con el uso de antidepresivos; se recomienda revisión ginecológica anual.</w:t>
             </w:r>
           </w:p>
           <w:p/>
@@ -5884,7 +5375,10 @@
           </w:tcPr>
           <w:p>
             <w:r>
-              <w:t>70</w:t>
+              <w:t>7</w:t>
+            </w:r>
+            <w:r>
+              <w:t>2</w:t>
             </w:r>
           </w:p>
         </w:tc>
@@ -5942,69 +5436,8 @@
             <w:tcW w:w="3515" w:type="dxa"/>
           </w:tcPr>
           <w:p>
-            <w:proofErr w:type="spellStart"/>
-            <w:r>
-              <w:t>Patients</w:t>
-            </w:r>
-            <w:proofErr w:type="spellEnd"/>
-            <w:r>
-              <w:t xml:space="preserve"> </w:t>
-            </w:r>
-            <w:proofErr w:type="spellStart"/>
-            <w:r>
-              <w:t>on</w:t>
-            </w:r>
-            <w:proofErr w:type="spellEnd"/>
-            <w:r>
-              <w:t xml:space="preserve"> </w:t>
-            </w:r>
-            <w:proofErr w:type="spellStart"/>
-            <w:r>
-              <w:t>tamoxifen</w:t>
-            </w:r>
-            <w:proofErr w:type="spellEnd"/>
-            <w:r>
-              <w:t xml:space="preserve"> </w:t>
-            </w:r>
-            <w:proofErr w:type="spellStart"/>
-            <w:r>
-              <w:t>treatment</w:t>
-            </w:r>
-            <w:proofErr w:type="spellEnd"/>
-            <w:r>
-              <w:t xml:space="preserve"> </w:t>
-            </w:r>
-            <w:proofErr w:type="spellStart"/>
-            <w:r>
-              <w:t>will</w:t>
-            </w:r>
-            <w:proofErr w:type="spellEnd"/>
-            <w:r>
-              <w:t xml:space="preserve"> </w:t>
-            </w:r>
-            <w:proofErr w:type="spellStart"/>
-            <w:r>
-              <w:t>require</w:t>
-            </w:r>
-            <w:proofErr w:type="spellEnd"/>
-            <w:r>
-              <w:t xml:space="preserve"> </w:t>
-            </w:r>
-            <w:proofErr w:type="spellStart"/>
-            <w:r>
-              <w:t>age-appropriate</w:t>
-            </w:r>
-            <w:proofErr w:type="spellEnd"/>
-            <w:r>
-              <w:t xml:space="preserve"> </w:t>
-            </w:r>
-            <w:proofErr w:type="spellStart"/>
-            <w:r>
-              <w:t>gynecological</w:t>
-            </w:r>
-            <w:proofErr w:type="spellEnd"/>
-            <w:r>
-              <w:t xml:space="preserve"> screening.</w:t>
+            <w:r>
+              <w:t>Patients on tamoxifen treatment will require age-appropriate gynecological screening.</w:t>
             </w:r>
           </w:p>
         </w:tc>
@@ -6172,17 +5605,17 @@
           </w:tcPr>
           <w:p>
             <w:r>
-              <w:t>Cuando los niveles de estrógenos están bajos, esto puede afectar a la recuperación muscular, por lo que tienes que dejar, al menos, un día de recuperación entre sesiones de media intensidad</w:t>
+              <w:t xml:space="preserve">Cuando los niveles de estrógenos están bajos, esto puede afectar a la recuperación muscular, por lo que tienes que dejar, al </w:t>
+            </w:r>
+            <w:r>
+              <w:lastRenderedPageBreak/>
+              <w:t>menos, un día de recuperación entre sesiones de media intensidad</w:t>
             </w:r>
             <w:r>
               <w:t xml:space="preserve">. </w:t>
             </w:r>
             <w:r>
-              <w:t xml:space="preserve">Deben respetarse 48 h mínimo de recuperación entre sesiones de intensidad alta y observar si la recuperación es buena y sin </w:t>
-            </w:r>
-            <w:r>
-              <w:lastRenderedPageBreak/>
-              <w:t>fatiga. Si no es así, deben aumentarse los días de recuperación entre sesiones</w:t>
+              <w:t>Deben respetarse 48 h mínimo de recuperación entre sesiones de intensidad alta y observar si la recuperación es buena y sin fatiga. Si no es así, deben aumentarse los días de recuperación entre sesiones</w:t>
             </w:r>
           </w:p>
         </w:tc>
@@ -6216,15 +5649,7 @@
           </w:tcPr>
           <w:p>
             <w:r>
-              <w:t xml:space="preserve">Los niveles reducidos de estrógenos y andrógenos están asocia dos con alteraciones en la estructura del tejido genital, incluida la red nerviosa, pudiendo producir molestias o una disminución de las sen </w:t>
-            </w:r>
-            <w:proofErr w:type="spellStart"/>
-            <w:r>
-              <w:t>saciones</w:t>
-            </w:r>
-            <w:proofErr w:type="spellEnd"/>
-            <w:r>
-              <w:t xml:space="preserve"> a nivel genital disminuyendo la satisfacción sexual.</w:t>
+              <w:t>Los niveles reducidos de estrógenos y andrógenos están asocia dos con alteraciones en la estructura del tejido genital, incluida la red nerviosa, pudiendo producir molestias o una disminución de las sen saciones a nivel genital disminuyendo la satisfacción sexual.</w:t>
             </w:r>
           </w:p>
         </w:tc>
@@ -6257,15 +5682,7 @@
       </w:pPr>
       <w:bookmarkStart w:id="22" w:name="_Toc231500560"/>
       <w:r>
-        <w:t xml:space="preserve">Pregunta 22: ¿Se puede usar antidepresivos en pacientes con </w:t>
-      </w:r>
-      <w:proofErr w:type="spellStart"/>
-      <w:r>
-        <w:t>cancer</w:t>
-      </w:r>
-      <w:proofErr w:type="spellEnd"/>
-      <w:r>
-        <w:t xml:space="preserve"> de mama?</w:t>
+        <w:t>Pregunta 22: ¿Se puede usar antidepresivos en pacientes con cancer de mama?</w:t>
       </w:r>
       <w:bookmarkEnd w:id="22"/>
     </w:p>
@@ -6319,15 +5736,7 @@
           </w:tcPr>
           <w:p>
             <w:r>
-              <w:t xml:space="preserve">Los antidepresivos del tipo inhibidores selectivos de la recaptación de serotonina (ISRS) se deben utilizar con precaución en mujeres con cáncer de mama que reciban tratamiento adyuvante con tamoxifeno, ya que algunos pueden reducir su metabolismo. En este caso puede ser útil la </w:t>
-            </w:r>
-            <w:proofErr w:type="spellStart"/>
-            <w:r>
-              <w:t>cimicifuga</w:t>
-            </w:r>
-            <w:proofErr w:type="spellEnd"/>
-            <w:r>
-              <w:t xml:space="preserve"> racemosa.</w:t>
+              <w:t>Los antidepresivos del tipo inhibidores selectivos de la recaptación de serotonina (ISRS) se deben utilizar con precaución en mujeres con cáncer de mama que reciban tratamiento adyuvante con tamoxifeno, ya que algunos pueden reducir su metabolismo. En este caso puede ser útil la cimicifuga racemosa.</w:t>
             </w:r>
           </w:p>
         </w:tc>
@@ -6420,47 +5829,7 @@
           </w:tcPr>
           <w:p>
             <w:r>
-              <w:t xml:space="preserve">La quimioterapia induce insuficiencia ovárica en más del 80 % de las mujeres mayores de 40 años y en más del 20 % de las mujeres mayores de 30, además, por su parte, la terapia endocrina tiene como objetivo reducir los niveles de estrógenos del organismo, provocando síntomas muy severos relacionados con la menopausia. Por tanto, es </w:t>
-            </w:r>
-            <w:proofErr w:type="spellStart"/>
-            <w:r>
-              <w:t>indispensa</w:t>
-            </w:r>
-            <w:proofErr w:type="spellEnd"/>
-            <w:r>
-              <w:t xml:space="preserve"> </w:t>
-            </w:r>
-            <w:proofErr w:type="spellStart"/>
-            <w:r>
-              <w:t>ble</w:t>
-            </w:r>
-            <w:proofErr w:type="spellEnd"/>
-            <w:r>
-              <w:t xml:space="preserve"> informar y conversar sobre la </w:t>
-            </w:r>
-            <w:proofErr w:type="spellStart"/>
-            <w:r>
-              <w:t>criopreservación</w:t>
-            </w:r>
-            <w:proofErr w:type="spellEnd"/>
-            <w:r>
-              <w:t xml:space="preserve"> de ovocitos, </w:t>
-            </w:r>
-            <w:proofErr w:type="spellStart"/>
-            <w:r>
-              <w:t>espe</w:t>
-            </w:r>
-            <w:proofErr w:type="spellEnd"/>
-            <w:r>
-              <w:t xml:space="preserve"> </w:t>
-            </w:r>
-            <w:proofErr w:type="spellStart"/>
-            <w:r>
-              <w:t>cialmente</w:t>
-            </w:r>
-            <w:proofErr w:type="spellEnd"/>
-            <w:r>
-              <w:t xml:space="preserve"> en las pacientes más jóvenes, antes de la quimioterapia o la ovariectomía profiláctica, por si después quieren tener hijos</w:t>
+              <w:t>La quimioterapia induce insuficiencia ovárica en más del 80 % de las mujeres mayores de 40 años y en más del 20 % de las mujeres mayores de 30, además, por su parte, la terapia endocrina tiene como objetivo reducir los niveles de estrógenos del organismo, provocando síntomas muy severos relacionados con la menopausia. Por tanto, es indispensa ble informar y conversar sobre la criopreservación de ovocitos, espe cialmente en las pacientes más jóvenes, antes de la quimioterapia o la ovariectomía profiláctica, por si después quieren tener hijos</w:t>
             </w:r>
             <w:r>
               <w:t xml:space="preserve">. </w:t>
@@ -6468,6 +5837,7 @@
           </w:p>
           <w:p>
             <w:r>
+              <w:lastRenderedPageBreak/>
               <w:t>disminución que dependerá del tipo de quimioterapia, la dosis y la edad de la paciente, a mayor edad hay mayor riesgo.</w:t>
             </w:r>
           </w:p>
@@ -6478,6 +5848,7 @@
           </w:tcPr>
           <w:p>
             <w:r>
+              <w:lastRenderedPageBreak/>
               <w:t>mama_es_novartis_guia-pacientes-CM_2025.pdf</w:t>
             </w:r>
           </w:p>
@@ -6501,8 +5872,13 @@
       </w:pPr>
       <w:bookmarkStart w:id="24" w:name="_Toc231500562"/>
       <w:r>
-        <w:lastRenderedPageBreak/>
-        <w:t>Pregunta 23: ¿</w:t>
+        <w:t>Pregunta 2</w:t>
+      </w:r>
+      <w:r>
+        <w:t>4</w:t>
+      </w:r>
+      <w:r>
+        <w:t>: ¿</w:t>
       </w:r>
       <w:r>
         <w:t>Qué es la dispareunia</w:t>
@@ -6605,18 +5981,16 @@
       </w:pPr>
       <w:bookmarkStart w:id="25" w:name="_Toc231500563"/>
       <w:r>
-        <w:t xml:space="preserve">Pregunta 24: ¿Puedo </w:t>
-      </w:r>
-      <w:r>
-        <w:t xml:space="preserve">quedarme embarazada después de un tratamiento de </w:t>
-      </w:r>
-      <w:proofErr w:type="spellStart"/>
-      <w:r>
-        <w:t>cancer</w:t>
-      </w:r>
-      <w:proofErr w:type="spellEnd"/>
-      <w:r>
-        <w:t>?</w:t>
+        <w:t>Pregunta 2</w:t>
+      </w:r>
+      <w:r>
+        <w:t>5</w:t>
+      </w:r>
+      <w:r>
+        <w:t xml:space="preserve">: ¿Puedo </w:t>
+      </w:r>
+      <w:r>
+        <w:t>quedarme embarazada después de un tratamiento de cancer?</w:t>
       </w:r>
       <w:bookmarkEnd w:id="25"/>
     </w:p>
@@ -6669,75 +6043,9 @@
             <w:tcW w:w="4673" w:type="dxa"/>
           </w:tcPr>
           <w:p>
-            <w:proofErr w:type="spellStart"/>
-            <w:r>
-              <w:t>Available</w:t>
-            </w:r>
-            <w:proofErr w:type="spellEnd"/>
-            <w:r>
-              <w:t xml:space="preserve"> data </w:t>
-            </w:r>
-            <w:proofErr w:type="spellStart"/>
-            <w:r>
-              <w:t>suggest</w:t>
-            </w:r>
-            <w:proofErr w:type="spellEnd"/>
-            <w:r>
-              <w:t xml:space="preserve"> </w:t>
-            </w:r>
-            <w:proofErr w:type="spellStart"/>
-            <w:r>
-              <w:t>that</w:t>
-            </w:r>
-            <w:proofErr w:type="spellEnd"/>
-            <w:r>
-              <w:t xml:space="preserve"> </w:t>
-            </w:r>
-            <w:proofErr w:type="spellStart"/>
-            <w:r>
-              <w:t>pregnancy</w:t>
-            </w:r>
-            <w:proofErr w:type="spellEnd"/>
-            <w:r>
-              <w:t xml:space="preserve"> </w:t>
-            </w:r>
-            <w:proofErr w:type="spellStart"/>
-            <w:r>
-              <w:t>is</w:t>
-            </w:r>
-            <w:proofErr w:type="spellEnd"/>
-            <w:r>
-              <w:t xml:space="preserve"> </w:t>
-            </w:r>
-            <w:proofErr w:type="spellStart"/>
-            <w:r>
-              <w:t>safe</w:t>
-            </w:r>
-            <w:proofErr w:type="spellEnd"/>
-            <w:r>
-              <w:t xml:space="preserve"> after </w:t>
-            </w:r>
-            <w:proofErr w:type="spellStart"/>
-            <w:r>
-              <w:t>breast</w:t>
-            </w:r>
-            <w:proofErr w:type="spellEnd"/>
-            <w:r>
-              <w:t xml:space="preserve"> </w:t>
-            </w:r>
-            <w:proofErr w:type="spellStart"/>
-            <w:r>
-              <w:t>cancer</w:t>
-            </w:r>
-            <w:proofErr w:type="spellEnd"/>
-            <w:r>
-              <w:t xml:space="preserve"> </w:t>
-            </w:r>
-            <w:proofErr w:type="spellStart"/>
-            <w:r>
-              <w:t>treatment</w:t>
-            </w:r>
-            <w:proofErr w:type="spellEnd"/>
+            <w:r>
+              <w:t>Available data suggest that pregnancy is safe after breast cancer treatment</w:t>
+            </w:r>
           </w:p>
         </w:tc>
         <w:tc>
@@ -6768,15 +6076,7 @@
           </w:tcPr>
           <w:p>
             <w:r>
-              <w:t xml:space="preserve">No existen contraindicaciones para quedar embarazada después de tener cáncer de mama. Sin embargo, hay varios puntos importantes a considerar, especialmente en el caso de cáncer de </w:t>
-            </w:r>
-            <w:proofErr w:type="gramStart"/>
-            <w:r>
-              <w:t>mama RE</w:t>
-            </w:r>
-            <w:proofErr w:type="gramEnd"/>
-            <w:r>
-              <w:t xml:space="preserve"> positivo, debido a la larga duración de la terapia endocrina. La terapia endocrina debe suspenderse antes de tratar de quedar embarazada y debe reanudarse después del parto y la lactancia. Si usted desea quedar embarazada, por favor discuta todas estas cuestiones cuidadosamente con su médico.</w:t>
+              <w:t>No existen contraindicaciones para quedar embarazada después de tener cáncer de mama. Sin embargo, hay varios puntos importantes a considerar, especialmente en el caso de cáncer de mama RE positivo, debido a la larga duración de la terapia endocrina. La terapia endocrina debe suspenderse antes de tratar de quedar embarazada y debe reanudarse después del parto y la lactancia. Si usted desea quedar embarazada, por favor discuta todas estas cuestiones cuidadosamente con su médico.</w:t>
             </w:r>
           </w:p>
         </w:tc>
@@ -6808,39 +6108,7 @@
           </w:tcPr>
           <w:p>
             <w:r>
-              <w:t xml:space="preserve">La mayoría de las guías recomiendan posponer el embarazo duran te al menos 2 años después del tratamiento del cáncer de mama, según el estadio y el tratamiento recibido. Sin embargo, es poco probable que las mujeres con enfermedad localizada empeoren el pronóstico si se quedan embarazadas. Estudios recientes evidencian que, en pacientes con cáncer de mama, pausar la terapia endocrina para poder quedarse </w:t>
-            </w:r>
-            <w:proofErr w:type="spellStart"/>
-            <w:r>
-              <w:t>embara</w:t>
-            </w:r>
-            <w:proofErr w:type="spellEnd"/>
-            <w:r>
-              <w:t xml:space="preserve"> </w:t>
-            </w:r>
-            <w:proofErr w:type="spellStart"/>
-            <w:r>
-              <w:t>zadas</w:t>
-            </w:r>
-            <w:proofErr w:type="spellEnd"/>
-            <w:r>
-              <w:t xml:space="preserve"> —bajo control médico y durante un periodo temporal que no supere los 2 años— no incrementa el riesgo de recaída a corto </w:t>
-            </w:r>
-            <w:proofErr w:type="spellStart"/>
-            <w:r>
-              <w:t>pla</w:t>
-            </w:r>
-            <w:proofErr w:type="spellEnd"/>
-            <w:r>
-              <w:t xml:space="preserve"> </w:t>
-            </w:r>
-            <w:proofErr w:type="spellStart"/>
-            <w:r>
-              <w:t>zo</w:t>
-            </w:r>
-            <w:proofErr w:type="spellEnd"/>
-            <w:r>
-              <w:t>.</w:t>
+              <w:t>La mayoría de las guías recomiendan posponer el embarazo duran te al menos 2 años después del tratamiento del cáncer de mama, según el estadio y el tratamiento recibido. Sin embargo, es poco probable que las mujeres con enfermedad localizada empeoren el pronóstico si se quedan embarazadas. Estudios recientes evidencian que, en pacientes con cáncer de mama, pausar la terapia endocrina para poder quedarse embara zadas —bajo control médico y durante un periodo temporal que no supere los 2 años— no incrementa el riesgo de recaída a corto pla zo.</w:t>
             </w:r>
           </w:p>
         </w:tc>
@@ -6873,18 +6141,17 @@
       </w:pPr>
       <w:bookmarkStart w:id="26" w:name="_Toc231500564"/>
       <w:r>
-        <w:t xml:space="preserve">Pregunta 25: ¿cuáles son los factores de riesgo </w:t>
-      </w:r>
-      <w:r>
-        <w:t xml:space="preserve">del </w:t>
-      </w:r>
-      <w:proofErr w:type="spellStart"/>
-      <w:r>
-        <w:t>cancer</w:t>
-      </w:r>
-      <w:proofErr w:type="spellEnd"/>
-      <w:r>
-        <w:t xml:space="preserve"> de mama?</w:t>
+        <w:lastRenderedPageBreak/>
+        <w:t>Pregunta 2</w:t>
+      </w:r>
+      <w:r>
+        <w:t>6</w:t>
+      </w:r>
+      <w:r>
+        <w:t xml:space="preserve">: ¿cuáles son los factores de riesgo </w:t>
+      </w:r>
+      <w:r>
+        <w:t>del cancer de mama?</w:t>
       </w:r>
       <w:bookmarkEnd w:id="26"/>
     </w:p>
@@ -6938,43 +6205,19 @@
           </w:tcPr>
           <w:p>
             <w:r>
-              <w:t xml:space="preserve">El cáncer de mama tiene un origen multifactorial, y, en la mayoría de los </w:t>
+              <w:t>El cáncer de mama tiene un origen multifactorial, y, en la mayoría de los casos, no se puede identificar de forma clara la causa. Sí conocemos sin embargo muchos factores de riesgo asociados al cáncer de mama, que pueden dividirse en factores de riesgo modificables o no modificables. La mayor parte de los ellos se relaciona con los antecedentes reproductivos que modulan la exposición hormonal durante la vida</w:t>
+            </w:r>
+            <w:r>
+              <w:t>.</w:t>
+            </w:r>
+          </w:p>
+          <w:p>
+            <w:r>
+              <w:t xml:space="preserve">1. La edad es el principal factor de riesgo para padecer un cáncer de mama. El riesgo aumenta al aumentar la edad. 2. Historia personal de cáncer de mama invasivo (las mujeres que han tenido un cáncer de mama invasivo tienen más riesgo de padecer un cáncer de mama contralateral), carcinoma ductal in situ o lesiones benignas como la hiperplasia epitelial atípica. 3. Densidad mamaria elevada en las mamografías. 4. Historia menstrual larga, con una menarquia (edad de primera regla) temprana o una menopausia tardía 5. Exposición a radiaciones ionizantes, sobre todo durante la pubertad 6. Factores genéticos como mutaciones hereditarias en genes que asocian un aumento del riesgo de cáncer de mama, como BRCA1, BRCA2, PALB2, PTEN, TP53, ATM o CHEK 2entre otros. 7. Factores de riesgo modificables: 8. Factores reproductivos como la nuliparidad (no haber estado embarazada nunca), un primer embarazo por encima de los 30 años o la ausencia de lactancia materna.  9. El uso de terapia hormonal sustitutiva después de la menopausia aumenta el riesgo de cáncer de mama así como el uso de anticonceptivos orales, aunque el incremento absoluto es bajo.. 10. Consumo de alcohol. 11. Sobrepeso y obesidad, ya que la grasa es la principal fuente de estrógenos tras la menopausia. </w:t>
             </w:r>
             <w:r>
               <w:lastRenderedPageBreak/>
-              <w:t>casos, no se puede identificar de forma clara la causa. Sí conocemos sin embargo muchos factores de riesgo asociados al cáncer de mama, que pueden dividirse en factores de riesgo modificables o no modificables. La mayor parte de los ellos se relaciona con los antecedentes reproductivos que modulan la exposición hormonal durante la vida</w:t>
-            </w:r>
-            <w:r>
-              <w:t>.</w:t>
-            </w:r>
-          </w:p>
-          <w:p>
-            <w:r>
-              <w:t xml:space="preserve">1. La edad es el principal factor de riesgo para padecer un cáncer de mama. El riesgo aumenta al aumentar la edad. 2. Historia personal de cáncer de mama invasivo (las mujeres que han tenido un cáncer de mama invasivo tienen más riesgo de padecer un cáncer de mama contralateral), carcinoma ductal in situ o lesiones benignas como la hiperplasia epitelial atípica. 3. Densidad mamaria elevada en las mamografías. 4. Historia menstrual larga, con una menarquia (edad de primera regla) temprana o una menopausia tardía 5. Exposición a radiaciones ionizantes, sobre todo durante la pubertad 6. Factores genéticos como mutaciones hereditarias en genes que asocian un aumento del riesgo de cáncer de mama, como BRCA1, BRCA2, PALB2, PTEN, TP53, ATM o CHEK 2entre otros. 7. Factores de riesgo modificables: 8. Factores reproductivos como la </w:t>
-            </w:r>
-            <w:proofErr w:type="spellStart"/>
-            <w:r>
-              <w:t>nuliparidad</w:t>
-            </w:r>
-            <w:proofErr w:type="spellEnd"/>
-            <w:r>
-              <w:t xml:space="preserve"> (no haber estado embarazada nunca), un primer embarazo por encima de los 30 años o la ausencia de lactancia materna.  9. El uso de terapia hormonal sustitutiva después de la menopausia aumenta el riesgo de cáncer de </w:t>
-            </w:r>
-            <w:proofErr w:type="gramStart"/>
-            <w:r>
-              <w:t>mama</w:t>
-            </w:r>
-            <w:proofErr w:type="gramEnd"/>
-            <w:r>
-              <w:t xml:space="preserve"> así como el uso de anticonceptivos orales, aunque el incremento absoluto es </w:t>
-            </w:r>
-            <w:proofErr w:type="gramStart"/>
-            <w:r>
-              <w:t>bajo..</w:t>
-            </w:r>
-            <w:proofErr w:type="gramEnd"/>
-            <w:r>
-              <w:t xml:space="preserve"> 10. Consumo de alcohol. 11. Sobrepeso y obesidad, ya que la grasa es la principal fuente de estrógenos tras la menopausia. 12. Sedentarismo 13. Dietas inadecuadas, alejadas de la dieta mediterránea</w:t>
+              <w:t>12. Sedentarismo 13. Dietas inadecuadas, alejadas de la dieta mediterránea</w:t>
             </w:r>
           </w:p>
         </w:tc>
@@ -7007,11 +6250,7 @@
           </w:tcPr>
           <w:p>
             <w:r>
-              <w:t xml:space="preserve">Se desconoce la causa precisa del cáncer de mama, pero se han identificado diversos factores de riesgo que pueden </w:t>
-            </w:r>
-            <w:r>
-              <w:lastRenderedPageBreak/>
-              <w:t>aumentar la probabilidad de desarrollar la enfermedad. Es importante recordar que el hecho de tener un factor de riesgo aumenta el riesgo de desarrollar cáncer, pero eso no significa que se vaya a padecer cáncer seguro. De la misma forma, el hecho de no tener un factor de riesgo no significa que nunca se vaya a padecer cáncer.</w:t>
+              <w:t>Se desconoce la causa precisa del cáncer de mama, pero se han identificado diversos factores de riesgo que pueden aumentar la probabilidad de desarrollar la enfermedad. Es importante recordar que el hecho de tener un factor de riesgo aumenta el riesgo de desarrollar cáncer, pero eso no significa que se vaya a padecer cáncer seguro. De la misma forma, el hecho de no tener un factor de riesgo no significa que nunca se vaya a padecer cáncer.</w:t>
             </w:r>
           </w:p>
           <w:p>
@@ -7155,7 +6394,6 @@
           </w:tcPr>
           <w:p>
             <w:r>
-              <w:lastRenderedPageBreak/>
               <w:t>mama_es_esmo_guia-para-pacientes_v1.pdf</w:t>
             </w:r>
           </w:p>
@@ -7179,7 +6417,13 @@
       </w:pPr>
       <w:bookmarkStart w:id="27" w:name="_Toc231500565"/>
       <w:r>
-        <w:t xml:space="preserve">Pregunta 26: </w:t>
+        <w:t>Pregunta 2</w:t>
+      </w:r>
+      <w:r>
+        <w:t>7</w:t>
+      </w:r>
+      <w:r>
+        <w:t xml:space="preserve">: </w:t>
       </w:r>
       <w:r>
         <w:t>¿Cómo se pueden solicitar pruebas de imagen de mama</w:t>
@@ -7247,19 +6491,11 @@
               </w:tabs>
             </w:pPr>
             <w:r>
-              <w:t xml:space="preserve">Para la solicitud de pruebas de imagen de mama, tanto desde Atención Primaria como de Atención Especializada, se utilizará la petición electrónica, desde las plataformas </w:t>
-            </w:r>
-            <w:proofErr w:type="spellStart"/>
-            <w:r>
-              <w:t>Diraya</w:t>
-            </w:r>
-            <w:proofErr w:type="spellEnd"/>
-            <w:r>
-              <w:t xml:space="preserve"> y PDI. Es imprescindible detallar en el campo "justificación clínica" la indicación de la prueba. En esta petición se debe señalar la prioridad de la </w:t>
+              <w:t xml:space="preserve">Para la solicitud de pruebas de imagen de mama, tanto desde Atención Primaria como de Atención Especializada, se utilizará la petición electrónica, desde las plataformas Diraya y </w:t>
             </w:r>
             <w:r>
               <w:lastRenderedPageBreak/>
-              <w:t>prueba (1 normal, 2 preferente y 3 urgente) y la fecha ideal de realización. En los controles periódicos es importante reflejar la siguiente fecha de revisión en consulta.</w:t>
+              <w:t>PDI. Es imprescindible detallar en el campo "justificación clínica" la indicación de la prueba. En esta petición se debe señalar la prioridad de la prueba (1 normal, 2 preferente y 3 urgente) y la fecha ideal de realización. En los controles periódicos es importante reflejar la siguiente fecha de revisión en consulta.</w:t>
             </w:r>
           </w:p>
         </w:tc>
@@ -7284,8 +6520,13 @@
             <w:tcW w:w="986" w:type="dxa"/>
           </w:tcPr>
           <w:p>
-            <w:r>
-              <w:t>6</w:t>
+            <w:pPr>
+              <w:rPr>
+                <w:u w:val="single"/>
+              </w:rPr>
+            </w:pPr>
+            <w:r>
+              <w:t>8</w:t>
             </w:r>
           </w:p>
         </w:tc>
@@ -7298,7 +6539,13 @@
       </w:pPr>
       <w:bookmarkStart w:id="28" w:name="_Toc231500566"/>
       <w:r>
-        <w:t xml:space="preserve">Pregunta 27: ¿Cuáles son las mutaciones genéticas </w:t>
+        <w:t>Pregunta 2</w:t>
+      </w:r>
+      <w:r>
+        <w:t>8</w:t>
+      </w:r>
+      <w:r>
+        <w:t xml:space="preserve">: ¿Cuáles son las mutaciones genéticas </w:t>
       </w:r>
       <w:r>
         <w:t>más frecuentes en cáncer de mama y ovario hereditario?</w:t>
@@ -7359,94 +6606,82 @@
                 <w:tab w:val="left" w:pos="892"/>
               </w:tabs>
             </w:pPr>
-            <w:proofErr w:type="spellStart"/>
-            <w:r>
-              <w:t>Mutations</w:t>
-            </w:r>
-            <w:proofErr w:type="spellEnd"/>
-            <w:r>
-              <w:t xml:space="preserve"> in BRCA1 and BRCA2 </w:t>
-            </w:r>
-            <w:proofErr w:type="spellStart"/>
-            <w:r>
-              <w:t>high</w:t>
-            </w:r>
-            <w:proofErr w:type="spellEnd"/>
-            <w:r>
-              <w:t xml:space="preserve"> </w:t>
-            </w:r>
-            <w:proofErr w:type="spellStart"/>
-            <w:r>
-              <w:t>penetrance</w:t>
-            </w:r>
-            <w:proofErr w:type="spellEnd"/>
-            <w:r>
-              <w:t xml:space="preserve"> genes </w:t>
-            </w:r>
-            <w:proofErr w:type="spellStart"/>
-            <w:r>
-              <w:t>account</w:t>
-            </w:r>
-            <w:proofErr w:type="spellEnd"/>
-            <w:r>
-              <w:t xml:space="preserve"> </w:t>
-            </w:r>
-            <w:proofErr w:type="spellStart"/>
-            <w:r>
-              <w:t>for</w:t>
-            </w:r>
-            <w:proofErr w:type="spellEnd"/>
-            <w:r>
-              <w:t xml:space="preserve"> </w:t>
-            </w:r>
-            <w:proofErr w:type="spellStart"/>
-            <w:r>
-              <w:t>most</w:t>
-            </w:r>
-            <w:proofErr w:type="spellEnd"/>
-            <w:r>
-              <w:t xml:space="preserve"> </w:t>
-            </w:r>
-            <w:proofErr w:type="spellStart"/>
-            <w:r>
-              <w:t>hereditary</w:t>
-            </w:r>
-            <w:proofErr w:type="spellEnd"/>
-            <w:r>
-              <w:t xml:space="preserve"> </w:t>
-            </w:r>
-            <w:proofErr w:type="spellStart"/>
-            <w:r>
-              <w:t>breast</w:t>
-            </w:r>
-            <w:proofErr w:type="spellEnd"/>
-            <w:r>
-              <w:t xml:space="preserve"> and </w:t>
-            </w:r>
-            <w:proofErr w:type="spellStart"/>
-            <w:r>
-              <w:t>ovarian</w:t>
-            </w:r>
-            <w:proofErr w:type="spellEnd"/>
-            <w:r>
-              <w:t xml:space="preserve"> </w:t>
-            </w:r>
-            <w:proofErr w:type="spellStart"/>
-            <w:r>
-              <w:t>cancer</w:t>
-            </w:r>
-            <w:proofErr w:type="spellEnd"/>
+            <w:r>
+              <w:t>Mutations in BRCA1 and BRCA2 high penetrance genes account for most hereditary breast and ovarian cancer</w:t>
+            </w:r>
             <w:r>
               <w:t xml:space="preserve">. </w:t>
             </w:r>
           </w:p>
+        </w:tc>
+        <w:tc>
+          <w:tcPr>
+            <w:tcW w:w="2875" w:type="dxa"/>
+          </w:tcPr>
+          <w:p>
+            <w:pPr>
+              <w:rPr>
+                <w:u w:val="single"/>
+              </w:rPr>
+            </w:pPr>
+            <w:r>
+              <w:t>mama_en_SEOM-GEICAM-SOLTI_clinical-guidelines-hereditary-breast-ovarian-cancer_2019.pdf</w:t>
+            </w:r>
+          </w:p>
+        </w:tc>
+        <w:tc>
+          <w:tcPr>
+            <w:tcW w:w="985" w:type="dxa"/>
+          </w:tcPr>
+          <w:p>
+            <w:r>
+              <w:t>1</w:t>
+            </w:r>
+          </w:p>
+        </w:tc>
+      </w:tr>
+      <w:tr>
+        <w:tc>
+          <w:tcPr>
+            <w:tcW w:w="4634" w:type="dxa"/>
+          </w:tcPr>
           <w:p>
             <w:pPr>
               <w:tabs>
                 <w:tab w:val="left" w:pos="892"/>
               </w:tabs>
             </w:pPr>
-          </w:p>
+            <w:r>
+              <w:t>Most breast and ovarian cancers are sporadic, while hereditary predisposition accounts for 10–15% of the cases, principally with respect to germline mutations in high penetrance BRCA1/2 genes. Cumulative BC risk for BRCA1 and BRCA2 mutation carriers at 70 years of age is about 57%, respectively, while cumulative OC risk is approximately 40% for BRCA1 and 18% for BRCA2 muta tion carriers</w:t>
+            </w:r>
+          </w:p>
+        </w:tc>
+        <w:tc>
+          <w:tcPr>
+            <w:tcW w:w="2875" w:type="dxa"/>
+          </w:tcPr>
+          <w:p>
+            <w:r>
+              <w:t>mama_en_SEOM-GEICAM-SOLTI_clinical-guidelines-hereditary-breast-ovarian-cancer_2019.pdf</w:t>
+            </w:r>
+          </w:p>
+        </w:tc>
+        <w:tc>
+          <w:tcPr>
+            <w:tcW w:w="985" w:type="dxa"/>
+          </w:tcPr>
+          <w:p>
+            <w:r>
+              <w:t>2</w:t>
+            </w:r>
+          </w:p>
+        </w:tc>
+      </w:tr>
+      <w:tr>
+        <w:tc>
+          <w:tcPr>
+            <w:tcW w:w="4634" w:type="dxa"/>
+          </w:tcPr>
           <w:p>
             <w:pPr>
               <w:tabs>
@@ -7454,309 +6689,78 @@
               </w:tabs>
             </w:pPr>
             <w:r>
-              <w:t xml:space="preserve">Most </w:t>
-            </w:r>
-            <w:proofErr w:type="spellStart"/>
-            <w:r>
-              <w:t>breast</w:t>
-            </w:r>
-            <w:proofErr w:type="spellEnd"/>
-            <w:r>
-              <w:t xml:space="preserve"> and </w:t>
-            </w:r>
-            <w:proofErr w:type="spellStart"/>
-            <w:r>
-              <w:t>ovarian</w:t>
-            </w:r>
-            <w:proofErr w:type="spellEnd"/>
-            <w:r>
-              <w:t xml:space="preserve"> </w:t>
-            </w:r>
-            <w:proofErr w:type="spellStart"/>
-            <w:r>
-              <w:t>cancers</w:t>
-            </w:r>
-            <w:proofErr w:type="spellEnd"/>
-            <w:r>
-              <w:t xml:space="preserve"> are </w:t>
-            </w:r>
-            <w:proofErr w:type="spellStart"/>
-            <w:r>
-              <w:t>sporadic</w:t>
-            </w:r>
-            <w:proofErr w:type="spellEnd"/>
-            <w:r>
-              <w:t xml:space="preserve">, </w:t>
-            </w:r>
-            <w:proofErr w:type="spellStart"/>
-            <w:r>
-              <w:t>while</w:t>
-            </w:r>
-            <w:proofErr w:type="spellEnd"/>
-            <w:r>
-              <w:t xml:space="preserve"> </w:t>
-            </w:r>
-            <w:proofErr w:type="spellStart"/>
-            <w:r>
-              <w:t>hereditary</w:t>
-            </w:r>
-            <w:proofErr w:type="spellEnd"/>
-            <w:r>
-              <w:t xml:space="preserve"> </w:t>
-            </w:r>
-            <w:proofErr w:type="spellStart"/>
-            <w:r>
-              <w:t>predisposition</w:t>
-            </w:r>
-            <w:proofErr w:type="spellEnd"/>
-            <w:r>
-              <w:t xml:space="preserve"> </w:t>
-            </w:r>
-            <w:proofErr w:type="spellStart"/>
-            <w:r>
-              <w:t>accounts</w:t>
-            </w:r>
-            <w:proofErr w:type="spellEnd"/>
-            <w:r>
-              <w:t xml:space="preserve"> </w:t>
-            </w:r>
-            <w:proofErr w:type="spellStart"/>
-            <w:r>
-              <w:t>for</w:t>
-            </w:r>
-            <w:proofErr w:type="spellEnd"/>
-            <w:r>
-              <w:t xml:space="preserve"> 10–15% </w:t>
-            </w:r>
-            <w:proofErr w:type="spellStart"/>
-            <w:r>
-              <w:t>of</w:t>
-            </w:r>
-            <w:proofErr w:type="spellEnd"/>
-            <w:r>
-              <w:t xml:space="preserve"> </w:t>
-            </w:r>
-            <w:proofErr w:type="spellStart"/>
-            <w:r>
-              <w:t>the</w:t>
-            </w:r>
-            <w:proofErr w:type="spellEnd"/>
-            <w:r>
-              <w:t xml:space="preserve"> cases, </w:t>
-            </w:r>
-            <w:proofErr w:type="spellStart"/>
-            <w:r>
-              <w:t>principally</w:t>
-            </w:r>
-            <w:proofErr w:type="spellEnd"/>
-            <w:r>
-              <w:t xml:space="preserve"> </w:t>
-            </w:r>
-            <w:proofErr w:type="spellStart"/>
-            <w:r>
-              <w:t>with</w:t>
-            </w:r>
-            <w:proofErr w:type="spellEnd"/>
-            <w:r>
-              <w:t xml:space="preserve"> </w:t>
-            </w:r>
-            <w:proofErr w:type="spellStart"/>
-            <w:r>
-              <w:t>respect</w:t>
-            </w:r>
-            <w:proofErr w:type="spellEnd"/>
-            <w:r>
-              <w:t xml:space="preserve"> </w:t>
-            </w:r>
-            <w:proofErr w:type="spellStart"/>
-            <w:r>
-              <w:t>to</w:t>
-            </w:r>
-            <w:proofErr w:type="spellEnd"/>
-            <w:r>
-              <w:t xml:space="preserve"> </w:t>
-            </w:r>
-            <w:proofErr w:type="spellStart"/>
-            <w:r>
-              <w:t>germline</w:t>
-            </w:r>
-            <w:proofErr w:type="spellEnd"/>
-            <w:r>
-              <w:t xml:space="preserve"> </w:t>
-            </w:r>
-            <w:proofErr w:type="spellStart"/>
-            <w:r>
-              <w:t>mutations</w:t>
-            </w:r>
-            <w:proofErr w:type="spellEnd"/>
-            <w:r>
-              <w:t xml:space="preserve"> in </w:t>
-            </w:r>
-            <w:proofErr w:type="spellStart"/>
-            <w:r>
-              <w:t>high</w:t>
-            </w:r>
-            <w:proofErr w:type="spellEnd"/>
-            <w:r>
-              <w:t xml:space="preserve"> </w:t>
-            </w:r>
-            <w:proofErr w:type="spellStart"/>
-            <w:r>
-              <w:t>penetrance</w:t>
-            </w:r>
-            <w:proofErr w:type="spellEnd"/>
-            <w:r>
-              <w:t xml:space="preserve"> BRCA1/2 genes. Cumulative BC </w:t>
-            </w:r>
-            <w:proofErr w:type="spellStart"/>
-            <w:r>
-              <w:t>risk</w:t>
-            </w:r>
-            <w:proofErr w:type="spellEnd"/>
-            <w:r>
-              <w:t xml:space="preserve"> </w:t>
-            </w:r>
-            <w:proofErr w:type="spellStart"/>
-            <w:r>
-              <w:t>for</w:t>
-            </w:r>
-            <w:proofErr w:type="spellEnd"/>
-            <w:r>
-              <w:t xml:space="preserve"> BRCA1 and BRCA2 </w:t>
-            </w:r>
-            <w:proofErr w:type="spellStart"/>
-            <w:r>
-              <w:t>mutation</w:t>
-            </w:r>
-            <w:proofErr w:type="spellEnd"/>
-            <w:r>
-              <w:t xml:space="preserve"> </w:t>
-            </w:r>
-            <w:proofErr w:type="spellStart"/>
-            <w:r>
-              <w:t>carriers</w:t>
-            </w:r>
-            <w:proofErr w:type="spellEnd"/>
-            <w:r>
-              <w:t xml:space="preserve"> at 70 </w:t>
-            </w:r>
-            <w:proofErr w:type="spellStart"/>
-            <w:r>
-              <w:t>years</w:t>
-            </w:r>
-            <w:proofErr w:type="spellEnd"/>
-            <w:r>
-              <w:t xml:space="preserve"> </w:t>
-            </w:r>
-            <w:proofErr w:type="spellStart"/>
-            <w:r>
-              <w:t>of</w:t>
-            </w:r>
-            <w:proofErr w:type="spellEnd"/>
-            <w:r>
-              <w:t xml:space="preserve"> </w:t>
-            </w:r>
-            <w:proofErr w:type="spellStart"/>
-            <w:r>
-              <w:t>age</w:t>
-            </w:r>
-            <w:proofErr w:type="spellEnd"/>
-            <w:r>
-              <w:t xml:space="preserve"> </w:t>
-            </w:r>
-            <w:proofErr w:type="spellStart"/>
-            <w:r>
-              <w:t>is</w:t>
-            </w:r>
-            <w:proofErr w:type="spellEnd"/>
-            <w:r>
-              <w:t xml:space="preserve"> </w:t>
-            </w:r>
-            <w:proofErr w:type="spellStart"/>
-            <w:r>
-              <w:t>about</w:t>
-            </w:r>
-            <w:proofErr w:type="spellEnd"/>
-            <w:r>
-              <w:t xml:space="preserve"> 57%, </w:t>
-            </w:r>
-            <w:proofErr w:type="spellStart"/>
-            <w:r>
-              <w:t>respectively</w:t>
-            </w:r>
-            <w:proofErr w:type="spellEnd"/>
-            <w:r>
-              <w:t xml:space="preserve">, </w:t>
-            </w:r>
-            <w:proofErr w:type="spellStart"/>
-            <w:r>
-              <w:t>while</w:t>
-            </w:r>
-            <w:proofErr w:type="spellEnd"/>
-            <w:r>
-              <w:t xml:space="preserve"> cumulative OC </w:t>
-            </w:r>
-            <w:proofErr w:type="spellStart"/>
-            <w:r>
-              <w:t>risk</w:t>
-            </w:r>
-            <w:proofErr w:type="spellEnd"/>
-            <w:r>
-              <w:t xml:space="preserve"> </w:t>
-            </w:r>
-            <w:proofErr w:type="spellStart"/>
-            <w:r>
-              <w:t>is</w:t>
-            </w:r>
-            <w:proofErr w:type="spellEnd"/>
-            <w:r>
-              <w:t xml:space="preserve"> </w:t>
-            </w:r>
-            <w:proofErr w:type="spellStart"/>
-            <w:r>
-              <w:t>approximately</w:t>
-            </w:r>
-            <w:proofErr w:type="spellEnd"/>
-            <w:r>
-              <w:t xml:space="preserve"> 40% </w:t>
-            </w:r>
-            <w:proofErr w:type="spellStart"/>
-            <w:r>
-              <w:t>for</w:t>
-            </w:r>
-            <w:proofErr w:type="spellEnd"/>
-            <w:r>
-              <w:t xml:space="preserve"> BRCA1 and 18% </w:t>
-            </w:r>
-            <w:proofErr w:type="spellStart"/>
-            <w:r>
-              <w:t>for</w:t>
-            </w:r>
-            <w:proofErr w:type="spellEnd"/>
-            <w:r>
-              <w:t xml:space="preserve"> BRCA2 muta </w:t>
-            </w:r>
-            <w:proofErr w:type="spellStart"/>
-            <w:r>
-              <w:t>tion</w:t>
-            </w:r>
-            <w:proofErr w:type="spellEnd"/>
-            <w:r>
-              <w:t xml:space="preserve"> </w:t>
-            </w:r>
-            <w:proofErr w:type="spellStart"/>
-            <w:r>
-              <w:t>carriers</w:t>
-            </w:r>
-            <w:proofErr w:type="spellEnd"/>
-          </w:p>
+              <w:t>BRCA1 and BRCA2 are the most common mutated susceptibility genes in both tumors, followed by PALB2 (in BC) and genes with pathogenic variants that confer moderate penetrance cancer risk, such as ATM/CHEK2 (in BC) and BRIP1, RAD51C, RAD51D, MLH1, MSH2, and MSH6 (in OvC).</w:t>
+            </w:r>
+          </w:p>
+        </w:tc>
+        <w:tc>
+          <w:tcPr>
+            <w:tcW w:w="2875" w:type="dxa"/>
+          </w:tcPr>
+          <w:p>
+            <w:r>
+              <w:t>mama_en_SEOM-GEICAM-SOLTI_clinical-guidelines-hereditary-breast-ovarian-cancer_2019.pdf</w:t>
+            </w:r>
+          </w:p>
+        </w:tc>
+        <w:tc>
+          <w:tcPr>
+            <w:tcW w:w="985" w:type="dxa"/>
+          </w:tcPr>
+          <w:p>
+            <w:pPr>
+              <w:rPr>
+                <w:u w:val="single"/>
+              </w:rPr>
+            </w:pPr>
+            <w:r>
+              <w:t>3</w:t>
+            </w:r>
+          </w:p>
+        </w:tc>
+      </w:tr>
+      <w:tr>
+        <w:tc>
+          <w:tcPr>
+            <w:tcW w:w="4634" w:type="dxa"/>
+          </w:tcPr>
           <w:p>
             <w:pPr>
               <w:tabs>
                 <w:tab w:val="left" w:pos="892"/>
               </w:tabs>
             </w:pPr>
-          </w:p>
+            <w:r>
+              <w:t>se cree que más del 90% de los cánceres hereditarios de mama y ovario se deben a una mutación del gen BRCA1 o BRCA2.</w:t>
+            </w:r>
+          </w:p>
+        </w:tc>
+        <w:tc>
+          <w:tcPr>
+            <w:tcW w:w="2875" w:type="dxa"/>
+          </w:tcPr>
+          <w:p>
+            <w:r>
+              <w:t>mama_es_esmo_guia-para-pacientes_v1.pdf</w:t>
+            </w:r>
+          </w:p>
+        </w:tc>
+        <w:tc>
+          <w:tcPr>
+            <w:tcW w:w="985" w:type="dxa"/>
+          </w:tcPr>
+          <w:p>
+            <w:r>
+              <w:t>13</w:t>
+            </w:r>
+          </w:p>
+        </w:tc>
+      </w:tr>
+      <w:tr>
+        <w:tc>
+          <w:tcPr>
+            <w:tcW w:w="4634" w:type="dxa"/>
+          </w:tcPr>
           <w:p>
             <w:pPr>
               <w:tabs>
@@ -7764,201 +6768,12 @@
               </w:tabs>
             </w:pPr>
             <w:r>
-              <w:t xml:space="preserve">BRCA1 and BRCA2 are </w:t>
-            </w:r>
-            <w:proofErr w:type="spellStart"/>
-            <w:r>
-              <w:t>the</w:t>
-            </w:r>
-            <w:proofErr w:type="spellEnd"/>
-            <w:r>
-              <w:t xml:space="preserve"> </w:t>
-            </w:r>
-            <w:proofErr w:type="spellStart"/>
-            <w:r>
-              <w:t>most</w:t>
-            </w:r>
-            <w:proofErr w:type="spellEnd"/>
-            <w:r>
-              <w:t xml:space="preserve"> </w:t>
-            </w:r>
-            <w:proofErr w:type="spellStart"/>
-            <w:r>
-              <w:t>common</w:t>
-            </w:r>
-            <w:proofErr w:type="spellEnd"/>
-            <w:r>
-              <w:t xml:space="preserve"> </w:t>
-            </w:r>
-            <w:proofErr w:type="spellStart"/>
-            <w:r>
-              <w:t>mutated</w:t>
-            </w:r>
-            <w:proofErr w:type="spellEnd"/>
-            <w:r>
-              <w:t xml:space="preserve"> </w:t>
-            </w:r>
-            <w:proofErr w:type="spellStart"/>
-            <w:r>
-              <w:t>susceptibility</w:t>
-            </w:r>
-            <w:proofErr w:type="spellEnd"/>
-            <w:r>
-              <w:t xml:space="preserve"> genes in </w:t>
-            </w:r>
-            <w:proofErr w:type="spellStart"/>
-            <w:r>
-              <w:t>both</w:t>
-            </w:r>
-            <w:proofErr w:type="spellEnd"/>
-            <w:r>
-              <w:t xml:space="preserve"> </w:t>
-            </w:r>
-            <w:proofErr w:type="spellStart"/>
-            <w:r>
-              <w:t>tumors</w:t>
-            </w:r>
-            <w:proofErr w:type="spellEnd"/>
-            <w:r>
-              <w:t xml:space="preserve">, </w:t>
-            </w:r>
-            <w:proofErr w:type="spellStart"/>
-            <w:r>
-              <w:t>followed</w:t>
-            </w:r>
-            <w:proofErr w:type="spellEnd"/>
-            <w:r>
-              <w:t xml:space="preserve"> </w:t>
-            </w:r>
-            <w:proofErr w:type="spellStart"/>
-            <w:r>
-              <w:t>by</w:t>
-            </w:r>
-            <w:proofErr w:type="spellEnd"/>
-            <w:r>
-              <w:t xml:space="preserve"> PALB2 (in BC) and genes </w:t>
-            </w:r>
-            <w:proofErr w:type="spellStart"/>
-            <w:r>
-              <w:t>with</w:t>
-            </w:r>
-            <w:proofErr w:type="spellEnd"/>
-            <w:r>
-              <w:t xml:space="preserve"> </w:t>
-            </w:r>
-            <w:proofErr w:type="spellStart"/>
-            <w:r>
-              <w:t>pathogenic</w:t>
-            </w:r>
-            <w:proofErr w:type="spellEnd"/>
-            <w:r>
-              <w:t xml:space="preserve"> </w:t>
-            </w:r>
-            <w:proofErr w:type="spellStart"/>
-            <w:r>
-              <w:t>variants</w:t>
-            </w:r>
-            <w:proofErr w:type="spellEnd"/>
-            <w:r>
-              <w:t xml:space="preserve"> </w:t>
-            </w:r>
-            <w:proofErr w:type="spellStart"/>
-            <w:r>
-              <w:t>that</w:t>
-            </w:r>
-            <w:proofErr w:type="spellEnd"/>
-            <w:r>
-              <w:t xml:space="preserve"> </w:t>
-            </w:r>
-            <w:proofErr w:type="spellStart"/>
-            <w:r>
-              <w:t>confer</w:t>
-            </w:r>
-            <w:proofErr w:type="spellEnd"/>
-            <w:r>
-              <w:t xml:space="preserve"> </w:t>
-            </w:r>
-            <w:proofErr w:type="spellStart"/>
-            <w:r>
-              <w:t>moderate</w:t>
-            </w:r>
-            <w:proofErr w:type="spellEnd"/>
-            <w:r>
-              <w:t xml:space="preserve"> </w:t>
-            </w:r>
-            <w:proofErr w:type="spellStart"/>
-            <w:r>
-              <w:t>penetrance</w:t>
-            </w:r>
-            <w:proofErr w:type="spellEnd"/>
-            <w:r>
-              <w:t xml:space="preserve"> </w:t>
-            </w:r>
-            <w:proofErr w:type="spellStart"/>
-            <w:r>
-              <w:t>cancer</w:t>
-            </w:r>
-            <w:proofErr w:type="spellEnd"/>
-            <w:r>
-              <w:t xml:space="preserve"> </w:t>
-            </w:r>
-            <w:proofErr w:type="spellStart"/>
-            <w:r>
-              <w:t>risk</w:t>
-            </w:r>
-            <w:proofErr w:type="spellEnd"/>
-            <w:r>
-              <w:t xml:space="preserve">, </w:t>
-            </w:r>
-            <w:proofErr w:type="spellStart"/>
-            <w:r>
-              <w:t>such</w:t>
-            </w:r>
-            <w:proofErr w:type="spellEnd"/>
-            <w:r>
-              <w:t xml:space="preserve"> as ATM/CHEK2 (in BC) and BRIP1, RAD51C, RAD51D, MLH1, MSH2, and MSH6 (in </w:t>
-            </w:r>
-            <w:proofErr w:type="spellStart"/>
-            <w:r>
-              <w:t>OvC</w:t>
-            </w:r>
-            <w:proofErr w:type="spellEnd"/>
-            <w:r>
-              <w:t>).</w:t>
-            </w:r>
-          </w:p>
-        </w:tc>
-        <w:tc>
-          <w:tcPr>
-            <w:tcW w:w="2875" w:type="dxa"/>
-          </w:tcPr>
-          <w:p>
-            <w:pPr>
-              <w:rPr>
-                <w:u w:val="single"/>
-              </w:rPr>
-            </w:pPr>
-            <w:r>
-              <w:t>mama_en_SEOM-GEICAM-SOLTI_clinical-guidelines-hereditary-breast-ovarian-cancer_2019.pdf</w:t>
-            </w:r>
-          </w:p>
-        </w:tc>
-        <w:tc>
-          <w:tcPr>
-            <w:tcW w:w="985" w:type="dxa"/>
-          </w:tcPr>
-          <w:p>
-            <w:r>
-              <w:t>1</w:t>
-            </w:r>
-          </w:p>
-        </w:tc>
-      </w:tr>
-      <w:tr>
-        <w:tc>
-          <w:tcPr>
-            <w:tcW w:w="4634" w:type="dxa"/>
-          </w:tcPr>
+              <w:t xml:space="preserve">BRCA1: </w:t>
+            </w:r>
+            <w:r>
+              <w:t>Gen que cuando ha mutado (no funciona correctamente), se asocia con un riesgo muy alto de cáncer de mama y de ovario</w:t>
+            </w:r>
+          </w:p>
           <w:p>
             <w:pPr>
               <w:tabs>
@@ -7966,16 +6781,83 @@
               </w:tabs>
             </w:pPr>
             <w:r>
-              <w:t>se cree que más del 90% de los cánceres hereditarios de mama y ovario se deben a una mutación del gen BRCA1 o BRCA2.</w:t>
-            </w:r>
-          </w:p>
+              <w:lastRenderedPageBreak/>
+              <w:t xml:space="preserve">BRCA2: </w:t>
+            </w:r>
+            <w:r>
+              <w:t>Gen que cuando ha mutado (no funciona correctamente), se asocia con un riesgo muy alto de cáncer de mama y de ovario</w:t>
+            </w:r>
+          </w:p>
+        </w:tc>
+        <w:tc>
+          <w:tcPr>
+            <w:tcW w:w="2875" w:type="dxa"/>
+          </w:tcPr>
+          <w:p>
+            <w:r>
+              <w:lastRenderedPageBreak/>
+              <w:t>mama_es_esmo_guia-para-pacientes_v1.pdf</w:t>
+            </w:r>
+          </w:p>
+        </w:tc>
+        <w:tc>
+          <w:tcPr>
+            <w:tcW w:w="985" w:type="dxa"/>
+          </w:tcPr>
+          <w:p>
+            <w:pPr>
+              <w:rPr>
+                <w:u w:val="single"/>
+              </w:rPr>
+            </w:pPr>
+            <w:r>
+              <w:t>68</w:t>
+            </w:r>
+          </w:p>
+        </w:tc>
+      </w:tr>
+      <w:tr>
+        <w:tc>
+          <w:tcPr>
+            <w:tcW w:w="4634" w:type="dxa"/>
+          </w:tcPr>
           <w:p>
             <w:pPr>
               <w:tabs>
                 <w:tab w:val="left" w:pos="892"/>
               </w:tabs>
             </w:pPr>
-          </w:p>
+            <w:r>
+              <w:t>La mayor parte de los cánceres de mama hereditarios ocurren en los genes BRCA 1 y 2. [...] Existen otros genes como PALB2, TP53, CDH1, PTEN, ATM o CHEK2 que también aumentan la probabilidad de padecer un cáncer de mama a lo largo de la vida.</w:t>
+            </w:r>
+          </w:p>
+        </w:tc>
+        <w:tc>
+          <w:tcPr>
+            <w:tcW w:w="2875" w:type="dxa"/>
+          </w:tcPr>
+          <w:p>
+            <w:r>
+              <w:t>mama_es_SEOM_cancer-mama_2025.pdf</w:t>
+            </w:r>
+          </w:p>
+        </w:tc>
+        <w:tc>
+          <w:tcPr>
+            <w:tcW w:w="985" w:type="dxa"/>
+          </w:tcPr>
+          <w:p>
+            <w:r>
+              <w:t>6</w:t>
+            </w:r>
+          </w:p>
+        </w:tc>
+      </w:tr>
+      <w:tr>
+        <w:tc>
+          <w:tcPr>
+            <w:tcW w:w="4634" w:type="dxa"/>
+          </w:tcPr>
           <w:p>
             <w:pPr>
               <w:tabs>
@@ -7983,250 +6865,7 @@
               </w:tabs>
             </w:pPr>
             <w:r>
-              <w:t xml:space="preserve">BRCA1: </w:t>
-            </w:r>
-            <w:r>
-              <w:t>Gen que cuando ha mutado (no funciona correctamente), se asocia con un riesgo muy alto de cáncer de mama y de ovario</w:t>
-            </w:r>
-          </w:p>
-          <w:p>
-            <w:pPr>
-              <w:tabs>
-                <w:tab w:val="left" w:pos="892"/>
-              </w:tabs>
-            </w:pPr>
-            <w:r>
-              <w:t xml:space="preserve">BRCA2: </w:t>
-            </w:r>
-            <w:r>
-              <w:t>Gen que cuando ha mutado (no funciona correctamente), se asocia con un riesgo muy alto de cáncer de mama y de ovario</w:t>
-            </w:r>
-          </w:p>
-        </w:tc>
-        <w:tc>
-          <w:tcPr>
-            <w:tcW w:w="2875" w:type="dxa"/>
-          </w:tcPr>
-          <w:p>
-            <w:r>
-              <w:t>mama_es_esmo_guia-para-pacientes_v1.pdf</w:t>
-            </w:r>
-          </w:p>
-        </w:tc>
-        <w:tc>
-          <w:tcPr>
-            <w:tcW w:w="985" w:type="dxa"/>
-          </w:tcPr>
-          <w:p>
-            <w:r>
-              <w:t>13</w:t>
-            </w:r>
-          </w:p>
-        </w:tc>
-      </w:tr>
-      <w:tr>
-        <w:tc>
-          <w:tcPr>
-            <w:tcW w:w="4634" w:type="dxa"/>
-          </w:tcPr>
-          <w:p>
-            <w:pPr>
-              <w:tabs>
-                <w:tab w:val="left" w:pos="892"/>
-              </w:tabs>
-            </w:pPr>
-            <w:r>
-              <w:lastRenderedPageBreak/>
-              <w:t>La mayor parte de los cánceres de mama hereditarios ocurren en los genes BRCA 1 y 2. [...] Existen otros genes como PALB2, TP53, CDH1, PTEN, ATM o CHEK2 que también aumentan la probabilidad de padecer un cáncer de mama a lo largo de la vida.</w:t>
-            </w:r>
-          </w:p>
-        </w:tc>
-        <w:tc>
-          <w:tcPr>
-            <w:tcW w:w="2875" w:type="dxa"/>
-          </w:tcPr>
-          <w:p>
-            <w:r>
-              <w:t>mama_es_SEOM_cancer-mama_2025.pdf</w:t>
-            </w:r>
-          </w:p>
-        </w:tc>
-        <w:tc>
-          <w:tcPr>
-            <w:tcW w:w="985" w:type="dxa"/>
-          </w:tcPr>
-          <w:p>
-            <w:r>
-              <w:t>6</w:t>
-            </w:r>
-          </w:p>
-        </w:tc>
-      </w:tr>
-      <w:tr>
-        <w:tc>
-          <w:tcPr>
-            <w:tcW w:w="4634" w:type="dxa"/>
-          </w:tcPr>
-          <w:p>
-            <w:pPr>
-              <w:tabs>
-                <w:tab w:val="left" w:pos="892"/>
-              </w:tabs>
-            </w:pPr>
-            <w:r>
-              <w:t xml:space="preserve">BRCA and BRCA2 are </w:t>
-            </w:r>
-            <w:proofErr w:type="spellStart"/>
-            <w:r>
-              <w:t>high-penetrance</w:t>
-            </w:r>
-            <w:proofErr w:type="spellEnd"/>
-            <w:r>
-              <w:t xml:space="preserve"> </w:t>
-            </w:r>
-            <w:proofErr w:type="spellStart"/>
-            <w:r>
-              <w:t>cancer</w:t>
-            </w:r>
-            <w:proofErr w:type="spellEnd"/>
-            <w:r>
-              <w:t xml:space="preserve"> </w:t>
-            </w:r>
-            <w:proofErr w:type="spellStart"/>
-            <w:r>
-              <w:t>susceptibility</w:t>
-            </w:r>
-            <w:proofErr w:type="spellEnd"/>
-            <w:r>
-              <w:t xml:space="preserve"> genes [...] </w:t>
-            </w:r>
-            <w:proofErr w:type="spellStart"/>
-            <w:r>
-              <w:t>mutated</w:t>
-            </w:r>
-            <w:proofErr w:type="spellEnd"/>
-            <w:r>
-              <w:t xml:space="preserve"> in 5% </w:t>
-            </w:r>
-            <w:proofErr w:type="spellStart"/>
-            <w:r>
-              <w:t>of</w:t>
-            </w:r>
-            <w:proofErr w:type="spellEnd"/>
-            <w:r>
-              <w:t xml:space="preserve"> </w:t>
-            </w:r>
-            <w:proofErr w:type="spellStart"/>
-            <w:r>
-              <w:t>unselected</w:t>
-            </w:r>
-            <w:proofErr w:type="spellEnd"/>
-            <w:r>
-              <w:t xml:space="preserve"> BC </w:t>
-            </w:r>
-            <w:proofErr w:type="spellStart"/>
-            <w:r>
-              <w:t>patients</w:t>
-            </w:r>
-            <w:proofErr w:type="spellEnd"/>
-            <w:r>
-              <w:t xml:space="preserve">. [...] </w:t>
-            </w:r>
-            <w:proofErr w:type="spellStart"/>
-            <w:r>
-              <w:t>incidence</w:t>
-            </w:r>
-            <w:proofErr w:type="spellEnd"/>
-            <w:r>
-              <w:t xml:space="preserve"> can be </w:t>
-            </w:r>
-            <w:proofErr w:type="spellStart"/>
-            <w:r>
-              <w:t>higher</w:t>
-            </w:r>
-            <w:proofErr w:type="spellEnd"/>
-            <w:r>
-              <w:t xml:space="preserve"> </w:t>
-            </w:r>
-            <w:proofErr w:type="spellStart"/>
-            <w:r>
-              <w:t>among</w:t>
-            </w:r>
-            <w:proofErr w:type="spellEnd"/>
-            <w:r>
-              <w:t xml:space="preserve"> males </w:t>
-            </w:r>
-            <w:proofErr w:type="spellStart"/>
-            <w:r>
-              <w:t>with</w:t>
-            </w:r>
-            <w:proofErr w:type="spellEnd"/>
-            <w:r>
-              <w:t xml:space="preserve"> </w:t>
-            </w:r>
-            <w:proofErr w:type="spellStart"/>
-            <w:r>
-              <w:t>either</w:t>
-            </w:r>
-            <w:proofErr w:type="spellEnd"/>
-            <w:r>
-              <w:t xml:space="preserve"> </w:t>
-            </w:r>
-            <w:proofErr w:type="spellStart"/>
-            <w:r>
-              <w:t>genetic</w:t>
-            </w:r>
-            <w:proofErr w:type="spellEnd"/>
-            <w:r>
-              <w:t xml:space="preserve"> </w:t>
-            </w:r>
-            <w:proofErr w:type="spellStart"/>
-            <w:r>
-              <w:t>disorders</w:t>
-            </w:r>
-            <w:proofErr w:type="spellEnd"/>
-            <w:r>
-              <w:t xml:space="preserve"> </w:t>
-            </w:r>
-            <w:proofErr w:type="spellStart"/>
-            <w:r>
-              <w:t>or</w:t>
-            </w:r>
-            <w:proofErr w:type="spellEnd"/>
-            <w:r>
-              <w:t xml:space="preserve"> </w:t>
-            </w:r>
-            <w:proofErr w:type="spellStart"/>
-            <w:r>
-              <w:t>germline</w:t>
-            </w:r>
-            <w:proofErr w:type="spellEnd"/>
-            <w:r>
-              <w:t xml:space="preserve"> </w:t>
-            </w:r>
-            <w:proofErr w:type="spellStart"/>
-            <w:r>
-              <w:t>mutations</w:t>
-            </w:r>
-            <w:proofErr w:type="spellEnd"/>
-            <w:r>
-              <w:t xml:space="preserve"> in </w:t>
-            </w:r>
-            <w:proofErr w:type="spellStart"/>
-            <w:r>
-              <w:t>cancer</w:t>
-            </w:r>
-            <w:proofErr w:type="spellEnd"/>
-            <w:r>
-              <w:t xml:space="preserve"> </w:t>
-            </w:r>
-            <w:proofErr w:type="spellStart"/>
-            <w:r>
-              <w:t>susceptibility</w:t>
-            </w:r>
-            <w:proofErr w:type="spellEnd"/>
-            <w:r>
-              <w:t xml:space="preserve"> genes (BRCA2, CHEK2, ATM and PALB2)</w:t>
+              <w:t>BRCA and BRCA2 are high-penetrance cancer susceptibility genes [...] mutated in 5% of unselected BC patients. [...] incidence can be higher among males with either genetic disorders or germline mutations in cancer susceptibility genes (BRCA2, CHEK2, ATM and PALB2)</w:t>
             </w:r>
           </w:p>
         </w:tc>
@@ -8259,7 +6898,13 @@
       </w:pPr>
       <w:bookmarkStart w:id="29" w:name="_Toc231500567"/>
       <w:r>
-        <w:t xml:space="preserve">Pregunta 28: </w:t>
+        <w:t>Pregunta 2</w:t>
+      </w:r>
+      <w:r>
+        <w:t>9</w:t>
+      </w:r>
+      <w:r>
+        <w:t xml:space="preserve">: </w:t>
       </w:r>
       <w:r>
         <w:t>¿Qué es la pancitopenia?</w:t>
@@ -8346,7 +6991,10 @@
           </w:tcPr>
           <w:p>
             <w:r>
-              <w:t>73</w:t>
+              <w:t>7</w:t>
+            </w:r>
+            <w:r>
+              <w:t>2</w:t>
             </w:r>
           </w:p>
         </w:tc>
@@ -8359,7 +7007,13 @@
       </w:pPr>
       <w:bookmarkStart w:id="30" w:name="_Toc231500568"/>
       <w:r>
-        <w:t xml:space="preserve">Pregunta 29: </w:t>
+        <w:t xml:space="preserve">Pregunta </w:t>
+      </w:r>
+      <w:r>
+        <w:t>30</w:t>
+      </w:r>
+      <w:r>
+        <w:t xml:space="preserve">: </w:t>
       </w:r>
       <w:r>
         <w:t>¿Qué es la disnea?</w:t>
@@ -8441,7 +7095,7 @@
           </w:tcPr>
           <w:p>
             <w:r>
-              <w:t>71</w:t>
+              <w:t>69</w:t>
             </w:r>
           </w:p>
         </w:tc>
@@ -8515,7 +7169,10 @@
           </w:tcPr>
           <w:p>
             <w:r>
-              <w:t>27</w:t>
+              <w:t>2</w:t>
+            </w:r>
+            <w:r>
+              <w:t>8</w:t>
             </w:r>
           </w:p>
         </w:tc>
@@ -8551,8 +7208,13 @@
             <w:tcW w:w="986" w:type="dxa"/>
           </w:tcPr>
           <w:p>
-            <w:r>
-              <w:t>38</w:t>
+            <w:pPr>
+              <w:rPr>
+                <w:u w:val="single"/>
+              </w:rPr>
+            </w:pPr>
+            <w:r>
+              <w:t>40</w:t>
             </w:r>
           </w:p>
         </w:tc>
@@ -8565,7 +7227,13 @@
       </w:pPr>
       <w:bookmarkStart w:id="31" w:name="_Toc231500569"/>
       <w:r>
-        <w:t xml:space="preserve">Pregunta 30: </w:t>
+        <w:t>Pregunta 3</w:t>
+      </w:r>
+      <w:r>
+        <w:t>1</w:t>
+      </w:r>
+      <w:r>
+        <w:t xml:space="preserve">: </w:t>
       </w:r>
       <w:r>
         <w:t>¿Qué es la proteinuria?</w:t>
@@ -8646,8 +7314,16 @@
             <w:tcW w:w="986" w:type="dxa"/>
           </w:tcPr>
           <w:p>
-            <w:r>
-              <w:t>74</w:t>
+            <w:pPr>
+              <w:rPr>
+                <w:u w:val="single"/>
+              </w:rPr>
+            </w:pPr>
+            <w:r>
+              <w:t>7</w:t>
+            </w:r>
+            <w:r>
+              <w:t>2</w:t>
             </w:r>
           </w:p>
         </w:tc>

</xml_diff>

<commit_message>
RAG chatbot evaluated. Evaluation based on retrieval and content. A summary of the content evaluation can be found at /eval/content_evaluation_summary.md
</commit_message>
<xml_diff>
--- a/eval/preguntas_validacion.docx
+++ b/eval/preguntas_validacion.docx
@@ -7,11 +7,16 @@
         <w:pStyle w:val="Ttulo1"/>
         <w:jc w:val="center"/>
       </w:pPr>
-      <w:bookmarkStart w:id="0" w:name="_Toc231500538"/>
+      <w:bookmarkStart w:id="0" w:name="_Toc233126359"/>
       <w:r>
-        <w:t>Preguntas validación ChatBot</w:t>
+        <w:t xml:space="preserve">Preguntas validación </w:t>
+      </w:r>
+      <w:proofErr w:type="spellStart"/>
+      <w:r>
+        <w:t>ChatBot</w:t>
       </w:r>
       <w:bookmarkEnd w:id="0"/>
+      <w:proofErr w:type="spellEnd"/>
     </w:p>
     <w:sdt>
       <w:sdtPr>
@@ -52,7 +57,9 @@
               <w:tab w:val="right" w:leader="dot" w:pos="8494"/>
             </w:tabs>
             <w:rPr>
+              <w:rFonts w:eastAsiaTheme="minorEastAsia"/>
               <w:noProof/>
+              <w:lang w:eastAsia="es-ES"/>
             </w:rPr>
           </w:pPr>
           <w:r>
@@ -64,7 +71,7 @@
           <w:r>
             <w:fldChar w:fldCharType="separate"/>
           </w:r>
-          <w:hyperlink w:anchor="_Toc231500538" w:history="1">
+          <w:hyperlink w:anchor="_Toc233126359" w:history="1">
             <w:r>
               <w:rPr>
                 <w:rStyle w:val="Hipervnculo"/>
@@ -91,7 +98,7 @@
                 <w:noProof/>
                 <w:webHidden/>
               </w:rPr>
-              <w:instrText xml:space="preserve"> PAGEREF _Toc231500538 \h </w:instrText>
+              <w:instrText xml:space="preserve"> PAGEREF _Toc233126359 \h </w:instrText>
             </w:r>
             <w:r>
               <w:rPr>
@@ -129,10 +136,12 @@
               <w:tab w:val="right" w:leader="dot" w:pos="8494"/>
             </w:tabs>
             <w:rPr>
+              <w:rFonts w:eastAsiaTheme="minorEastAsia"/>
               <w:noProof/>
+              <w:lang w:eastAsia="es-ES"/>
             </w:rPr>
           </w:pPr>
-          <w:hyperlink w:anchor="_Toc231500539" w:history="1">
+          <w:hyperlink w:anchor="_Toc233126360" w:history="1">
             <w:r>
               <w:rPr>
                 <w:rStyle w:val="Hipervnculo"/>
@@ -159,7 +168,7 @@
                 <w:noProof/>
                 <w:webHidden/>
               </w:rPr>
-              <w:instrText xml:space="preserve"> PAGEREF _Toc231500539 \h </w:instrText>
+              <w:instrText xml:space="preserve"> PAGEREF _Toc233126360 \h </w:instrText>
             </w:r>
             <w:r>
               <w:rPr>
@@ -179,7 +188,7 @@
                 <w:noProof/>
                 <w:webHidden/>
               </w:rPr>
-              <w:t>2</w:t>
+              <w:t>3</w:t>
             </w:r>
             <w:r>
               <w:rPr>
@@ -197,10 +206,12 @@
               <w:tab w:val="right" w:leader="dot" w:pos="8494"/>
             </w:tabs>
             <w:rPr>
+              <w:rFonts w:eastAsiaTheme="minorEastAsia"/>
               <w:noProof/>
+              <w:lang w:eastAsia="es-ES"/>
             </w:rPr>
           </w:pPr>
-          <w:hyperlink w:anchor="_Toc231500540" w:history="1">
+          <w:hyperlink w:anchor="_Toc233126361" w:history="1">
             <w:r>
               <w:rPr>
                 <w:rStyle w:val="Hipervnculo"/>
@@ -227,7 +238,7 @@
                 <w:noProof/>
                 <w:webHidden/>
               </w:rPr>
-              <w:instrText xml:space="preserve"> PAGEREF _Toc231500540 \h </w:instrText>
+              <w:instrText xml:space="preserve"> PAGEREF _Toc233126361 \h </w:instrText>
             </w:r>
             <w:r>
               <w:rPr>
@@ -247,7 +258,7 @@
                 <w:noProof/>
                 <w:webHidden/>
               </w:rPr>
-              <w:t>2</w:t>
+              <w:t>3</w:t>
             </w:r>
             <w:r>
               <w:rPr>
@@ -265,10 +276,12 @@
               <w:tab w:val="right" w:leader="dot" w:pos="8494"/>
             </w:tabs>
             <w:rPr>
+              <w:rFonts w:eastAsiaTheme="minorEastAsia"/>
               <w:noProof/>
+              <w:lang w:eastAsia="es-ES"/>
             </w:rPr>
           </w:pPr>
-          <w:hyperlink w:anchor="_Toc231500541" w:history="1">
+          <w:hyperlink w:anchor="_Toc233126362" w:history="1">
             <w:r>
               <w:rPr>
                 <w:rStyle w:val="Hipervnculo"/>
@@ -295,7 +308,7 @@
                 <w:noProof/>
                 <w:webHidden/>
               </w:rPr>
-              <w:instrText xml:space="preserve"> PAGEREF _Toc231500541 \h </w:instrText>
+              <w:instrText xml:space="preserve"> PAGEREF _Toc233126362 \h </w:instrText>
             </w:r>
             <w:r>
               <w:rPr>
@@ -315,7 +328,7 @@
                 <w:noProof/>
                 <w:webHidden/>
               </w:rPr>
-              <w:t>2</w:t>
+              <w:t>3</w:t>
             </w:r>
             <w:r>
               <w:rPr>
@@ -333,10 +346,12 @@
               <w:tab w:val="right" w:leader="dot" w:pos="8494"/>
             </w:tabs>
             <w:rPr>
+              <w:rFonts w:eastAsiaTheme="minorEastAsia"/>
               <w:noProof/>
+              <w:lang w:eastAsia="es-ES"/>
             </w:rPr>
           </w:pPr>
-          <w:hyperlink w:anchor="_Toc231500542" w:history="1">
+          <w:hyperlink w:anchor="_Toc233126363" w:history="1">
             <w:r>
               <w:rPr>
                 <w:rStyle w:val="Hipervnculo"/>
@@ -363,7 +378,7 @@
                 <w:noProof/>
                 <w:webHidden/>
               </w:rPr>
-              <w:instrText xml:space="preserve"> PAGEREF _Toc231500542 \h </w:instrText>
+              <w:instrText xml:space="preserve"> PAGEREF _Toc233126363 \h </w:instrText>
             </w:r>
             <w:r>
               <w:rPr>
@@ -383,7 +398,7 @@
                 <w:noProof/>
                 <w:webHidden/>
               </w:rPr>
-              <w:t>2</w:t>
+              <w:t>3</w:t>
             </w:r>
             <w:r>
               <w:rPr>
@@ -401,10 +416,12 @@
               <w:tab w:val="right" w:leader="dot" w:pos="8494"/>
             </w:tabs>
             <w:rPr>
+              <w:rFonts w:eastAsiaTheme="minorEastAsia"/>
               <w:noProof/>
+              <w:lang w:eastAsia="es-ES"/>
             </w:rPr>
           </w:pPr>
-          <w:hyperlink w:anchor="_Toc231500543" w:history="1">
+          <w:hyperlink w:anchor="_Toc233126364" w:history="1">
             <w:r>
               <w:rPr>
                 <w:rStyle w:val="Hipervnculo"/>
@@ -431,7 +448,7 @@
                 <w:noProof/>
                 <w:webHidden/>
               </w:rPr>
-              <w:instrText xml:space="preserve"> PAGEREF _Toc231500543 \h </w:instrText>
+              <w:instrText xml:space="preserve"> PAGEREF _Toc233126364 \h </w:instrText>
             </w:r>
             <w:r>
               <w:rPr>
@@ -451,7 +468,7 @@
                 <w:noProof/>
                 <w:webHidden/>
               </w:rPr>
-              <w:t>2</w:t>
+              <w:t>4</w:t>
             </w:r>
             <w:r>
               <w:rPr>
@@ -469,10 +486,12 @@
               <w:tab w:val="right" w:leader="dot" w:pos="8494"/>
             </w:tabs>
             <w:rPr>
+              <w:rFonts w:eastAsiaTheme="minorEastAsia"/>
               <w:noProof/>
+              <w:lang w:eastAsia="es-ES"/>
             </w:rPr>
           </w:pPr>
-          <w:hyperlink w:anchor="_Toc231500544" w:history="1">
+          <w:hyperlink w:anchor="_Toc233126365" w:history="1">
             <w:r>
               <w:rPr>
                 <w:rStyle w:val="Hipervnculo"/>
@@ -499,7 +518,7 @@
                 <w:noProof/>
                 <w:webHidden/>
               </w:rPr>
-              <w:instrText xml:space="preserve"> PAGEREF _Toc231500544 \h </w:instrText>
+              <w:instrText xml:space="preserve"> PAGEREF _Toc233126365 \h </w:instrText>
             </w:r>
             <w:r>
               <w:rPr>
@@ -519,7 +538,7 @@
                 <w:noProof/>
                 <w:webHidden/>
               </w:rPr>
-              <w:t>2</w:t>
+              <w:t>4</w:t>
             </w:r>
             <w:r>
               <w:rPr>
@@ -537,10 +556,12 @@
               <w:tab w:val="right" w:leader="dot" w:pos="8494"/>
             </w:tabs>
             <w:rPr>
+              <w:rFonts w:eastAsiaTheme="minorEastAsia"/>
               <w:noProof/>
+              <w:lang w:eastAsia="es-ES"/>
             </w:rPr>
           </w:pPr>
-          <w:hyperlink w:anchor="_Toc231500545" w:history="1">
+          <w:hyperlink w:anchor="_Toc233126366" w:history="1">
             <w:r>
               <w:rPr>
                 <w:rStyle w:val="Hipervnculo"/>
@@ -567,7 +588,7 @@
                 <w:noProof/>
                 <w:webHidden/>
               </w:rPr>
-              <w:instrText xml:space="preserve"> PAGEREF _Toc231500545 \h </w:instrText>
+              <w:instrText xml:space="preserve"> PAGEREF _Toc233126366 \h </w:instrText>
             </w:r>
             <w:r>
               <w:rPr>
@@ -587,7 +608,7 @@
                 <w:noProof/>
                 <w:webHidden/>
               </w:rPr>
-              <w:t>2</w:t>
+              <w:t>4</w:t>
             </w:r>
             <w:r>
               <w:rPr>
@@ -605,10 +626,12 @@
               <w:tab w:val="right" w:leader="dot" w:pos="8494"/>
             </w:tabs>
             <w:rPr>
+              <w:rFonts w:eastAsiaTheme="minorEastAsia"/>
               <w:noProof/>
+              <w:lang w:eastAsia="es-ES"/>
             </w:rPr>
           </w:pPr>
-          <w:hyperlink w:anchor="_Toc231500546" w:history="1">
+          <w:hyperlink w:anchor="_Toc233126367" w:history="1">
             <w:r>
               <w:rPr>
                 <w:rStyle w:val="Hipervnculo"/>
@@ -635,7 +658,7 @@
                 <w:noProof/>
                 <w:webHidden/>
               </w:rPr>
-              <w:instrText xml:space="preserve"> PAGEREF _Toc231500546 \h </w:instrText>
+              <w:instrText xml:space="preserve"> PAGEREF _Toc233126367 \h </w:instrText>
             </w:r>
             <w:r>
               <w:rPr>
@@ -655,7 +678,7 @@
                 <w:noProof/>
                 <w:webHidden/>
               </w:rPr>
-              <w:t>2</w:t>
+              <w:t>4</w:t>
             </w:r>
             <w:r>
               <w:rPr>
@@ -673,10 +696,12 @@
               <w:tab w:val="right" w:leader="dot" w:pos="8494"/>
             </w:tabs>
             <w:rPr>
+              <w:rFonts w:eastAsiaTheme="minorEastAsia"/>
               <w:noProof/>
+              <w:lang w:eastAsia="es-ES"/>
             </w:rPr>
           </w:pPr>
-          <w:hyperlink w:anchor="_Toc231500547" w:history="1">
+          <w:hyperlink w:anchor="_Toc233126368" w:history="1">
             <w:r>
               <w:rPr>
                 <w:rStyle w:val="Hipervnculo"/>
@@ -703,7 +728,7 @@
                 <w:noProof/>
                 <w:webHidden/>
               </w:rPr>
-              <w:instrText xml:space="preserve"> PAGEREF _Toc231500547 \h </w:instrText>
+              <w:instrText xml:space="preserve"> PAGEREF _Toc233126368 \h </w:instrText>
             </w:r>
             <w:r>
               <w:rPr>
@@ -723,7 +748,7 @@
                 <w:noProof/>
                 <w:webHidden/>
               </w:rPr>
-              <w:t>3</w:t>
+              <w:t>5</w:t>
             </w:r>
             <w:r>
               <w:rPr>
@@ -741,10 +766,12 @@
               <w:tab w:val="right" w:leader="dot" w:pos="8494"/>
             </w:tabs>
             <w:rPr>
+              <w:rFonts w:eastAsiaTheme="minorEastAsia"/>
               <w:noProof/>
+              <w:lang w:eastAsia="es-ES"/>
             </w:rPr>
           </w:pPr>
-          <w:hyperlink w:anchor="_Toc231500548" w:history="1">
+          <w:hyperlink w:anchor="_Toc233126369" w:history="1">
             <w:r>
               <w:rPr>
                 <w:rStyle w:val="Hipervnculo"/>
@@ -771,7 +798,7 @@
                 <w:noProof/>
                 <w:webHidden/>
               </w:rPr>
-              <w:instrText xml:space="preserve"> PAGEREF _Toc231500548 \h </w:instrText>
+              <w:instrText xml:space="preserve"> PAGEREF _Toc233126369 \h </w:instrText>
             </w:r>
             <w:r>
               <w:rPr>
@@ -791,7 +818,7 @@
                 <w:noProof/>
                 <w:webHidden/>
               </w:rPr>
-              <w:t>3</w:t>
+              <w:t>5</w:t>
             </w:r>
             <w:r>
               <w:rPr>
@@ -809,10 +836,12 @@
               <w:tab w:val="right" w:leader="dot" w:pos="8494"/>
             </w:tabs>
             <w:rPr>
+              <w:rFonts w:eastAsiaTheme="minorEastAsia"/>
               <w:noProof/>
+              <w:lang w:eastAsia="es-ES"/>
             </w:rPr>
           </w:pPr>
-          <w:hyperlink w:anchor="_Toc231500549" w:history="1">
+          <w:hyperlink w:anchor="_Toc233126370" w:history="1">
             <w:r>
               <w:rPr>
                 <w:rStyle w:val="Hipervnculo"/>
@@ -839,7 +868,7 @@
                 <w:noProof/>
                 <w:webHidden/>
               </w:rPr>
-              <w:instrText xml:space="preserve"> PAGEREF _Toc231500549 \h </w:instrText>
+              <w:instrText xml:space="preserve"> PAGEREF _Toc233126370 \h </w:instrText>
             </w:r>
             <w:r>
               <w:rPr>
@@ -859,7 +888,7 @@
                 <w:noProof/>
                 <w:webHidden/>
               </w:rPr>
-              <w:t>3</w:t>
+              <w:t>5</w:t>
             </w:r>
             <w:r>
               <w:rPr>
@@ -877,10 +906,12 @@
               <w:tab w:val="right" w:leader="dot" w:pos="8494"/>
             </w:tabs>
             <w:rPr>
+              <w:rFonts w:eastAsiaTheme="minorEastAsia"/>
               <w:noProof/>
+              <w:lang w:eastAsia="es-ES"/>
             </w:rPr>
           </w:pPr>
-          <w:hyperlink w:anchor="_Toc231500550" w:history="1">
+          <w:hyperlink w:anchor="_Toc233126371" w:history="1">
             <w:r>
               <w:rPr>
                 <w:rStyle w:val="Hipervnculo"/>
@@ -907,7 +938,7 @@
                 <w:noProof/>
                 <w:webHidden/>
               </w:rPr>
-              <w:instrText xml:space="preserve"> PAGEREF _Toc231500550 \h </w:instrText>
+              <w:instrText xml:space="preserve"> PAGEREF _Toc233126371 \h </w:instrText>
             </w:r>
             <w:r>
               <w:rPr>
@@ -927,7 +958,7 @@
                 <w:noProof/>
                 <w:webHidden/>
               </w:rPr>
-              <w:t>4</w:t>
+              <w:t>6</w:t>
             </w:r>
             <w:r>
               <w:rPr>
@@ -945,10 +976,12 @@
               <w:tab w:val="right" w:leader="dot" w:pos="8494"/>
             </w:tabs>
             <w:rPr>
+              <w:rFonts w:eastAsiaTheme="minorEastAsia"/>
               <w:noProof/>
+              <w:lang w:eastAsia="es-ES"/>
             </w:rPr>
           </w:pPr>
-          <w:hyperlink w:anchor="_Toc231500551" w:history="1">
+          <w:hyperlink w:anchor="_Toc233126372" w:history="1">
             <w:r>
               <w:rPr>
                 <w:rStyle w:val="Hipervnculo"/>
@@ -975,7 +1008,7 @@
                 <w:noProof/>
                 <w:webHidden/>
               </w:rPr>
-              <w:instrText xml:space="preserve"> PAGEREF _Toc231500551 \h </w:instrText>
+              <w:instrText xml:space="preserve"> PAGEREF _Toc233126372 \h </w:instrText>
             </w:r>
             <w:r>
               <w:rPr>
@@ -995,7 +1028,7 @@
                 <w:noProof/>
                 <w:webHidden/>
               </w:rPr>
-              <w:t>4</w:t>
+              <w:t>6</w:t>
             </w:r>
             <w:r>
               <w:rPr>
@@ -1014,10 +1047,12 @@
               <w:tab w:val="right" w:leader="dot" w:pos="8494"/>
             </w:tabs>
             <w:rPr>
+              <w:rFonts w:eastAsiaTheme="minorEastAsia"/>
               <w:noProof/>
+              <w:lang w:eastAsia="es-ES"/>
             </w:rPr>
           </w:pPr>
-          <w:hyperlink w:anchor="_Toc231500552" w:history="1">
+          <w:hyperlink w:anchor="_Toc233126373" w:history="1">
             <w:r>
               <w:rPr>
                 <w:rStyle w:val="Hipervnculo"/>
@@ -1027,7 +1062,9 @@
             </w:r>
             <w:r>
               <w:rPr>
-                <w:noProof/>
+                <w:rFonts w:eastAsiaTheme="minorEastAsia"/>
+                <w:noProof/>
+                <w:lang w:eastAsia="es-ES"/>
               </w:rPr>
               <w:tab/>
             </w:r>
@@ -1057,7 +1094,7 @@
                 <w:noProof/>
                 <w:webHidden/>
               </w:rPr>
-              <w:instrText xml:space="preserve"> PAGEREF _Toc231500552 \h </w:instrText>
+              <w:instrText xml:space="preserve"> PAGEREF _Toc233126373 \h </w:instrText>
             </w:r>
             <w:r>
               <w:rPr>
@@ -1077,7 +1114,7 @@
                 <w:noProof/>
                 <w:webHidden/>
               </w:rPr>
-              <w:t>5</w:t>
+              <w:t>7</w:t>
             </w:r>
             <w:r>
               <w:rPr>
@@ -1095,10 +1132,12 @@
               <w:tab w:val="right" w:leader="dot" w:pos="8494"/>
             </w:tabs>
             <w:rPr>
+              <w:rFonts w:eastAsiaTheme="minorEastAsia"/>
               <w:noProof/>
+              <w:lang w:eastAsia="es-ES"/>
             </w:rPr>
           </w:pPr>
-          <w:hyperlink w:anchor="_Toc231500553" w:history="1">
+          <w:hyperlink w:anchor="_Toc233126374" w:history="1">
             <w:r>
               <w:rPr>
                 <w:rStyle w:val="Hipervnculo"/>
@@ -1125,7 +1164,7 @@
                 <w:noProof/>
                 <w:webHidden/>
               </w:rPr>
-              <w:instrText xml:space="preserve"> PAGEREF _Toc231500553 \h </w:instrText>
+              <w:instrText xml:space="preserve"> PAGEREF _Toc233126374 \h </w:instrText>
             </w:r>
             <w:r>
               <w:rPr>
@@ -1145,7 +1184,7 @@
                 <w:noProof/>
                 <w:webHidden/>
               </w:rPr>
-              <w:t>5</w:t>
+              <w:t>7</w:t>
             </w:r>
             <w:r>
               <w:rPr>
@@ -1163,10 +1202,12 @@
               <w:tab w:val="right" w:leader="dot" w:pos="8494"/>
             </w:tabs>
             <w:rPr>
+              <w:rFonts w:eastAsiaTheme="minorEastAsia"/>
               <w:noProof/>
+              <w:lang w:eastAsia="es-ES"/>
             </w:rPr>
           </w:pPr>
-          <w:hyperlink w:anchor="_Toc231500554" w:history="1">
+          <w:hyperlink w:anchor="_Toc233126375" w:history="1">
             <w:r>
               <w:rPr>
                 <w:rStyle w:val="Hipervnculo"/>
@@ -1193,7 +1234,7 @@
                 <w:noProof/>
                 <w:webHidden/>
               </w:rPr>
-              <w:instrText xml:space="preserve"> PAGEREF _Toc231500554 \h </w:instrText>
+              <w:instrText xml:space="preserve"> PAGEREF _Toc233126375 \h </w:instrText>
             </w:r>
             <w:r>
               <w:rPr>
@@ -1213,7 +1254,7 @@
                 <w:noProof/>
                 <w:webHidden/>
               </w:rPr>
-              <w:t>6</w:t>
+              <w:t>8</w:t>
             </w:r>
             <w:r>
               <w:rPr>
@@ -1231,10 +1272,12 @@
               <w:tab w:val="right" w:leader="dot" w:pos="8494"/>
             </w:tabs>
             <w:rPr>
+              <w:rFonts w:eastAsiaTheme="minorEastAsia"/>
               <w:noProof/>
+              <w:lang w:eastAsia="es-ES"/>
             </w:rPr>
           </w:pPr>
-          <w:hyperlink w:anchor="_Toc231500555" w:history="1">
+          <w:hyperlink w:anchor="_Toc233126376" w:history="1">
             <w:r>
               <w:rPr>
                 <w:rStyle w:val="Hipervnculo"/>
@@ -1261,7 +1304,7 @@
                 <w:noProof/>
                 <w:webHidden/>
               </w:rPr>
-              <w:instrText xml:space="preserve"> PAGEREF _Toc231500555 \h </w:instrText>
+              <w:instrText xml:space="preserve"> PAGEREF _Toc233126376 \h </w:instrText>
             </w:r>
             <w:r>
               <w:rPr>
@@ -1281,7 +1324,7 @@
                 <w:noProof/>
                 <w:webHidden/>
               </w:rPr>
-              <w:t>7</w:t>
+              <w:t>9</w:t>
             </w:r>
             <w:r>
               <w:rPr>
@@ -1300,10 +1343,12 @@
               <w:tab w:val="right" w:leader="dot" w:pos="8494"/>
             </w:tabs>
             <w:rPr>
+              <w:rFonts w:eastAsiaTheme="minorEastAsia"/>
               <w:noProof/>
+              <w:lang w:eastAsia="es-ES"/>
             </w:rPr>
           </w:pPr>
-          <w:hyperlink w:anchor="_Toc231500556" w:history="1">
+          <w:hyperlink w:anchor="_Toc233126377" w:history="1">
             <w:r>
               <w:rPr>
                 <w:rStyle w:val="Hipervnculo"/>
@@ -1313,7 +1358,9 @@
             </w:r>
             <w:r>
               <w:rPr>
-                <w:noProof/>
+                <w:rFonts w:eastAsiaTheme="minorEastAsia"/>
+                <w:noProof/>
+                <w:lang w:eastAsia="es-ES"/>
               </w:rPr>
               <w:tab/>
             </w:r>
@@ -1343,7 +1390,7 @@
                 <w:noProof/>
                 <w:webHidden/>
               </w:rPr>
-              <w:instrText xml:space="preserve"> PAGEREF _Toc231500556 \h </w:instrText>
+              <w:instrText xml:space="preserve"> PAGEREF _Toc233126377 \h </w:instrText>
             </w:r>
             <w:r>
               <w:rPr>
@@ -1363,7 +1410,7 @@
                 <w:noProof/>
                 <w:webHidden/>
               </w:rPr>
-              <w:t>7</w:t>
+              <w:t>9</w:t>
             </w:r>
             <w:r>
               <w:rPr>
@@ -1381,10 +1428,12 @@
               <w:tab w:val="right" w:leader="dot" w:pos="8494"/>
             </w:tabs>
             <w:rPr>
+              <w:rFonts w:eastAsiaTheme="minorEastAsia"/>
               <w:noProof/>
+              <w:lang w:eastAsia="es-ES"/>
             </w:rPr>
           </w:pPr>
-          <w:hyperlink w:anchor="_Toc231500557" w:history="1">
+          <w:hyperlink w:anchor="_Toc233126378" w:history="1">
             <w:r>
               <w:rPr>
                 <w:rStyle w:val="Hipervnculo"/>
@@ -1411,7 +1460,7 @@
                 <w:noProof/>
                 <w:webHidden/>
               </w:rPr>
-              <w:instrText xml:space="preserve"> PAGEREF _Toc231500557 \h </w:instrText>
+              <w:instrText xml:space="preserve"> PAGEREF _Toc233126378 \h </w:instrText>
             </w:r>
             <w:r>
               <w:rPr>
@@ -1431,7 +1480,7 @@
                 <w:noProof/>
                 <w:webHidden/>
               </w:rPr>
-              <w:t>8</w:t>
+              <w:t>10</w:t>
             </w:r>
             <w:r>
               <w:rPr>
@@ -1449,10 +1498,12 @@
               <w:tab w:val="right" w:leader="dot" w:pos="8494"/>
             </w:tabs>
             <w:rPr>
+              <w:rFonts w:eastAsiaTheme="minorEastAsia"/>
               <w:noProof/>
+              <w:lang w:eastAsia="es-ES"/>
             </w:rPr>
           </w:pPr>
-          <w:hyperlink w:anchor="_Toc231500558" w:history="1">
+          <w:hyperlink w:anchor="_Toc233126379" w:history="1">
             <w:r>
               <w:rPr>
                 <w:rStyle w:val="Hipervnculo"/>
@@ -1479,7 +1530,7 @@
                 <w:noProof/>
                 <w:webHidden/>
               </w:rPr>
-              <w:instrText xml:space="preserve"> PAGEREF _Toc231500558 \h </w:instrText>
+              <w:instrText xml:space="preserve"> PAGEREF _Toc233126379 \h </w:instrText>
             </w:r>
             <w:r>
               <w:rPr>
@@ -1499,7 +1550,7 @@
                 <w:noProof/>
                 <w:webHidden/>
               </w:rPr>
-              <w:t>9</w:t>
+              <w:t>11</w:t>
             </w:r>
             <w:r>
               <w:rPr>
@@ -1518,10 +1569,12 @@
               <w:tab w:val="right" w:leader="dot" w:pos="8494"/>
             </w:tabs>
             <w:rPr>
+              <w:rFonts w:eastAsiaTheme="minorEastAsia"/>
               <w:noProof/>
+              <w:lang w:eastAsia="es-ES"/>
             </w:rPr>
           </w:pPr>
-          <w:hyperlink w:anchor="_Toc231500559" w:history="1">
+          <w:hyperlink w:anchor="_Toc233126380" w:history="1">
             <w:r>
               <w:rPr>
                 <w:rStyle w:val="Hipervnculo"/>
@@ -1531,7 +1584,9 @@
             </w:r>
             <w:r>
               <w:rPr>
-                <w:noProof/>
+                <w:rFonts w:eastAsiaTheme="minorEastAsia"/>
+                <w:noProof/>
+                <w:lang w:eastAsia="es-ES"/>
               </w:rPr>
               <w:tab/>
             </w:r>
@@ -1561,7 +1616,7 @@
                 <w:noProof/>
                 <w:webHidden/>
               </w:rPr>
-              <w:instrText xml:space="preserve"> PAGEREF _Toc231500559 \h </w:instrText>
+              <w:instrText xml:space="preserve"> PAGEREF _Toc233126380 \h </w:instrText>
             </w:r>
             <w:r>
               <w:rPr>
@@ -1581,7 +1636,7 @@
                 <w:noProof/>
                 <w:webHidden/>
               </w:rPr>
-              <w:t>10</w:t>
+              <w:t>12</w:t>
             </w:r>
             <w:r>
               <w:rPr>
@@ -1599,10 +1654,12 @@
               <w:tab w:val="right" w:leader="dot" w:pos="8494"/>
             </w:tabs>
             <w:rPr>
+              <w:rFonts w:eastAsiaTheme="minorEastAsia"/>
               <w:noProof/>
+              <w:lang w:eastAsia="es-ES"/>
             </w:rPr>
           </w:pPr>
-          <w:hyperlink w:anchor="_Toc231500560" w:history="1">
+          <w:hyperlink w:anchor="_Toc233126381" w:history="1">
             <w:r>
               <w:rPr>
                 <w:rStyle w:val="Hipervnculo"/>
@@ -1629,7 +1686,7 @@
                 <w:noProof/>
                 <w:webHidden/>
               </w:rPr>
-              <w:instrText xml:space="preserve"> PAGEREF _Toc231500560 \h </w:instrText>
+              <w:instrText xml:space="preserve"> PAGEREF _Toc233126381 \h </w:instrText>
             </w:r>
             <w:r>
               <w:rPr>
@@ -1649,7 +1706,7 @@
                 <w:noProof/>
                 <w:webHidden/>
               </w:rPr>
-              <w:t>11</w:t>
+              <w:t>13</w:t>
             </w:r>
             <w:r>
               <w:rPr>
@@ -1667,10 +1724,12 @@
               <w:tab w:val="right" w:leader="dot" w:pos="8494"/>
             </w:tabs>
             <w:rPr>
+              <w:rFonts w:eastAsiaTheme="minorEastAsia"/>
               <w:noProof/>
+              <w:lang w:eastAsia="es-ES"/>
             </w:rPr>
           </w:pPr>
-          <w:hyperlink w:anchor="_Toc231500561" w:history="1">
+          <w:hyperlink w:anchor="_Toc233126382" w:history="1">
             <w:r>
               <w:rPr>
                 <w:rStyle w:val="Hipervnculo"/>
@@ -1697,7 +1756,7 @@
                 <w:noProof/>
                 <w:webHidden/>
               </w:rPr>
-              <w:instrText xml:space="preserve"> PAGEREF _Toc231500561 \h </w:instrText>
+              <w:instrText xml:space="preserve"> PAGEREF _Toc233126382 \h </w:instrText>
             </w:r>
             <w:r>
               <w:rPr>
@@ -1717,7 +1776,7 @@
                 <w:noProof/>
                 <w:webHidden/>
               </w:rPr>
-              <w:t>11</w:t>
+              <w:t>13</w:t>
             </w:r>
             <w:r>
               <w:rPr>
@@ -1735,16 +1794,18 @@
               <w:tab w:val="right" w:leader="dot" w:pos="8494"/>
             </w:tabs>
             <w:rPr>
+              <w:rFonts w:eastAsiaTheme="minorEastAsia"/>
               <w:noProof/>
+              <w:lang w:eastAsia="es-ES"/>
             </w:rPr>
           </w:pPr>
-          <w:hyperlink w:anchor="_Toc231500562" w:history="1">
+          <w:hyperlink w:anchor="_Toc233126383" w:history="1">
             <w:r>
               <w:rPr>
                 <w:rStyle w:val="Hipervnculo"/>
                 <w:noProof/>
               </w:rPr>
-              <w:t>Pregunta 23: ¿Qué es la dispareunia?</w:t>
+              <w:t>Pregunta 24: ¿Qué es la dispareunia?</w:t>
             </w:r>
             <w:r>
               <w:rPr>
@@ -1765,7 +1826,7 @@
                 <w:noProof/>
                 <w:webHidden/>
               </w:rPr>
-              <w:instrText xml:space="preserve"> PAGEREF _Toc231500562 \h </w:instrText>
+              <w:instrText xml:space="preserve"> PAGEREF _Toc233126383 \h </w:instrText>
             </w:r>
             <w:r>
               <w:rPr>
@@ -1785,7 +1846,7 @@
                 <w:noProof/>
                 <w:webHidden/>
               </w:rPr>
-              <w:t>12</w:t>
+              <w:t>14</w:t>
             </w:r>
             <w:r>
               <w:rPr>
@@ -1803,16 +1864,18 @@
               <w:tab w:val="right" w:leader="dot" w:pos="8494"/>
             </w:tabs>
             <w:rPr>
+              <w:rFonts w:eastAsiaTheme="minorEastAsia"/>
               <w:noProof/>
+              <w:lang w:eastAsia="es-ES"/>
             </w:rPr>
           </w:pPr>
-          <w:hyperlink w:anchor="_Toc231500563" w:history="1">
+          <w:hyperlink w:anchor="_Toc233126384" w:history="1">
             <w:r>
               <w:rPr>
                 <w:rStyle w:val="Hipervnculo"/>
                 <w:noProof/>
               </w:rPr>
-              <w:t>Pregunta 24: ¿Puedo quedarme embarazada después de un tratamiento de cancer?</w:t>
+              <w:t>Pregunta 25: ¿Puedo quedarme embarazada después de un tratamiento de cancer?</w:t>
             </w:r>
             <w:r>
               <w:rPr>
@@ -1833,7 +1896,7 @@
                 <w:noProof/>
                 <w:webHidden/>
               </w:rPr>
-              <w:instrText xml:space="preserve"> PAGEREF _Toc231500563 \h </w:instrText>
+              <w:instrText xml:space="preserve"> PAGEREF _Toc233126384 \h </w:instrText>
             </w:r>
             <w:r>
               <w:rPr>
@@ -1853,7 +1916,7 @@
                 <w:noProof/>
                 <w:webHidden/>
               </w:rPr>
-              <w:t>12</w:t>
+              <w:t>14</w:t>
             </w:r>
             <w:r>
               <w:rPr>
@@ -1871,16 +1934,18 @@
               <w:tab w:val="right" w:leader="dot" w:pos="8494"/>
             </w:tabs>
             <w:rPr>
+              <w:rFonts w:eastAsiaTheme="minorEastAsia"/>
               <w:noProof/>
+              <w:lang w:eastAsia="es-ES"/>
             </w:rPr>
           </w:pPr>
-          <w:hyperlink w:anchor="_Toc231500564" w:history="1">
+          <w:hyperlink w:anchor="_Toc233126385" w:history="1">
             <w:r>
               <w:rPr>
                 <w:rStyle w:val="Hipervnculo"/>
                 <w:noProof/>
               </w:rPr>
-              <w:t>Pregunta 25: ¿cuáles son los factores de riesgo del cancer de mama?</w:t>
+              <w:t>Pregunta 26: ¿cuáles son los factores de riesgo del cancer de mama?</w:t>
             </w:r>
             <w:r>
               <w:rPr>
@@ -1901,7 +1966,7 @@
                 <w:noProof/>
                 <w:webHidden/>
               </w:rPr>
-              <w:instrText xml:space="preserve"> PAGEREF _Toc231500564 \h </w:instrText>
+              <w:instrText xml:space="preserve"> PAGEREF _Toc233126385 \h </w:instrText>
             </w:r>
             <w:r>
               <w:rPr>
@@ -1921,7 +1986,7 @@
                 <w:noProof/>
                 <w:webHidden/>
               </w:rPr>
-              <w:t>12</w:t>
+              <w:t>15</w:t>
             </w:r>
             <w:r>
               <w:rPr>
@@ -1939,16 +2004,18 @@
               <w:tab w:val="right" w:leader="dot" w:pos="8494"/>
             </w:tabs>
             <w:rPr>
+              <w:rFonts w:eastAsiaTheme="minorEastAsia"/>
               <w:noProof/>
+              <w:lang w:eastAsia="es-ES"/>
             </w:rPr>
           </w:pPr>
-          <w:hyperlink w:anchor="_Toc231500565" w:history="1">
+          <w:hyperlink w:anchor="_Toc233126386" w:history="1">
             <w:r>
               <w:rPr>
                 <w:rStyle w:val="Hipervnculo"/>
                 <w:noProof/>
               </w:rPr>
-              <w:t>Pregunta 26: ¿Cómo se pueden solicitar pruebas de imagen de mama y qué información es necesaria?</w:t>
+              <w:t>Pregunta 27: ¿Cómo se pueden solicitar pruebas de imagen de mama y qué información es necesaria?</w:t>
             </w:r>
             <w:r>
               <w:rPr>
@@ -1969,7 +2036,7 @@
                 <w:noProof/>
                 <w:webHidden/>
               </w:rPr>
-              <w:instrText xml:space="preserve"> PAGEREF _Toc231500565 \h </w:instrText>
+              <w:instrText xml:space="preserve"> PAGEREF _Toc233126386 \h </w:instrText>
             </w:r>
             <w:r>
               <w:rPr>
@@ -1989,7 +2056,7 @@
                 <w:noProof/>
                 <w:webHidden/>
               </w:rPr>
-              <w:t>14</w:t>
+              <w:t>16</w:t>
             </w:r>
             <w:r>
               <w:rPr>
@@ -2007,16 +2074,18 @@
               <w:tab w:val="right" w:leader="dot" w:pos="8494"/>
             </w:tabs>
             <w:rPr>
+              <w:rFonts w:eastAsiaTheme="minorEastAsia"/>
               <w:noProof/>
+              <w:lang w:eastAsia="es-ES"/>
             </w:rPr>
           </w:pPr>
-          <w:hyperlink w:anchor="_Toc231500566" w:history="1">
+          <w:hyperlink w:anchor="_Toc233126387" w:history="1">
             <w:r>
               <w:rPr>
                 <w:rStyle w:val="Hipervnculo"/>
                 <w:noProof/>
               </w:rPr>
-              <w:t>Pregunta 27: ¿Cuáles son las mutaciones genéticas más frecuentes en cáncer de mama y ovario hereditario?</w:t>
+              <w:t>Pregunta 28: ¿Cuáles son las mutaciones genéticas más frecuentes en cáncer de mama y ovario hereditario?</w:t>
             </w:r>
             <w:r>
               <w:rPr>
@@ -2037,7 +2106,7 @@
                 <w:noProof/>
                 <w:webHidden/>
               </w:rPr>
-              <w:instrText xml:space="preserve"> PAGEREF _Toc231500566 \h </w:instrText>
+              <w:instrText xml:space="preserve"> PAGEREF _Toc233126387 \h </w:instrText>
             </w:r>
             <w:r>
               <w:rPr>
@@ -2057,7 +2126,7 @@
                 <w:noProof/>
                 <w:webHidden/>
               </w:rPr>
-              <w:t>15</w:t>
+              <w:t>17</w:t>
             </w:r>
             <w:r>
               <w:rPr>
@@ -2075,16 +2144,18 @@
               <w:tab w:val="right" w:leader="dot" w:pos="8494"/>
             </w:tabs>
             <w:rPr>
+              <w:rFonts w:eastAsiaTheme="minorEastAsia"/>
               <w:noProof/>
+              <w:lang w:eastAsia="es-ES"/>
             </w:rPr>
           </w:pPr>
-          <w:hyperlink w:anchor="_Toc231500567" w:history="1">
+          <w:hyperlink w:anchor="_Toc233126388" w:history="1">
             <w:r>
               <w:rPr>
                 <w:rStyle w:val="Hipervnculo"/>
                 <w:noProof/>
               </w:rPr>
-              <w:t>Pregunta 28: ¿Qué es la pancitopenia?</w:t>
+              <w:t>Pregunta 29: ¿Qué es la pancitopenia?</w:t>
             </w:r>
             <w:r>
               <w:rPr>
@@ -2105,7 +2176,7 @@
                 <w:noProof/>
                 <w:webHidden/>
               </w:rPr>
-              <w:instrText xml:space="preserve"> PAGEREF _Toc231500567 \h </w:instrText>
+              <w:instrText xml:space="preserve"> PAGEREF _Toc233126388 \h </w:instrText>
             </w:r>
             <w:r>
               <w:rPr>
@@ -2125,7 +2196,7 @@
                 <w:noProof/>
                 <w:webHidden/>
               </w:rPr>
-              <w:t>16</w:t>
+              <w:t>18</w:t>
             </w:r>
             <w:r>
               <w:rPr>
@@ -2143,16 +2214,18 @@
               <w:tab w:val="right" w:leader="dot" w:pos="8494"/>
             </w:tabs>
             <w:rPr>
+              <w:rFonts w:eastAsiaTheme="minorEastAsia"/>
               <w:noProof/>
+              <w:lang w:eastAsia="es-ES"/>
             </w:rPr>
           </w:pPr>
-          <w:hyperlink w:anchor="_Toc231500568" w:history="1">
+          <w:hyperlink w:anchor="_Toc233126389" w:history="1">
             <w:r>
               <w:rPr>
                 <w:rStyle w:val="Hipervnculo"/>
                 <w:noProof/>
               </w:rPr>
-              <w:t>Pregunta 29: ¿Qué es la disnea?</w:t>
+              <w:t>Pregunta 30: ¿Qué es la disnea?</w:t>
             </w:r>
             <w:r>
               <w:rPr>
@@ -2173,7 +2246,7 @@
                 <w:noProof/>
                 <w:webHidden/>
               </w:rPr>
-              <w:instrText xml:space="preserve"> PAGEREF _Toc231500568 \h </w:instrText>
+              <w:instrText xml:space="preserve"> PAGEREF _Toc233126389 \h </w:instrText>
             </w:r>
             <w:r>
               <w:rPr>
@@ -2193,7 +2266,7 @@
                 <w:noProof/>
                 <w:webHidden/>
               </w:rPr>
-              <w:t>16</w:t>
+              <w:t>18</w:t>
             </w:r>
             <w:r>
               <w:rPr>
@@ -2211,16 +2284,18 @@
               <w:tab w:val="right" w:leader="dot" w:pos="8494"/>
             </w:tabs>
             <w:rPr>
+              <w:rFonts w:eastAsiaTheme="minorEastAsia"/>
               <w:noProof/>
+              <w:lang w:eastAsia="es-ES"/>
             </w:rPr>
           </w:pPr>
-          <w:hyperlink w:anchor="_Toc231500569" w:history="1">
+          <w:hyperlink w:anchor="_Toc233126390" w:history="1">
             <w:r>
               <w:rPr>
                 <w:rStyle w:val="Hipervnculo"/>
                 <w:noProof/>
               </w:rPr>
-              <w:t>Pregunta 30: ¿Qué es la proteinuria?</w:t>
+              <w:t>Pregunta 31: ¿Qué es la proteinuria?</w:t>
             </w:r>
             <w:r>
               <w:rPr>
@@ -2241,7 +2316,7 @@
                 <w:noProof/>
                 <w:webHidden/>
               </w:rPr>
-              <w:instrText xml:space="preserve"> PAGEREF _Toc231500569 \h </w:instrText>
+              <w:instrText xml:space="preserve"> PAGEREF _Toc233126390 \h </w:instrText>
             </w:r>
             <w:r>
               <w:rPr>
@@ -2261,7 +2336,7 @@
                 <w:noProof/>
                 <w:webHidden/>
               </w:rPr>
-              <w:t>16</w:t>
+              <w:t>18</w:t>
             </w:r>
             <w:r>
               <w:rPr>
@@ -2301,7 +2376,7 @@
       <w:pPr>
         <w:pStyle w:val="Resalte"/>
       </w:pPr>
-      <w:bookmarkStart w:id="1" w:name="_Toc231500539"/>
+      <w:bookmarkStart w:id="1" w:name="_Toc233126360"/>
       <w:r>
         <w:lastRenderedPageBreak/>
         <w:t>Pregunta 1: ¿Qué es la astenia?</w:t>
@@ -2392,7 +2467,7 @@
       <w:pPr>
         <w:pStyle w:val="Resalte"/>
       </w:pPr>
-      <w:bookmarkStart w:id="2" w:name="_Toc231500540"/>
+      <w:bookmarkStart w:id="2" w:name="_Toc233126361"/>
       <w:r>
         <w:t>Pregunta 2: ¿Qué debe hacer un paciente si tiene una temperatura de 38º o más?</w:t>
       </w:r>
@@ -2448,7 +2523,23 @@
           </w:tcPr>
           <w:p>
             <w:r>
-              <w:t>Si fiebre de más de 38º C, hay que tomar un antipirético (paracetamol, ibuprofeno, metamizol… ) si tras 6-8 horas vuelve a subir la fi ebre, hay que acudir a urgencias para realizar las pruebas pertinentes.</w:t>
+              <w:t>Si fiebre de más de 38º C, hay que tomar un antipirético (paracetamol, ibuprofeno, metamizol</w:t>
+            </w:r>
+            <w:proofErr w:type="gramStart"/>
+            <w:r>
+              <w:t>… )</w:t>
+            </w:r>
+            <w:proofErr w:type="gramEnd"/>
+            <w:r>
+              <w:t xml:space="preserve"> si tras 6-8 horas vuelve a subir la fi </w:t>
+            </w:r>
+            <w:proofErr w:type="spellStart"/>
+            <w:r>
+              <w:t>ebre</w:t>
+            </w:r>
+            <w:proofErr w:type="spellEnd"/>
+            <w:r>
+              <w:t>, hay que acudir a urgencias para realizar las pruebas pertinentes.</w:t>
             </w:r>
           </w:p>
         </w:tc>
@@ -2557,7 +2648,7 @@
       <w:pPr>
         <w:pStyle w:val="Resalte"/>
       </w:pPr>
-      <w:bookmarkStart w:id="3" w:name="_Toc231500541"/>
+      <w:bookmarkStart w:id="3" w:name="_Toc233126362"/>
       <w:r>
         <w:t xml:space="preserve">Pregunta 3: </w:t>
       </w:r>
@@ -2651,7 +2742,7 @@
       <w:pPr>
         <w:pStyle w:val="Resalte"/>
       </w:pPr>
-      <w:bookmarkStart w:id="4" w:name="_Toc231500542"/>
+      <w:bookmarkStart w:id="4" w:name="_Toc233126363"/>
       <w:r>
         <w:t>Pregunta 4: ¿Cómo se define la mucositis?</w:t>
       </w:r>
@@ -2750,7 +2841,7 @@
       <w:pPr>
         <w:pStyle w:val="Resalte"/>
       </w:pPr>
-      <w:bookmarkStart w:id="5" w:name="_Toc231500543"/>
+      <w:bookmarkStart w:id="5" w:name="_Toc233126364"/>
       <w:r>
         <w:t xml:space="preserve">Pregunta </w:t>
       </w:r>
@@ -2849,7 +2940,7 @@
       <w:pPr>
         <w:pStyle w:val="Resalte"/>
       </w:pPr>
-      <w:bookmarkStart w:id="6" w:name="_Toc231500544"/>
+      <w:bookmarkStart w:id="6" w:name="_Toc233126365"/>
       <w:r>
         <w:t xml:space="preserve">Pregunta </w:t>
       </w:r>
@@ -2945,7 +3036,7 @@
       <w:pPr>
         <w:pStyle w:val="Resalte"/>
       </w:pPr>
-      <w:bookmarkStart w:id="7" w:name="_Toc231500545"/>
+      <w:bookmarkStart w:id="7" w:name="_Toc233126366"/>
       <w:r>
         <w:t>Pregunta 7: ¿Siempre se cae el cabello con los tratamientos de quimioterapia?</w:t>
       </w:r>
@@ -3067,7 +3158,7 @@
       <w:pPr>
         <w:pStyle w:val="Resalte"/>
       </w:pPr>
-      <w:bookmarkStart w:id="8" w:name="_Toc231500546"/>
+      <w:bookmarkStart w:id="8" w:name="_Toc233126367"/>
       <w:r>
         <w:t xml:space="preserve">Pregunta </w:t>
       </w:r>
@@ -3164,7 +3255,23 @@
           </w:tcPr>
           <w:p>
             <w:r>
-              <w:t>La caída del cabello suele comenzar a las 2-3 semanas del tratamiento y co mienza a recuperarse a partir de los 3-6 meses del cese de la quimioterapia. En ocasiones el nuevo cabello es de características diferentes.</w:t>
+              <w:t xml:space="preserve">La caída del cabello suele comenzar a las 2-3 semanas del tratamiento y </w:t>
+            </w:r>
+            <w:proofErr w:type="spellStart"/>
+            <w:r>
+              <w:t>co</w:t>
+            </w:r>
+            <w:proofErr w:type="spellEnd"/>
+            <w:r>
+              <w:t xml:space="preserve"> </w:t>
+            </w:r>
+            <w:proofErr w:type="spellStart"/>
+            <w:r>
+              <w:t>mienza</w:t>
+            </w:r>
+            <w:proofErr w:type="spellEnd"/>
+            <w:r>
+              <w:t xml:space="preserve"> a recuperarse a partir de los 3-6 meses del cese de la quimioterapia. En ocasiones el nuevo cabello es de características diferentes.</w:t>
             </w:r>
           </w:p>
         </w:tc>
@@ -3198,16 +3305,29 @@
       <w:pPr>
         <w:pStyle w:val="Resalte"/>
       </w:pPr>
-      <w:bookmarkStart w:id="9" w:name="_Toc231500547"/>
+      <w:bookmarkStart w:id="9" w:name="_Toc233126368"/>
       <w:r>
         <w:lastRenderedPageBreak/>
         <w:t>Pregunta 9: ¿Qué medicamento de quimioterapia se asocia a la TDA en el</w:t>
       </w:r>
       <w:r>
-        <w:t xml:space="preserve"> cáncer de próstata hormono-sensible meastásica</w:t>
+        <w:t xml:space="preserve"> cáncer de próstata hormono-sensible </w:t>
       </w:r>
+      <w:proofErr w:type="spellStart"/>
       <w:r>
-        <w:t xml:space="preserve"> CPHSm?</w:t>
+        <w:t>meastásica</w:t>
+      </w:r>
+      <w:proofErr w:type="spellEnd"/>
+      <w:r>
+        <w:t xml:space="preserve"> </w:t>
+      </w:r>
+      <w:proofErr w:type="spellStart"/>
+      <w:r>
+        <w:t>CPHSm</w:t>
+      </w:r>
+      <w:proofErr w:type="spellEnd"/>
+      <w:r>
+        <w:t>?</w:t>
       </w:r>
       <w:bookmarkEnd w:id="9"/>
     </w:p>
@@ -3260,8 +3380,21 @@
             <w:tcW w:w="4520" w:type="dxa"/>
           </w:tcPr>
           <w:p>
-            <w:r>
-              <w:t>Docetaxel es el único tratamiento de quimioterapia que se utiliza asociado a la TDA en el CPHSm.</w:t>
+            <w:proofErr w:type="spellStart"/>
+            <w:r>
+              <w:t>Docetaxel</w:t>
+            </w:r>
+            <w:proofErr w:type="spellEnd"/>
+            <w:r>
+              <w:t xml:space="preserve"> es el único tratamiento de quimioterapia que se utiliza asociado a la TDA en el </w:t>
+            </w:r>
+            <w:proofErr w:type="spellStart"/>
+            <w:r>
+              <w:t>CPHSm</w:t>
+            </w:r>
+            <w:proofErr w:type="spellEnd"/>
+            <w:r>
+              <w:t>.</w:t>
             </w:r>
             <w:r>
               <w:t xml:space="preserve"> </w:t>
@@ -3298,7 +3431,7 @@
       <w:pPr>
         <w:pStyle w:val="Resalte"/>
       </w:pPr>
-      <w:bookmarkStart w:id="10" w:name="_Toc231500548"/>
+      <w:bookmarkStart w:id="10" w:name="_Toc233126369"/>
       <w:r>
         <w:t>Pregunta</w:t>
       </w:r>
@@ -3457,7 +3590,23 @@
           </w:tcPr>
           <w:p>
             <w:r>
-              <w:t>Denosumab (Xgeva®, Prolia®) [...] puede ayudar a prevenir o retrasar algunos problemas, como las fracturas</w:t>
+              <w:t>Denosumab (</w:t>
+            </w:r>
+            <w:proofErr w:type="spellStart"/>
+            <w:r>
+              <w:t>Xgeva</w:t>
+            </w:r>
+            <w:proofErr w:type="spellEnd"/>
+            <w:r>
+              <w:t xml:space="preserve">®, </w:t>
+            </w:r>
+            <w:proofErr w:type="spellStart"/>
+            <w:r>
+              <w:t>Prolia</w:t>
+            </w:r>
+            <w:proofErr w:type="spellEnd"/>
+            <w:r>
+              <w:t>®) [...] puede ayudar a prevenir o retrasar algunos problemas, como las fracturas</w:t>
             </w:r>
             <w:r>
               <w:t xml:space="preserve">. </w:t>
@@ -3533,13 +3682,15 @@
       <w:pPr>
         <w:pStyle w:val="Resalte"/>
       </w:pPr>
-      <w:bookmarkStart w:id="11" w:name="_Toc231500549"/>
+      <w:bookmarkStart w:id="11" w:name="_Toc233126370"/>
       <w:r>
         <w:t xml:space="preserve">Pregunta 11: ¿Cuál es el principal efecto adverso de la </w:t>
       </w:r>
+      <w:proofErr w:type="spellStart"/>
       <w:r>
         <w:t>Apalutamida</w:t>
       </w:r>
+      <w:proofErr w:type="spellEnd"/>
       <w:r>
         <w:t>?</w:t>
       </w:r>
@@ -3595,7 +3746,23 @@
           </w:tcPr>
           <w:p>
             <w:r>
-              <w:t>El principal efecto adverso de Apalutamida es la aparición de un rash o exantema en la piel además de leve cansancio.</w:t>
+              <w:t xml:space="preserve">El principal efecto adverso de </w:t>
+            </w:r>
+            <w:proofErr w:type="spellStart"/>
+            <w:r>
+              <w:t>Apalutamida</w:t>
+            </w:r>
+            <w:proofErr w:type="spellEnd"/>
+            <w:r>
+              <w:t xml:space="preserve"> es la aparición de un </w:t>
+            </w:r>
+            <w:proofErr w:type="spellStart"/>
+            <w:r>
+              <w:t>rash</w:t>
+            </w:r>
+            <w:proofErr w:type="spellEnd"/>
+            <w:r>
+              <w:t xml:space="preserve"> o exantema en la piel además de leve cansancio.</w:t>
             </w:r>
           </w:p>
         </w:tc>
@@ -3712,7 +3879,7 @@
       <w:pPr>
         <w:pStyle w:val="Resalte"/>
       </w:pPr>
-      <w:bookmarkStart w:id="12" w:name="_Toc231500550"/>
+      <w:bookmarkStart w:id="12" w:name="_Toc233126371"/>
       <w:r>
         <w:lastRenderedPageBreak/>
         <w:t>Pregunta 12: ¿cómo suele tratarse el cáncer de próstata resistente a la castración no metastásico?</w:t>
@@ -3769,7 +3936,23 @@
           </w:tcPr>
           <w:p>
             <w:r>
-              <w:t>El cáncer de próstata no metastásico que sigue creciendo a pesar del tratamiento con terapia de privación de andrógenos (cáncer de próstata resistente a la castración [CPRC]) suele tratarse con los medicamentos antiandrógenos apalutamida, darolutamida o enzalutamida.</w:t>
+              <w:t xml:space="preserve">El cáncer de próstata no metastásico que sigue creciendo a pesar del tratamiento con terapia de privación de andrógenos (cáncer de próstata resistente a la castración [CPRC]) suele tratarse con los medicamentos antiandrógenos </w:t>
+            </w:r>
+            <w:proofErr w:type="spellStart"/>
+            <w:r>
+              <w:t>apalutamida</w:t>
+            </w:r>
+            <w:proofErr w:type="spellEnd"/>
+            <w:r>
+              <w:t xml:space="preserve">, </w:t>
+            </w:r>
+            <w:proofErr w:type="spellStart"/>
+            <w:r>
+              <w:t>darolutamida</w:t>
+            </w:r>
+            <w:proofErr w:type="spellEnd"/>
+            <w:r>
+              <w:t xml:space="preserve"> o enzalutamida.</w:t>
             </w:r>
           </w:p>
         </w:tc>
@@ -3800,7 +3983,7 @@
       <w:pPr>
         <w:pStyle w:val="Resalte"/>
       </w:pPr>
-      <w:bookmarkStart w:id="13" w:name="_Toc231500551"/>
+      <w:bookmarkStart w:id="13" w:name="_Toc233126372"/>
       <w:r>
         <w:t xml:space="preserve">Pregunta 13: ¿qué </w:t>
       </w:r>
@@ -4089,7 +4272,7 @@
       <w:pPr>
         <w:pStyle w:val="Resalte"/>
       </w:pPr>
-      <w:bookmarkStart w:id="14" w:name="_Toc231500552"/>
+      <w:bookmarkStart w:id="14" w:name="_Toc233126373"/>
       <w:r>
         <w:t xml:space="preserve">Pregunta 14: </w:t>
       </w:r>
@@ -4155,7 +4338,15 @@
               <w:t xml:space="preserve"> </w:t>
             </w:r>
             <w:r>
-              <w:t>mejorar la supervivencia de pacientes con CPRCm y lesiones únicamente óseas.</w:t>
+              <w:t xml:space="preserve">mejorar la supervivencia de pacientes con </w:t>
+            </w:r>
+            <w:proofErr w:type="spellStart"/>
+            <w:r>
+              <w:t>CPRCm</w:t>
+            </w:r>
+            <w:proofErr w:type="spellEnd"/>
+            <w:r>
+              <w:t xml:space="preserve"> y lesiones únicamente óseas.</w:t>
             </w:r>
           </w:p>
         </w:tc>
@@ -4190,8 +4381,117 @@
           </w:tcPr>
           <w:p>
             <w:r>
-              <w:t>In mCRPC patients with symptomatic bone metasta ses and contraindication or progression to docetaxel, radium-223 may be considered</w:t>
-            </w:r>
+              <w:t xml:space="preserve">In </w:t>
+            </w:r>
+            <w:proofErr w:type="spellStart"/>
+            <w:r>
+              <w:t>mCRPC</w:t>
+            </w:r>
+            <w:proofErr w:type="spellEnd"/>
+            <w:r>
+              <w:t xml:space="preserve"> </w:t>
+            </w:r>
+            <w:proofErr w:type="spellStart"/>
+            <w:r>
+              <w:t>patients</w:t>
+            </w:r>
+            <w:proofErr w:type="spellEnd"/>
+            <w:r>
+              <w:t xml:space="preserve"> </w:t>
+            </w:r>
+            <w:proofErr w:type="spellStart"/>
+            <w:r>
+              <w:t>with</w:t>
+            </w:r>
+            <w:proofErr w:type="spellEnd"/>
+            <w:r>
+              <w:t xml:space="preserve"> </w:t>
+            </w:r>
+            <w:proofErr w:type="spellStart"/>
+            <w:r>
+              <w:t>symptomatic</w:t>
+            </w:r>
+            <w:proofErr w:type="spellEnd"/>
+            <w:r>
+              <w:t xml:space="preserve"> </w:t>
+            </w:r>
+            <w:proofErr w:type="spellStart"/>
+            <w:r>
+              <w:t>bone</w:t>
+            </w:r>
+            <w:proofErr w:type="spellEnd"/>
+            <w:r>
+              <w:t xml:space="preserve"> </w:t>
+            </w:r>
+            <w:proofErr w:type="spellStart"/>
+            <w:r>
+              <w:t>metasta</w:t>
+            </w:r>
+            <w:proofErr w:type="spellEnd"/>
+            <w:r>
+              <w:t xml:space="preserve"> </w:t>
+            </w:r>
+            <w:proofErr w:type="spellStart"/>
+            <w:r>
+              <w:t>ses</w:t>
+            </w:r>
+            <w:proofErr w:type="spellEnd"/>
+            <w:r>
+              <w:t xml:space="preserve"> and </w:t>
+            </w:r>
+            <w:proofErr w:type="spellStart"/>
+            <w:r>
+              <w:t>contraindication</w:t>
+            </w:r>
+            <w:proofErr w:type="spellEnd"/>
+            <w:r>
+              <w:t xml:space="preserve"> </w:t>
+            </w:r>
+            <w:proofErr w:type="spellStart"/>
+            <w:r>
+              <w:t>or</w:t>
+            </w:r>
+            <w:proofErr w:type="spellEnd"/>
+            <w:r>
+              <w:t xml:space="preserve"> </w:t>
+            </w:r>
+            <w:proofErr w:type="spellStart"/>
+            <w:r>
+              <w:t>progression</w:t>
+            </w:r>
+            <w:proofErr w:type="spellEnd"/>
+            <w:r>
+              <w:t xml:space="preserve"> </w:t>
+            </w:r>
+            <w:proofErr w:type="spellStart"/>
+            <w:r>
+              <w:t>to</w:t>
+            </w:r>
+            <w:proofErr w:type="spellEnd"/>
+            <w:r>
+              <w:t xml:space="preserve"> </w:t>
+            </w:r>
+            <w:proofErr w:type="spellStart"/>
+            <w:r>
+              <w:t>docetaxel</w:t>
+            </w:r>
+            <w:proofErr w:type="spellEnd"/>
+            <w:r>
+              <w:t xml:space="preserve">, radium-223 </w:t>
+            </w:r>
+            <w:proofErr w:type="spellStart"/>
+            <w:r>
+              <w:t>may</w:t>
+            </w:r>
+            <w:proofErr w:type="spellEnd"/>
+            <w:r>
+              <w:t xml:space="preserve"> be </w:t>
+            </w:r>
+            <w:proofErr w:type="spellStart"/>
+            <w:r>
+              <w:t>considered</w:t>
+            </w:r>
+            <w:proofErr w:type="spellEnd"/>
           </w:p>
         </w:tc>
         <w:tc>
@@ -4221,7 +4521,7 @@
       <w:pPr>
         <w:pStyle w:val="Resalte"/>
       </w:pPr>
-      <w:bookmarkStart w:id="15" w:name="_Toc231500553"/>
+      <w:bookmarkStart w:id="15" w:name="_Toc233126374"/>
       <w:r>
         <w:t xml:space="preserve">Pregunta 15: </w:t>
       </w:r>
@@ -4531,7 +4831,7 @@
       <w:pPr>
         <w:pStyle w:val="Resalte"/>
       </w:pPr>
-      <w:bookmarkStart w:id="16" w:name="_Toc231500554"/>
+      <w:bookmarkStart w:id="16" w:name="_Toc233126375"/>
       <w:r>
         <w:t xml:space="preserve">Pregunta 16: </w:t>
       </w:r>
@@ -4596,18 +4896,98 @@
           </w:tcPr>
           <w:p>
             <w:r>
-              <w:t>Mantener un estado nutritivo equilibrado ayuda, sin duda, a sobrellevar mejor la quimioterapia y tener mayor sensación de bienestar. Una dieta equilibrada incluye alimentos de todos los grupos (verduras, frutas, legum bres, pescados y carnes) en cantidades suficientes.</w:t>
-            </w:r>
-          </w:p>
-          <w:p>
-            <w:r>
-              <w:t>Algunas personas en quimio o radioterapia mantienen un estado nutri tivo adecuado, sin padecer efectos secundarios (diarrea, estreñimiento, náuseas, etc.) o experimentándolos en forma muy leve.</w:t>
+              <w:t xml:space="preserve">Mantener un estado nutritivo equilibrado ayuda, sin duda, a sobrellevar mejor la quimioterapia y tener mayor sensación de bienestar. Una dieta equilibrada incluye alimentos de todos los grupos (verduras, frutas, </w:t>
+            </w:r>
+            <w:proofErr w:type="spellStart"/>
+            <w:r>
+              <w:t>legum</w:t>
+            </w:r>
+            <w:proofErr w:type="spellEnd"/>
+            <w:r>
+              <w:t xml:space="preserve"> </w:t>
+            </w:r>
+            <w:proofErr w:type="spellStart"/>
+            <w:r>
+              <w:t>bres</w:t>
+            </w:r>
+            <w:proofErr w:type="spellEnd"/>
+            <w:r>
+              <w:t>, pescados y carnes) en cantidades suficientes.</w:t>
+            </w:r>
+          </w:p>
+          <w:p>
+            <w:r>
+              <w:t xml:space="preserve">Algunas personas en quimio o radioterapia mantienen un estado </w:t>
+            </w:r>
+            <w:proofErr w:type="spellStart"/>
+            <w:r>
+              <w:t>nutri</w:t>
+            </w:r>
+            <w:proofErr w:type="spellEnd"/>
+            <w:r>
+              <w:t xml:space="preserve"> </w:t>
+            </w:r>
+            <w:proofErr w:type="spellStart"/>
+            <w:r>
+              <w:t>tivo</w:t>
+            </w:r>
+            <w:proofErr w:type="spellEnd"/>
+            <w:r>
+              <w:t xml:space="preserve"> adecuado, sin padecer efectos secundarios (diarrea, estreñimiento, náuseas, etc.) o experimentándolos en forma muy leve.</w:t>
             </w:r>
           </w:p>
           <w:p>
             <w:r>
               <w:lastRenderedPageBreak/>
-              <w:t>Para prevenir los efectos secundarios digestivos de los tratamientos (náuseas, vómitos, etc.) es aconsejable comer una, dos o tres horas antes de la quimio o radioterapia. Para evitar o disminuir los efectos adversos de los tratamientos, se recomienda seguir una dieta baja en grasas, es decir, de fácil digestión, el día anterior a la quimioterapia, durante los días de tra tamiento y los dos o tres días posteriores, pasando progresivamente a la dieta habitual. En los casos de inapetencia o mala digestión, se puede fraccionar la dieta en unas seis tomas diarias (comidas frecuentes y de poco volu men) sin que sea necesario realizar las tradicionales tres comidas prin cipales.</w:t>
+              <w:t xml:space="preserve">Para prevenir los efectos secundarios digestivos de los tratamientos (náuseas, vómitos, etc.) es aconsejable comer una, dos o tres horas antes de la quimio o radioterapia. Para evitar o disminuir los efectos adversos de los tratamientos, se recomienda seguir una dieta baja en grasas, es decir, de fácil digestión, el día anterior a la quimioterapia, durante los días de </w:t>
+            </w:r>
+            <w:proofErr w:type="spellStart"/>
+            <w:r>
+              <w:t>tra</w:t>
+            </w:r>
+            <w:proofErr w:type="spellEnd"/>
+            <w:r>
+              <w:t xml:space="preserve"> </w:t>
+            </w:r>
+            <w:proofErr w:type="spellStart"/>
+            <w:r>
+              <w:t>tamiento</w:t>
+            </w:r>
+            <w:proofErr w:type="spellEnd"/>
+            <w:r>
+              <w:t xml:space="preserve"> y los dos o tres días posteriores, pasando progresivamente a la dieta habitual. En los casos de inapetencia o mala digestión, se puede fraccionar la dieta en unas seis tomas diarias (comidas frecuentes y de poco </w:t>
+            </w:r>
+            <w:proofErr w:type="spellStart"/>
+            <w:r>
+              <w:t>volu</w:t>
+            </w:r>
+            <w:proofErr w:type="spellEnd"/>
+            <w:r>
+              <w:t xml:space="preserve"> </w:t>
+            </w:r>
+            <w:proofErr w:type="spellStart"/>
+            <w:r>
+              <w:t>men</w:t>
+            </w:r>
+            <w:proofErr w:type="spellEnd"/>
+            <w:r>
+              <w:t xml:space="preserve">) sin que sea necesario realizar las tradicionales tres comidas </w:t>
+            </w:r>
+            <w:proofErr w:type="spellStart"/>
+            <w:r>
+              <w:t>prin</w:t>
+            </w:r>
+            <w:proofErr w:type="spellEnd"/>
+            <w:r>
+              <w:t xml:space="preserve"> </w:t>
+            </w:r>
+            <w:proofErr w:type="spellStart"/>
+            <w:r>
+              <w:t>cipales</w:t>
+            </w:r>
+            <w:proofErr w:type="spellEnd"/>
+            <w:r>
+              <w:t>.</w:t>
             </w:r>
           </w:p>
         </w:tc>
@@ -4642,12 +5022,20 @@
       <w:pPr>
         <w:pStyle w:val="Resalte"/>
       </w:pPr>
-      <w:bookmarkStart w:id="17" w:name="_Toc231500555"/>
+      <w:bookmarkStart w:id="17" w:name="_Toc233126376"/>
       <w:r>
         <w:t xml:space="preserve">Pregunta 17: </w:t>
       </w:r>
       <w:r>
-        <w:t>¿Qué síntoma se denomina "tinnitus"?</w:t>
+        <w:t>¿Qué síntoma se denomina "</w:t>
+      </w:r>
+      <w:proofErr w:type="spellStart"/>
+      <w:r>
+        <w:t>tinnitus</w:t>
+      </w:r>
+      <w:proofErr w:type="spellEnd"/>
+      <w:r>
+        <w:t>"?</w:t>
       </w:r>
       <w:bookmarkEnd w:id="17"/>
     </w:p>
@@ -4732,13 +5120,29 @@
       <w:pPr>
         <w:pStyle w:val="Resalte"/>
       </w:pPr>
-      <w:bookmarkStart w:id="18" w:name="_Toc231500556"/>
+      <w:bookmarkStart w:id="18" w:name="_Toc233126377"/>
       <w:r>
         <w:t xml:space="preserve">Pregunta 18: </w:t>
       </w:r>
       <w:r>
         <w:tab/>
-        <w:t>¿Para qué sirve el test PAM50 (Prosigna)?</w:t>
+        <w:t xml:space="preserve">¿Para qué sirve </w:t>
+      </w:r>
+      <w:proofErr w:type="gramStart"/>
+      <w:r>
+        <w:t>el test</w:t>
+      </w:r>
+      <w:proofErr w:type="gramEnd"/>
+      <w:r>
+        <w:t xml:space="preserve"> PAM50 (</w:t>
+      </w:r>
+      <w:proofErr w:type="spellStart"/>
+      <w:r>
+        <w:t>Prosigna</w:t>
+      </w:r>
+      <w:proofErr w:type="spellEnd"/>
+      <w:r>
+        <w:t>)?</w:t>
       </w:r>
       <w:bookmarkEnd w:id="18"/>
     </w:p>
@@ -4792,13 +5196,212 @@
           </w:tcPr>
           <w:p>
             <w:r>
-              <w:t>The 50-gene assay (PAM-50) risk of recurrence (ROR) score stratifies patients with HR-positive disease into high-, medium-, and low-risk groups. Several studies have shown the prognostic</w:t>
-            </w:r>
-          </w:p>
-          <w:p>
-            <w:r>
-              <w:t>Value of ROR score in estimating risk of disease recurrence</w:t>
-            </w:r>
+              <w:t xml:space="preserve">The 50-gene </w:t>
+            </w:r>
+            <w:proofErr w:type="spellStart"/>
+            <w:r>
+              <w:t>assay</w:t>
+            </w:r>
+            <w:proofErr w:type="spellEnd"/>
+            <w:r>
+              <w:t xml:space="preserve"> (PAM-50) </w:t>
+            </w:r>
+            <w:proofErr w:type="spellStart"/>
+            <w:r>
+              <w:t>risk</w:t>
+            </w:r>
+            <w:proofErr w:type="spellEnd"/>
+            <w:r>
+              <w:t xml:space="preserve"> </w:t>
+            </w:r>
+            <w:proofErr w:type="spellStart"/>
+            <w:r>
+              <w:t>of</w:t>
+            </w:r>
+            <w:proofErr w:type="spellEnd"/>
+            <w:r>
+              <w:t xml:space="preserve"> </w:t>
+            </w:r>
+            <w:proofErr w:type="spellStart"/>
+            <w:r>
+              <w:t>recurrence</w:t>
+            </w:r>
+            <w:proofErr w:type="spellEnd"/>
+            <w:r>
+              <w:t xml:space="preserve"> (ROR) score </w:t>
+            </w:r>
+            <w:proofErr w:type="spellStart"/>
+            <w:r>
+              <w:t>stratifies</w:t>
+            </w:r>
+            <w:proofErr w:type="spellEnd"/>
+            <w:r>
+              <w:t xml:space="preserve"> </w:t>
+            </w:r>
+            <w:proofErr w:type="spellStart"/>
+            <w:r>
+              <w:t>patients</w:t>
+            </w:r>
+            <w:proofErr w:type="spellEnd"/>
+            <w:r>
+              <w:t xml:space="preserve"> </w:t>
+            </w:r>
+            <w:proofErr w:type="spellStart"/>
+            <w:r>
+              <w:t>with</w:t>
+            </w:r>
+            <w:proofErr w:type="spellEnd"/>
+            <w:r>
+              <w:t xml:space="preserve"> HR-positive </w:t>
+            </w:r>
+            <w:proofErr w:type="spellStart"/>
+            <w:r>
+              <w:t>disease</w:t>
+            </w:r>
+            <w:proofErr w:type="spellEnd"/>
+            <w:r>
+              <w:t xml:space="preserve"> </w:t>
+            </w:r>
+            <w:proofErr w:type="spellStart"/>
+            <w:r>
+              <w:t>into</w:t>
+            </w:r>
+            <w:proofErr w:type="spellEnd"/>
+            <w:r>
+              <w:t xml:space="preserve"> </w:t>
+            </w:r>
+            <w:proofErr w:type="spellStart"/>
+            <w:r>
+              <w:t>high</w:t>
+            </w:r>
+            <w:proofErr w:type="spellEnd"/>
+            <w:r>
+              <w:t xml:space="preserve">-, </w:t>
+            </w:r>
+            <w:proofErr w:type="spellStart"/>
+            <w:r>
+              <w:t>medium</w:t>
+            </w:r>
+            <w:proofErr w:type="spellEnd"/>
+            <w:r>
+              <w:t xml:space="preserve">-, and </w:t>
+            </w:r>
+            <w:proofErr w:type="spellStart"/>
+            <w:r>
+              <w:t>low-risk</w:t>
+            </w:r>
+            <w:proofErr w:type="spellEnd"/>
+            <w:r>
+              <w:t xml:space="preserve"> </w:t>
+            </w:r>
+            <w:proofErr w:type="spellStart"/>
+            <w:r>
+              <w:t>groups</w:t>
+            </w:r>
+            <w:proofErr w:type="spellEnd"/>
+            <w:r>
+              <w:t xml:space="preserve">. </w:t>
+            </w:r>
+            <w:proofErr w:type="spellStart"/>
+            <w:r>
+              <w:t>Several</w:t>
+            </w:r>
+            <w:proofErr w:type="spellEnd"/>
+            <w:r>
+              <w:t xml:space="preserve"> </w:t>
+            </w:r>
+            <w:proofErr w:type="spellStart"/>
+            <w:r>
+              <w:t>studies</w:t>
+            </w:r>
+            <w:proofErr w:type="spellEnd"/>
+            <w:r>
+              <w:t xml:space="preserve"> </w:t>
+            </w:r>
+            <w:proofErr w:type="spellStart"/>
+            <w:r>
+              <w:t>have</w:t>
+            </w:r>
+            <w:proofErr w:type="spellEnd"/>
+            <w:r>
+              <w:t xml:space="preserve"> </w:t>
+            </w:r>
+            <w:proofErr w:type="spellStart"/>
+            <w:r>
+              <w:t>shown</w:t>
+            </w:r>
+            <w:proofErr w:type="spellEnd"/>
+            <w:r>
+              <w:t xml:space="preserve"> </w:t>
+            </w:r>
+            <w:proofErr w:type="spellStart"/>
+            <w:r>
+              <w:t>the</w:t>
+            </w:r>
+            <w:proofErr w:type="spellEnd"/>
+            <w:r>
+              <w:t xml:space="preserve"> </w:t>
+            </w:r>
+            <w:proofErr w:type="spellStart"/>
+            <w:r>
+              <w:t>prognostic</w:t>
+            </w:r>
+            <w:proofErr w:type="spellEnd"/>
+          </w:p>
+          <w:p>
+            <w:proofErr w:type="spellStart"/>
+            <w:r>
+              <w:t>Value</w:t>
+            </w:r>
+            <w:proofErr w:type="spellEnd"/>
+            <w:r>
+              <w:t xml:space="preserve"> </w:t>
+            </w:r>
+            <w:proofErr w:type="spellStart"/>
+            <w:r>
+              <w:t>of</w:t>
+            </w:r>
+            <w:proofErr w:type="spellEnd"/>
+            <w:r>
+              <w:t xml:space="preserve"> ROR score in </w:t>
+            </w:r>
+            <w:proofErr w:type="spellStart"/>
+            <w:r>
+              <w:t>estimating</w:t>
+            </w:r>
+            <w:proofErr w:type="spellEnd"/>
+            <w:r>
+              <w:t xml:space="preserve"> </w:t>
+            </w:r>
+            <w:proofErr w:type="spellStart"/>
+            <w:r>
+              <w:t>risk</w:t>
+            </w:r>
+            <w:proofErr w:type="spellEnd"/>
+            <w:r>
+              <w:t xml:space="preserve"> </w:t>
+            </w:r>
+            <w:proofErr w:type="spellStart"/>
+            <w:r>
+              <w:t>of</w:t>
+            </w:r>
+            <w:proofErr w:type="spellEnd"/>
+            <w:r>
+              <w:t xml:space="preserve"> </w:t>
+            </w:r>
+            <w:proofErr w:type="spellStart"/>
+            <w:r>
+              <w:t>disease</w:t>
+            </w:r>
+            <w:proofErr w:type="spellEnd"/>
+            <w:r>
+              <w:t xml:space="preserve"> </w:t>
+            </w:r>
+            <w:proofErr w:type="spellStart"/>
+            <w:r>
+              <w:t>recurrence</w:t>
+            </w:r>
+            <w:proofErr w:type="spellEnd"/>
           </w:p>
         </w:tc>
         <w:tc>
@@ -4833,12 +5436,198 @@
             <w:tcW w:w="4542" w:type="dxa"/>
           </w:tcPr>
           <w:p>
-            <w:r>
-              <w:t xml:space="preserve">Different genetic signatures have been evaluated in core needle biopsy before neoadjuvant therapy, as good pre dictors of response to neoadjuvant therapy, especially PAM50 ROR score, although this </w:t>
-            </w:r>
+            <w:proofErr w:type="spellStart"/>
+            <w:r>
+              <w:t>Different</w:t>
+            </w:r>
+            <w:proofErr w:type="spellEnd"/>
+            <w:r>
+              <w:t xml:space="preserve"> </w:t>
+            </w:r>
+            <w:proofErr w:type="spellStart"/>
+            <w:r>
+              <w:t>genetic</w:t>
+            </w:r>
+            <w:proofErr w:type="spellEnd"/>
+            <w:r>
+              <w:t xml:space="preserve"> </w:t>
+            </w:r>
+            <w:proofErr w:type="spellStart"/>
+            <w:r>
+              <w:t>signatures</w:t>
+            </w:r>
+            <w:proofErr w:type="spellEnd"/>
+            <w:r>
+              <w:t xml:space="preserve"> </w:t>
+            </w:r>
+            <w:proofErr w:type="spellStart"/>
+            <w:r>
+              <w:t>have</w:t>
+            </w:r>
+            <w:proofErr w:type="spellEnd"/>
+            <w:r>
+              <w:t xml:space="preserve"> </w:t>
+            </w:r>
+            <w:proofErr w:type="spellStart"/>
+            <w:r>
+              <w:t>been</w:t>
+            </w:r>
+            <w:proofErr w:type="spellEnd"/>
+            <w:r>
+              <w:t xml:space="preserve"> </w:t>
+            </w:r>
+            <w:proofErr w:type="spellStart"/>
+            <w:r>
+              <w:t>evaluated</w:t>
+            </w:r>
+            <w:proofErr w:type="spellEnd"/>
+            <w:r>
+              <w:t xml:space="preserve"> in core </w:t>
+            </w:r>
+            <w:proofErr w:type="spellStart"/>
+            <w:r>
+              <w:t>needle</w:t>
+            </w:r>
+            <w:proofErr w:type="spellEnd"/>
+            <w:r>
+              <w:t xml:space="preserve"> </w:t>
+            </w:r>
+            <w:proofErr w:type="spellStart"/>
+            <w:r>
+              <w:t>biopsy</w:t>
+            </w:r>
+            <w:proofErr w:type="spellEnd"/>
+            <w:r>
+              <w:t xml:space="preserve"> </w:t>
+            </w:r>
+            <w:proofErr w:type="spellStart"/>
+            <w:r>
+              <w:t>before</w:t>
+            </w:r>
+            <w:proofErr w:type="spellEnd"/>
+            <w:r>
+              <w:t xml:space="preserve"> </w:t>
+            </w:r>
+            <w:proofErr w:type="spellStart"/>
+            <w:r>
+              <w:t>neoadjuvant</w:t>
+            </w:r>
+            <w:proofErr w:type="spellEnd"/>
+            <w:r>
+              <w:t xml:space="preserve"> </w:t>
+            </w:r>
+            <w:proofErr w:type="spellStart"/>
+            <w:r>
+              <w:t>therapy</w:t>
+            </w:r>
+            <w:proofErr w:type="spellEnd"/>
+            <w:r>
+              <w:t xml:space="preserve">, as </w:t>
+            </w:r>
+            <w:proofErr w:type="spellStart"/>
+            <w:r>
+              <w:t>good</w:t>
+            </w:r>
+            <w:proofErr w:type="spellEnd"/>
+            <w:r>
+              <w:t xml:space="preserve"> pre </w:t>
+            </w:r>
+            <w:proofErr w:type="spellStart"/>
+            <w:r>
+              <w:t>dictors</w:t>
+            </w:r>
+            <w:proofErr w:type="spellEnd"/>
+            <w:r>
+              <w:t xml:space="preserve"> </w:t>
+            </w:r>
+            <w:proofErr w:type="spellStart"/>
+            <w:r>
+              <w:t>of</w:t>
+            </w:r>
+            <w:proofErr w:type="spellEnd"/>
+            <w:r>
+              <w:t xml:space="preserve"> response </w:t>
+            </w:r>
+            <w:proofErr w:type="spellStart"/>
+            <w:r>
+              <w:t>to</w:t>
+            </w:r>
+            <w:proofErr w:type="spellEnd"/>
+            <w:r>
+              <w:t xml:space="preserve"> </w:t>
+            </w:r>
+            <w:proofErr w:type="spellStart"/>
+            <w:r>
+              <w:t>neoadjuvant</w:t>
+            </w:r>
+            <w:proofErr w:type="spellEnd"/>
+            <w:r>
+              <w:t xml:space="preserve"> </w:t>
+            </w:r>
+            <w:proofErr w:type="spellStart"/>
+            <w:r>
+              <w:t>therapy</w:t>
+            </w:r>
+            <w:proofErr w:type="spellEnd"/>
+            <w:r>
+              <w:t xml:space="preserve">, </w:t>
+            </w:r>
+            <w:proofErr w:type="spellStart"/>
+            <w:r>
+              <w:t>especially</w:t>
+            </w:r>
+            <w:proofErr w:type="spellEnd"/>
+            <w:r>
+              <w:t xml:space="preserve"> PAM50 ROR score, </w:t>
+            </w:r>
+            <w:proofErr w:type="spellStart"/>
+            <w:r>
+              <w:t>although</w:t>
+            </w:r>
+            <w:proofErr w:type="spellEnd"/>
+            <w:r>
+              <w:t xml:space="preserve"> </w:t>
+            </w:r>
+            <w:proofErr w:type="spellStart"/>
+            <w:r>
+              <w:t>this</w:t>
+            </w:r>
+            <w:proofErr w:type="spellEnd"/>
+            <w:r>
+              <w:t xml:space="preserve"> </w:t>
+            </w:r>
+            <w:proofErr w:type="spellStart"/>
             <w:r>
               <w:lastRenderedPageBreak/>
-              <w:t>approach is currently considered experimental</w:t>
+              <w:t>approach</w:t>
+            </w:r>
+            <w:proofErr w:type="spellEnd"/>
+            <w:r>
+              <w:t xml:space="preserve"> </w:t>
+            </w:r>
+            <w:proofErr w:type="spellStart"/>
+            <w:r>
+              <w:t>is</w:t>
+            </w:r>
+            <w:proofErr w:type="spellEnd"/>
+            <w:r>
+              <w:t xml:space="preserve"> </w:t>
+            </w:r>
+            <w:proofErr w:type="spellStart"/>
+            <w:r>
+              <w:t>currently</w:t>
+            </w:r>
+            <w:proofErr w:type="spellEnd"/>
+            <w:r>
+              <w:t xml:space="preserve"> </w:t>
+            </w:r>
+            <w:proofErr w:type="spellStart"/>
+            <w:r>
+              <w:t>considered</w:t>
+            </w:r>
+            <w:proofErr w:type="spellEnd"/>
+            <w:r>
+              <w:t xml:space="preserve"> experimental</w:t>
             </w:r>
           </w:p>
         </w:tc>
@@ -4870,8 +5659,13 @@
             <w:tcW w:w="4542" w:type="dxa"/>
           </w:tcPr>
           <w:p>
-            <w:r>
-              <w:t>este test mide la expresión de 50 genes específicamente seleccionados, sobre material incluido en parafina y fijado en formol. Identifica subtipos intrínsecos de tumor y ofrece información pronóstica individualizada, determinando un Riesgo de Recurrencia (ROR) a 10 años, lo cual permite identificar pacientes con enfermedad luminal que no necesitan poliquimioterapia adyuvante (dado su bajo riesgo de recidiva a 10 años sin ella) y también pacientes con enfermedad luminal que no necesitan terapia endocrina más allá de 5 años (dado su bajo riesgo de recidiva tardía).</w:t>
+            <w:proofErr w:type="gramStart"/>
+            <w:r>
+              <w:t>este test</w:t>
+            </w:r>
+            <w:proofErr w:type="gramEnd"/>
+            <w:r>
+              <w:t xml:space="preserve"> mide la expresión de 50 genes específicamente seleccionados, sobre material incluido en parafina y fijado en formol. Identifica subtipos intrínsecos de tumor y ofrece información pronóstica individualizada, determinando un Riesgo de Recurrencia (ROR) a 10 años, lo cual permite identificar pacientes con enfermedad luminal que no necesitan poliquimioterapia adyuvante (dado su bajo riesgo de recidiva a 10 años sin ella) y también pacientes con enfermedad luminal que no necesitan terapia endocrina más allá de 5 años (dado su bajo riesgo de recidiva tardía).</w:t>
             </w:r>
           </w:p>
         </w:tc>
@@ -4909,7 +5703,7 @@
       <w:pPr>
         <w:pStyle w:val="Resalte"/>
       </w:pPr>
-      <w:bookmarkStart w:id="19" w:name="_Toc231500557"/>
+      <w:bookmarkStart w:id="19" w:name="_Toc233126378"/>
       <w:r>
         <w:t xml:space="preserve">Pregunta 19: ¿Cuáles son los efectos secundarios del </w:t>
       </w:r>
@@ -4971,7 +5765,15 @@
           </w:tcPr>
           <w:p>
             <w:r>
-              <w:t>Trombosis venosa profunda (TVP) o tromboembolismo pulmonar puede ser un efecto secundario de tamoxifeno y con menor frecuencia de Ios inhibidores de la aromatasa.</w:t>
+              <w:t xml:space="preserve">Trombosis venosa profunda (TVP) o tromboembolismo pulmonar puede ser un efecto secundario de tamoxifeno y con menor frecuencia de </w:t>
+            </w:r>
+            <w:proofErr w:type="spellStart"/>
+            <w:r>
+              <w:t>Ios</w:t>
+            </w:r>
+            <w:proofErr w:type="spellEnd"/>
+            <w:r>
+              <w:t xml:space="preserve"> inhibidores de la aromatasa.</w:t>
             </w:r>
           </w:p>
           <w:p>
@@ -5174,7 +5976,7 @@
       <w:pPr>
         <w:pStyle w:val="Resalte"/>
       </w:pPr>
-      <w:bookmarkStart w:id="20" w:name="_Toc231500558"/>
+      <w:bookmarkStart w:id="20" w:name="_Toc233126379"/>
       <w:r>
         <w:t>Pregunta 20: ¿Qué recomendaciones específicas hay para pacientes tratadas con tamoxifeno?</w:t>
       </w:r>
@@ -5436,8 +6238,69 @@
             <w:tcW w:w="3515" w:type="dxa"/>
           </w:tcPr>
           <w:p>
-            <w:r>
-              <w:t>Patients on tamoxifen treatment will require age-appropriate gynecological screening.</w:t>
+            <w:proofErr w:type="spellStart"/>
+            <w:r>
+              <w:t>Patients</w:t>
+            </w:r>
+            <w:proofErr w:type="spellEnd"/>
+            <w:r>
+              <w:t xml:space="preserve"> </w:t>
+            </w:r>
+            <w:proofErr w:type="spellStart"/>
+            <w:r>
+              <w:t>on</w:t>
+            </w:r>
+            <w:proofErr w:type="spellEnd"/>
+            <w:r>
+              <w:t xml:space="preserve"> </w:t>
+            </w:r>
+            <w:proofErr w:type="spellStart"/>
+            <w:r>
+              <w:t>tamoxifen</w:t>
+            </w:r>
+            <w:proofErr w:type="spellEnd"/>
+            <w:r>
+              <w:t xml:space="preserve"> </w:t>
+            </w:r>
+            <w:proofErr w:type="spellStart"/>
+            <w:r>
+              <w:t>treatment</w:t>
+            </w:r>
+            <w:proofErr w:type="spellEnd"/>
+            <w:r>
+              <w:t xml:space="preserve"> </w:t>
+            </w:r>
+            <w:proofErr w:type="spellStart"/>
+            <w:r>
+              <w:t>will</w:t>
+            </w:r>
+            <w:proofErr w:type="spellEnd"/>
+            <w:r>
+              <w:t xml:space="preserve"> </w:t>
+            </w:r>
+            <w:proofErr w:type="spellStart"/>
+            <w:r>
+              <w:t>require</w:t>
+            </w:r>
+            <w:proofErr w:type="spellEnd"/>
+            <w:r>
+              <w:t xml:space="preserve"> </w:t>
+            </w:r>
+            <w:proofErr w:type="spellStart"/>
+            <w:r>
+              <w:t>age-appropriate</w:t>
+            </w:r>
+            <w:proofErr w:type="spellEnd"/>
+            <w:r>
+              <w:t xml:space="preserve"> </w:t>
+            </w:r>
+            <w:proofErr w:type="spellStart"/>
+            <w:r>
+              <w:t>gynecological</w:t>
+            </w:r>
+            <w:proofErr w:type="spellEnd"/>
+            <w:r>
+              <w:t xml:space="preserve"> screening.</w:t>
             </w:r>
           </w:p>
         </w:tc>
@@ -5468,7 +6331,7 @@
       <w:pPr>
         <w:pStyle w:val="Resalte"/>
       </w:pPr>
-      <w:bookmarkStart w:id="21" w:name="_Toc231500559"/>
+      <w:bookmarkStart w:id="21" w:name="_Toc233126380"/>
       <w:r>
         <w:t xml:space="preserve">Pregunta 21: </w:t>
       </w:r>
@@ -5649,7 +6512,15 @@
           </w:tcPr>
           <w:p>
             <w:r>
-              <w:t>Los niveles reducidos de estrógenos y andrógenos están asocia dos con alteraciones en la estructura del tejido genital, incluida la red nerviosa, pudiendo producir molestias o una disminución de las sen saciones a nivel genital disminuyendo la satisfacción sexual.</w:t>
+              <w:t xml:space="preserve">Los niveles reducidos de estrógenos y andrógenos están asocia dos con alteraciones en la estructura del tejido genital, incluida la red nerviosa, pudiendo producir molestias o una disminución de las sen </w:t>
+            </w:r>
+            <w:proofErr w:type="spellStart"/>
+            <w:r>
+              <w:t>saciones</w:t>
+            </w:r>
+            <w:proofErr w:type="spellEnd"/>
+            <w:r>
+              <w:t xml:space="preserve"> a nivel genital disminuyendo la satisfacción sexual.</w:t>
             </w:r>
           </w:p>
         </w:tc>
@@ -5680,9 +6551,17 @@
       <w:pPr>
         <w:pStyle w:val="Resalte"/>
       </w:pPr>
-      <w:bookmarkStart w:id="22" w:name="_Toc231500560"/>
+      <w:bookmarkStart w:id="22" w:name="_Toc233126381"/>
       <w:r>
-        <w:t>Pregunta 22: ¿Se puede usar antidepresivos en pacientes con cancer de mama?</w:t>
+        <w:t xml:space="preserve">Pregunta 22: ¿Se puede usar antidepresivos en pacientes con </w:t>
+      </w:r>
+      <w:proofErr w:type="spellStart"/>
+      <w:r>
+        <w:t>cancer</w:t>
+      </w:r>
+      <w:proofErr w:type="spellEnd"/>
+      <w:r>
+        <w:t xml:space="preserve"> de mama?</w:t>
       </w:r>
       <w:bookmarkEnd w:id="22"/>
     </w:p>
@@ -5736,7 +6615,15 @@
           </w:tcPr>
           <w:p>
             <w:r>
-              <w:t>Los antidepresivos del tipo inhibidores selectivos de la recaptación de serotonina (ISRS) se deben utilizar con precaución en mujeres con cáncer de mama que reciban tratamiento adyuvante con tamoxifeno, ya que algunos pueden reducir su metabolismo. En este caso puede ser útil la cimicifuga racemosa.</w:t>
+              <w:t xml:space="preserve">Los antidepresivos del tipo inhibidores selectivos de la recaptación de serotonina (ISRS) se deben utilizar con precaución en mujeres con cáncer de mama que reciban tratamiento adyuvante con tamoxifeno, ya que algunos pueden reducir su metabolismo. En este caso puede ser útil la </w:t>
+            </w:r>
+            <w:proofErr w:type="spellStart"/>
+            <w:r>
+              <w:t>cimicifuga</w:t>
+            </w:r>
+            <w:proofErr w:type="spellEnd"/>
+            <w:r>
+              <w:t xml:space="preserve"> racemosa.</w:t>
             </w:r>
           </w:p>
         </w:tc>
@@ -5767,7 +6654,7 @@
       <w:pPr>
         <w:pStyle w:val="Resalte"/>
       </w:pPr>
-      <w:bookmarkStart w:id="23" w:name="_Toc231500561"/>
+      <w:bookmarkStart w:id="23" w:name="_Toc233126382"/>
       <w:r>
         <w:t>Pregunta 2</w:t>
       </w:r>
@@ -5829,7 +6716,47 @@
           </w:tcPr>
           <w:p>
             <w:r>
-              <w:t>La quimioterapia induce insuficiencia ovárica en más del 80 % de las mujeres mayores de 40 años y en más del 20 % de las mujeres mayores de 30, además, por su parte, la terapia endocrina tiene como objetivo reducir los niveles de estrógenos del organismo, provocando síntomas muy severos relacionados con la menopausia. Por tanto, es indispensa ble informar y conversar sobre la criopreservación de ovocitos, espe cialmente en las pacientes más jóvenes, antes de la quimioterapia o la ovariectomía profiláctica, por si después quieren tener hijos</w:t>
+              <w:t xml:space="preserve">La quimioterapia induce insuficiencia ovárica en más del 80 % de las mujeres mayores de 40 años y en más del 20 % de las mujeres mayores de 30, además, por su parte, la terapia endocrina tiene como objetivo reducir los niveles de estrógenos del organismo, provocando síntomas muy severos relacionados con la menopausia. Por tanto, es </w:t>
+            </w:r>
+            <w:proofErr w:type="spellStart"/>
+            <w:r>
+              <w:t>indispensa</w:t>
+            </w:r>
+            <w:proofErr w:type="spellEnd"/>
+            <w:r>
+              <w:t xml:space="preserve"> </w:t>
+            </w:r>
+            <w:proofErr w:type="spellStart"/>
+            <w:r>
+              <w:t>ble</w:t>
+            </w:r>
+            <w:proofErr w:type="spellEnd"/>
+            <w:r>
+              <w:t xml:space="preserve"> informar y conversar sobre la </w:t>
+            </w:r>
+            <w:proofErr w:type="spellStart"/>
+            <w:r>
+              <w:t>criopreservación</w:t>
+            </w:r>
+            <w:proofErr w:type="spellEnd"/>
+            <w:r>
+              <w:t xml:space="preserve"> de ovocitos, </w:t>
+            </w:r>
+            <w:proofErr w:type="spellStart"/>
+            <w:r>
+              <w:t>espe</w:t>
+            </w:r>
+            <w:proofErr w:type="spellEnd"/>
+            <w:r>
+              <w:t xml:space="preserve"> </w:t>
+            </w:r>
+            <w:proofErr w:type="spellStart"/>
+            <w:r>
+              <w:t>cialmente</w:t>
+            </w:r>
+            <w:proofErr w:type="spellEnd"/>
+            <w:r>
+              <w:t xml:space="preserve"> en las pacientes más jóvenes, antes de la quimioterapia o la ovariectomía profiláctica, por si después quieren tener hijos</w:t>
             </w:r>
             <w:r>
               <w:t xml:space="preserve">. </w:t>
@@ -5870,7 +6797,7 @@
       <w:pPr>
         <w:pStyle w:val="Resalte"/>
       </w:pPr>
-      <w:bookmarkStart w:id="24" w:name="_Toc231500562"/>
+      <w:bookmarkStart w:id="24" w:name="_Toc233126383"/>
       <w:r>
         <w:t>Pregunta 2</w:t>
       </w:r>
@@ -5979,7 +6906,7 @@
       <w:pPr>
         <w:pStyle w:val="Resalte"/>
       </w:pPr>
-      <w:bookmarkStart w:id="25" w:name="_Toc231500563"/>
+      <w:bookmarkStart w:id="25" w:name="_Toc233126384"/>
       <w:r>
         <w:t>Pregunta 2</w:t>
       </w:r>
@@ -5990,7 +6917,15 @@
         <w:t xml:space="preserve">: ¿Puedo </w:t>
       </w:r>
       <w:r>
-        <w:t>quedarme embarazada después de un tratamiento de cancer?</w:t>
+        <w:t xml:space="preserve">quedarme embarazada después de un tratamiento de </w:t>
+      </w:r>
+      <w:proofErr w:type="spellStart"/>
+      <w:r>
+        <w:t>cancer</w:t>
+      </w:r>
+      <w:proofErr w:type="spellEnd"/>
+      <w:r>
+        <w:t>?</w:t>
       </w:r>
       <w:bookmarkEnd w:id="25"/>
     </w:p>
@@ -6043,9 +6978,75 @@
             <w:tcW w:w="4673" w:type="dxa"/>
           </w:tcPr>
           <w:p>
-            <w:r>
-              <w:t>Available data suggest that pregnancy is safe after breast cancer treatment</w:t>
-            </w:r>
+            <w:proofErr w:type="spellStart"/>
+            <w:r>
+              <w:t>Available</w:t>
+            </w:r>
+            <w:proofErr w:type="spellEnd"/>
+            <w:r>
+              <w:t xml:space="preserve"> data </w:t>
+            </w:r>
+            <w:proofErr w:type="spellStart"/>
+            <w:r>
+              <w:t>suggest</w:t>
+            </w:r>
+            <w:proofErr w:type="spellEnd"/>
+            <w:r>
+              <w:t xml:space="preserve"> </w:t>
+            </w:r>
+            <w:proofErr w:type="spellStart"/>
+            <w:r>
+              <w:t>that</w:t>
+            </w:r>
+            <w:proofErr w:type="spellEnd"/>
+            <w:r>
+              <w:t xml:space="preserve"> </w:t>
+            </w:r>
+            <w:proofErr w:type="spellStart"/>
+            <w:r>
+              <w:t>pregnancy</w:t>
+            </w:r>
+            <w:proofErr w:type="spellEnd"/>
+            <w:r>
+              <w:t xml:space="preserve"> </w:t>
+            </w:r>
+            <w:proofErr w:type="spellStart"/>
+            <w:r>
+              <w:t>is</w:t>
+            </w:r>
+            <w:proofErr w:type="spellEnd"/>
+            <w:r>
+              <w:t xml:space="preserve"> </w:t>
+            </w:r>
+            <w:proofErr w:type="spellStart"/>
+            <w:r>
+              <w:t>safe</w:t>
+            </w:r>
+            <w:proofErr w:type="spellEnd"/>
+            <w:r>
+              <w:t xml:space="preserve"> after </w:t>
+            </w:r>
+            <w:proofErr w:type="spellStart"/>
+            <w:r>
+              <w:t>breast</w:t>
+            </w:r>
+            <w:proofErr w:type="spellEnd"/>
+            <w:r>
+              <w:t xml:space="preserve"> </w:t>
+            </w:r>
+            <w:proofErr w:type="spellStart"/>
+            <w:r>
+              <w:t>cancer</w:t>
+            </w:r>
+            <w:proofErr w:type="spellEnd"/>
+            <w:r>
+              <w:t xml:space="preserve"> </w:t>
+            </w:r>
+            <w:proofErr w:type="spellStart"/>
+            <w:r>
+              <w:t>treatment</w:t>
+            </w:r>
+            <w:proofErr w:type="spellEnd"/>
           </w:p>
         </w:tc>
         <w:tc>
@@ -6076,7 +7077,15 @@
           </w:tcPr>
           <w:p>
             <w:r>
-              <w:t>No existen contraindicaciones para quedar embarazada después de tener cáncer de mama. Sin embargo, hay varios puntos importantes a considerar, especialmente en el caso de cáncer de mama RE positivo, debido a la larga duración de la terapia endocrina. La terapia endocrina debe suspenderse antes de tratar de quedar embarazada y debe reanudarse después del parto y la lactancia. Si usted desea quedar embarazada, por favor discuta todas estas cuestiones cuidadosamente con su médico.</w:t>
+              <w:t xml:space="preserve">No existen contraindicaciones para quedar embarazada después de tener cáncer de mama. Sin embargo, hay varios puntos importantes a considerar, especialmente en el caso de cáncer de </w:t>
+            </w:r>
+            <w:proofErr w:type="gramStart"/>
+            <w:r>
+              <w:t>mama RE</w:t>
+            </w:r>
+            <w:proofErr w:type="gramEnd"/>
+            <w:r>
+              <w:t xml:space="preserve"> positivo, debido a la larga duración de la terapia endocrina. La terapia endocrina debe suspenderse antes de tratar de quedar embarazada y debe reanudarse después del parto y la lactancia. Si usted desea quedar embarazada, por favor discuta todas estas cuestiones cuidadosamente con su médico.</w:t>
             </w:r>
           </w:p>
         </w:tc>
@@ -6108,7 +7117,39 @@
           </w:tcPr>
           <w:p>
             <w:r>
-              <w:t>La mayoría de las guías recomiendan posponer el embarazo duran te al menos 2 años después del tratamiento del cáncer de mama, según el estadio y el tratamiento recibido. Sin embargo, es poco probable que las mujeres con enfermedad localizada empeoren el pronóstico si se quedan embarazadas. Estudios recientes evidencian que, en pacientes con cáncer de mama, pausar la terapia endocrina para poder quedarse embara zadas —bajo control médico y durante un periodo temporal que no supere los 2 años— no incrementa el riesgo de recaída a corto pla zo.</w:t>
+              <w:t xml:space="preserve">La mayoría de las guías recomiendan posponer el embarazo duran te al menos 2 años después del tratamiento del cáncer de mama, según el estadio y el tratamiento recibido. Sin embargo, es poco probable que las mujeres con enfermedad localizada empeoren el pronóstico si se quedan embarazadas. Estudios recientes evidencian que, en pacientes con cáncer de mama, pausar la terapia endocrina para poder quedarse </w:t>
+            </w:r>
+            <w:proofErr w:type="spellStart"/>
+            <w:r>
+              <w:t>embara</w:t>
+            </w:r>
+            <w:proofErr w:type="spellEnd"/>
+            <w:r>
+              <w:t xml:space="preserve"> </w:t>
+            </w:r>
+            <w:proofErr w:type="spellStart"/>
+            <w:r>
+              <w:t>zadas</w:t>
+            </w:r>
+            <w:proofErr w:type="spellEnd"/>
+            <w:r>
+              <w:t xml:space="preserve"> —bajo control médico y durante un periodo temporal que no supere los 2 años— no incrementa el riesgo de recaída a corto </w:t>
+            </w:r>
+            <w:proofErr w:type="spellStart"/>
+            <w:r>
+              <w:t>pla</w:t>
+            </w:r>
+            <w:proofErr w:type="spellEnd"/>
+            <w:r>
+              <w:t xml:space="preserve"> </w:t>
+            </w:r>
+            <w:proofErr w:type="spellStart"/>
+            <w:r>
+              <w:t>zo</w:t>
+            </w:r>
+            <w:proofErr w:type="spellEnd"/>
+            <w:r>
+              <w:t>.</w:t>
             </w:r>
           </w:p>
         </w:tc>
@@ -6139,7 +7180,7 @@
       <w:pPr>
         <w:pStyle w:val="Resalte"/>
       </w:pPr>
-      <w:bookmarkStart w:id="26" w:name="_Toc231500564"/>
+      <w:bookmarkStart w:id="26" w:name="_Toc233126385"/>
       <w:r>
         <w:lastRenderedPageBreak/>
         <w:t>Pregunta 2</w:t>
@@ -6151,7 +7192,15 @@
         <w:t xml:space="preserve">: ¿cuáles son los factores de riesgo </w:t>
       </w:r>
       <w:r>
-        <w:t>del cancer de mama?</w:t>
+        <w:t xml:space="preserve">del </w:t>
+      </w:r>
+      <w:proofErr w:type="spellStart"/>
+      <w:r>
+        <w:t>cancer</w:t>
+      </w:r>
+      <w:proofErr w:type="spellEnd"/>
+      <w:r>
+        <w:t xml:space="preserve"> de mama?</w:t>
       </w:r>
       <w:bookmarkEnd w:id="26"/>
     </w:p>
@@ -6213,7 +7262,31 @@
           </w:p>
           <w:p>
             <w:r>
-              <w:t xml:space="preserve">1. La edad es el principal factor de riesgo para padecer un cáncer de mama. El riesgo aumenta al aumentar la edad. 2. Historia personal de cáncer de mama invasivo (las mujeres que han tenido un cáncer de mama invasivo tienen más riesgo de padecer un cáncer de mama contralateral), carcinoma ductal in situ o lesiones benignas como la hiperplasia epitelial atípica. 3. Densidad mamaria elevada en las mamografías. 4. Historia menstrual larga, con una menarquia (edad de primera regla) temprana o una menopausia tardía 5. Exposición a radiaciones ionizantes, sobre todo durante la pubertad 6. Factores genéticos como mutaciones hereditarias en genes que asocian un aumento del riesgo de cáncer de mama, como BRCA1, BRCA2, PALB2, PTEN, TP53, ATM o CHEK 2entre otros. 7. Factores de riesgo modificables: 8. Factores reproductivos como la nuliparidad (no haber estado embarazada nunca), un primer embarazo por encima de los 30 años o la ausencia de lactancia materna.  9. El uso de terapia hormonal sustitutiva después de la menopausia aumenta el riesgo de cáncer de mama así como el uso de anticonceptivos orales, aunque el incremento absoluto es bajo.. 10. Consumo de alcohol. 11. Sobrepeso y obesidad, ya que la grasa es la principal fuente de estrógenos tras la menopausia. </w:t>
+              <w:t xml:space="preserve">1. La edad es el principal factor de riesgo para padecer un cáncer de mama. El riesgo aumenta al aumentar la edad. 2. Historia personal de cáncer de mama invasivo (las mujeres que han tenido un cáncer de mama invasivo tienen más riesgo de padecer un cáncer de mama contralateral), carcinoma ductal in situ o lesiones benignas como la hiperplasia epitelial atípica. 3. Densidad mamaria elevada en las mamografías. 4. Historia menstrual larga, con una menarquia (edad de primera regla) temprana o una menopausia tardía 5. Exposición a radiaciones ionizantes, sobre todo durante la pubertad 6. Factores genéticos como mutaciones hereditarias en genes que asocian un aumento del riesgo de cáncer de mama, como BRCA1, BRCA2, PALB2, PTEN, TP53, ATM o CHEK 2entre otros. 7. Factores de riesgo modificables: 8. Factores reproductivos como la </w:t>
+            </w:r>
+            <w:proofErr w:type="spellStart"/>
+            <w:r>
+              <w:t>nuliparidad</w:t>
+            </w:r>
+            <w:proofErr w:type="spellEnd"/>
+            <w:r>
+              <w:t xml:space="preserve"> (no haber estado embarazada nunca), un primer embarazo por encima de los 30 años o la ausencia de lactancia materna.  9. El uso de terapia hormonal sustitutiva después de la menopausia aumenta el riesgo de cáncer de </w:t>
+            </w:r>
+            <w:proofErr w:type="gramStart"/>
+            <w:r>
+              <w:t>mama</w:t>
+            </w:r>
+            <w:proofErr w:type="gramEnd"/>
+            <w:r>
+              <w:t xml:space="preserve"> así como el uso de anticonceptivos orales, aunque el incremento absoluto es </w:t>
+            </w:r>
+            <w:proofErr w:type="gramStart"/>
+            <w:r>
+              <w:t>bajo..</w:t>
+            </w:r>
+            <w:proofErr w:type="gramEnd"/>
+            <w:r>
+              <w:t xml:space="preserve"> 10. Consumo de alcohol. 11. Sobrepeso y obesidad, ya que la grasa es la principal fuente de estrógenos tras la menopausia. </w:t>
             </w:r>
             <w:r>
               <w:lastRenderedPageBreak/>
@@ -6415,7 +7488,7 @@
       <w:pPr>
         <w:pStyle w:val="Resalte"/>
       </w:pPr>
-      <w:bookmarkStart w:id="27" w:name="_Toc231500565"/>
+      <w:bookmarkStart w:id="27" w:name="_Toc233126386"/>
       <w:r>
         <w:t>Pregunta 2</w:t>
       </w:r>
@@ -6491,7 +7564,15 @@
               </w:tabs>
             </w:pPr>
             <w:r>
-              <w:t xml:space="preserve">Para la solicitud de pruebas de imagen de mama, tanto desde Atención Primaria como de Atención Especializada, se utilizará la petición electrónica, desde las plataformas Diraya y </w:t>
+              <w:t xml:space="preserve">Para la solicitud de pruebas de imagen de mama, tanto desde Atención Primaria como de Atención Especializada, se utilizará la petición electrónica, desde las plataformas </w:t>
+            </w:r>
+            <w:proofErr w:type="spellStart"/>
+            <w:r>
+              <w:t>Diraya</w:t>
+            </w:r>
+            <w:proofErr w:type="spellEnd"/>
+            <w:r>
+              <w:t xml:space="preserve"> y </w:t>
             </w:r>
             <w:r>
               <w:lastRenderedPageBreak/>
@@ -6537,7 +7618,7 @@
       <w:pPr>
         <w:pStyle w:val="Resalte"/>
       </w:pPr>
-      <w:bookmarkStart w:id="28" w:name="_Toc231500566"/>
+      <w:bookmarkStart w:id="28" w:name="_Toc233126387"/>
       <w:r>
         <w:t>Pregunta 2</w:t>
       </w:r>
@@ -6606,9 +7687,83 @@
                 <w:tab w:val="left" w:pos="892"/>
               </w:tabs>
             </w:pPr>
-            <w:r>
-              <w:t>Mutations in BRCA1 and BRCA2 high penetrance genes account for most hereditary breast and ovarian cancer</w:t>
-            </w:r>
+            <w:proofErr w:type="spellStart"/>
+            <w:r>
+              <w:t>Mutations</w:t>
+            </w:r>
+            <w:proofErr w:type="spellEnd"/>
+            <w:r>
+              <w:t xml:space="preserve"> in BRCA1 and BRCA2 </w:t>
+            </w:r>
+            <w:proofErr w:type="spellStart"/>
+            <w:r>
+              <w:t>high</w:t>
+            </w:r>
+            <w:proofErr w:type="spellEnd"/>
+            <w:r>
+              <w:t xml:space="preserve"> </w:t>
+            </w:r>
+            <w:proofErr w:type="spellStart"/>
+            <w:r>
+              <w:t>penetrance</w:t>
+            </w:r>
+            <w:proofErr w:type="spellEnd"/>
+            <w:r>
+              <w:t xml:space="preserve"> genes </w:t>
+            </w:r>
+            <w:proofErr w:type="spellStart"/>
+            <w:r>
+              <w:t>account</w:t>
+            </w:r>
+            <w:proofErr w:type="spellEnd"/>
+            <w:r>
+              <w:t xml:space="preserve"> </w:t>
+            </w:r>
+            <w:proofErr w:type="spellStart"/>
+            <w:r>
+              <w:t>for</w:t>
+            </w:r>
+            <w:proofErr w:type="spellEnd"/>
+            <w:r>
+              <w:t xml:space="preserve"> </w:t>
+            </w:r>
+            <w:proofErr w:type="spellStart"/>
+            <w:r>
+              <w:t>most</w:t>
+            </w:r>
+            <w:proofErr w:type="spellEnd"/>
+            <w:r>
+              <w:t xml:space="preserve"> </w:t>
+            </w:r>
+            <w:proofErr w:type="spellStart"/>
+            <w:r>
+              <w:t>hereditary</w:t>
+            </w:r>
+            <w:proofErr w:type="spellEnd"/>
+            <w:r>
+              <w:t xml:space="preserve"> </w:t>
+            </w:r>
+            <w:proofErr w:type="spellStart"/>
+            <w:r>
+              <w:t>breast</w:t>
+            </w:r>
+            <w:proofErr w:type="spellEnd"/>
+            <w:r>
+              <w:t xml:space="preserve"> and </w:t>
+            </w:r>
+            <w:proofErr w:type="spellStart"/>
+            <w:r>
+              <w:t>ovarian</w:t>
+            </w:r>
+            <w:proofErr w:type="spellEnd"/>
+            <w:r>
+              <w:t xml:space="preserve"> </w:t>
+            </w:r>
+            <w:proofErr w:type="spellStart"/>
+            <w:r>
+              <w:t>cancer</w:t>
+            </w:r>
+            <w:proofErr w:type="spellEnd"/>
             <w:r>
               <w:t xml:space="preserve">. </w:t>
             </w:r>
@@ -6652,8 +7807,301 @@
               </w:tabs>
             </w:pPr>
             <w:r>
-              <w:t>Most breast and ovarian cancers are sporadic, while hereditary predisposition accounts for 10–15% of the cases, principally with respect to germline mutations in high penetrance BRCA1/2 genes. Cumulative BC risk for BRCA1 and BRCA2 mutation carriers at 70 years of age is about 57%, respectively, while cumulative OC risk is approximately 40% for BRCA1 and 18% for BRCA2 muta tion carriers</w:t>
-            </w:r>
+              <w:t xml:space="preserve">Most </w:t>
+            </w:r>
+            <w:proofErr w:type="spellStart"/>
+            <w:r>
+              <w:t>breast</w:t>
+            </w:r>
+            <w:proofErr w:type="spellEnd"/>
+            <w:r>
+              <w:t xml:space="preserve"> and </w:t>
+            </w:r>
+            <w:proofErr w:type="spellStart"/>
+            <w:r>
+              <w:t>ovarian</w:t>
+            </w:r>
+            <w:proofErr w:type="spellEnd"/>
+            <w:r>
+              <w:t xml:space="preserve"> </w:t>
+            </w:r>
+            <w:proofErr w:type="spellStart"/>
+            <w:r>
+              <w:t>cancers</w:t>
+            </w:r>
+            <w:proofErr w:type="spellEnd"/>
+            <w:r>
+              <w:t xml:space="preserve"> are </w:t>
+            </w:r>
+            <w:proofErr w:type="spellStart"/>
+            <w:r>
+              <w:t>sporadic</w:t>
+            </w:r>
+            <w:proofErr w:type="spellEnd"/>
+            <w:r>
+              <w:t xml:space="preserve">, </w:t>
+            </w:r>
+            <w:proofErr w:type="spellStart"/>
+            <w:r>
+              <w:t>while</w:t>
+            </w:r>
+            <w:proofErr w:type="spellEnd"/>
+            <w:r>
+              <w:t xml:space="preserve"> </w:t>
+            </w:r>
+            <w:proofErr w:type="spellStart"/>
+            <w:r>
+              <w:t>hereditary</w:t>
+            </w:r>
+            <w:proofErr w:type="spellEnd"/>
+            <w:r>
+              <w:t xml:space="preserve"> </w:t>
+            </w:r>
+            <w:proofErr w:type="spellStart"/>
+            <w:r>
+              <w:t>predisposition</w:t>
+            </w:r>
+            <w:proofErr w:type="spellEnd"/>
+            <w:r>
+              <w:t xml:space="preserve"> </w:t>
+            </w:r>
+            <w:proofErr w:type="spellStart"/>
+            <w:r>
+              <w:t>accounts</w:t>
+            </w:r>
+            <w:proofErr w:type="spellEnd"/>
+            <w:r>
+              <w:t xml:space="preserve"> </w:t>
+            </w:r>
+            <w:proofErr w:type="spellStart"/>
+            <w:r>
+              <w:t>for</w:t>
+            </w:r>
+            <w:proofErr w:type="spellEnd"/>
+            <w:r>
+              <w:t xml:space="preserve"> 10–15% </w:t>
+            </w:r>
+            <w:proofErr w:type="spellStart"/>
+            <w:r>
+              <w:t>of</w:t>
+            </w:r>
+            <w:proofErr w:type="spellEnd"/>
+            <w:r>
+              <w:t xml:space="preserve"> </w:t>
+            </w:r>
+            <w:proofErr w:type="spellStart"/>
+            <w:r>
+              <w:t>the</w:t>
+            </w:r>
+            <w:proofErr w:type="spellEnd"/>
+            <w:r>
+              <w:t xml:space="preserve"> cases, </w:t>
+            </w:r>
+            <w:proofErr w:type="spellStart"/>
+            <w:r>
+              <w:t>principally</w:t>
+            </w:r>
+            <w:proofErr w:type="spellEnd"/>
+            <w:r>
+              <w:t xml:space="preserve"> </w:t>
+            </w:r>
+            <w:proofErr w:type="spellStart"/>
+            <w:r>
+              <w:t>with</w:t>
+            </w:r>
+            <w:proofErr w:type="spellEnd"/>
+            <w:r>
+              <w:t xml:space="preserve"> </w:t>
+            </w:r>
+            <w:proofErr w:type="spellStart"/>
+            <w:r>
+              <w:t>respect</w:t>
+            </w:r>
+            <w:proofErr w:type="spellEnd"/>
+            <w:r>
+              <w:t xml:space="preserve"> </w:t>
+            </w:r>
+            <w:proofErr w:type="spellStart"/>
+            <w:r>
+              <w:t>to</w:t>
+            </w:r>
+            <w:proofErr w:type="spellEnd"/>
+            <w:r>
+              <w:t xml:space="preserve"> </w:t>
+            </w:r>
+            <w:proofErr w:type="spellStart"/>
+            <w:r>
+              <w:t>germline</w:t>
+            </w:r>
+            <w:proofErr w:type="spellEnd"/>
+            <w:r>
+              <w:t xml:space="preserve"> </w:t>
+            </w:r>
+            <w:proofErr w:type="spellStart"/>
+            <w:r>
+              <w:t>mutations</w:t>
+            </w:r>
+            <w:proofErr w:type="spellEnd"/>
+            <w:r>
+              <w:t xml:space="preserve"> in </w:t>
+            </w:r>
+            <w:proofErr w:type="spellStart"/>
+            <w:r>
+              <w:t>high</w:t>
+            </w:r>
+            <w:proofErr w:type="spellEnd"/>
+            <w:r>
+              <w:t xml:space="preserve"> </w:t>
+            </w:r>
+            <w:proofErr w:type="spellStart"/>
+            <w:r>
+              <w:t>penetrance</w:t>
+            </w:r>
+            <w:proofErr w:type="spellEnd"/>
+            <w:r>
+              <w:t xml:space="preserve"> BRCA1/2 genes. Cumulative BC </w:t>
+            </w:r>
+            <w:proofErr w:type="spellStart"/>
+            <w:r>
+              <w:t>risk</w:t>
+            </w:r>
+            <w:proofErr w:type="spellEnd"/>
+            <w:r>
+              <w:t xml:space="preserve"> </w:t>
+            </w:r>
+            <w:proofErr w:type="spellStart"/>
+            <w:r>
+              <w:t>for</w:t>
+            </w:r>
+            <w:proofErr w:type="spellEnd"/>
+            <w:r>
+              <w:t xml:space="preserve"> BRCA1 and BRCA2 </w:t>
+            </w:r>
+            <w:proofErr w:type="spellStart"/>
+            <w:r>
+              <w:t>mutation</w:t>
+            </w:r>
+            <w:proofErr w:type="spellEnd"/>
+            <w:r>
+              <w:t xml:space="preserve"> </w:t>
+            </w:r>
+            <w:proofErr w:type="spellStart"/>
+            <w:r>
+              <w:t>carriers</w:t>
+            </w:r>
+            <w:proofErr w:type="spellEnd"/>
+            <w:r>
+              <w:t xml:space="preserve"> at 70 </w:t>
+            </w:r>
+            <w:proofErr w:type="spellStart"/>
+            <w:r>
+              <w:t>years</w:t>
+            </w:r>
+            <w:proofErr w:type="spellEnd"/>
+            <w:r>
+              <w:t xml:space="preserve"> </w:t>
+            </w:r>
+            <w:proofErr w:type="spellStart"/>
+            <w:r>
+              <w:t>of</w:t>
+            </w:r>
+            <w:proofErr w:type="spellEnd"/>
+            <w:r>
+              <w:t xml:space="preserve"> </w:t>
+            </w:r>
+            <w:proofErr w:type="spellStart"/>
+            <w:r>
+              <w:t>age</w:t>
+            </w:r>
+            <w:proofErr w:type="spellEnd"/>
+            <w:r>
+              <w:t xml:space="preserve"> </w:t>
+            </w:r>
+            <w:proofErr w:type="spellStart"/>
+            <w:r>
+              <w:t>is</w:t>
+            </w:r>
+            <w:proofErr w:type="spellEnd"/>
+            <w:r>
+              <w:t xml:space="preserve"> </w:t>
+            </w:r>
+            <w:proofErr w:type="spellStart"/>
+            <w:r>
+              <w:t>about</w:t>
+            </w:r>
+            <w:proofErr w:type="spellEnd"/>
+            <w:r>
+              <w:t xml:space="preserve"> 57%, </w:t>
+            </w:r>
+            <w:proofErr w:type="spellStart"/>
+            <w:r>
+              <w:t>respectively</w:t>
+            </w:r>
+            <w:proofErr w:type="spellEnd"/>
+            <w:r>
+              <w:t xml:space="preserve">, </w:t>
+            </w:r>
+            <w:proofErr w:type="spellStart"/>
+            <w:r>
+              <w:t>while</w:t>
+            </w:r>
+            <w:proofErr w:type="spellEnd"/>
+            <w:r>
+              <w:t xml:space="preserve"> cumulative OC </w:t>
+            </w:r>
+            <w:proofErr w:type="spellStart"/>
+            <w:r>
+              <w:t>risk</w:t>
+            </w:r>
+            <w:proofErr w:type="spellEnd"/>
+            <w:r>
+              <w:t xml:space="preserve"> </w:t>
+            </w:r>
+            <w:proofErr w:type="spellStart"/>
+            <w:r>
+              <w:t>is</w:t>
+            </w:r>
+            <w:proofErr w:type="spellEnd"/>
+            <w:r>
+              <w:t xml:space="preserve"> </w:t>
+            </w:r>
+            <w:proofErr w:type="spellStart"/>
+            <w:r>
+              <w:t>approximately</w:t>
+            </w:r>
+            <w:proofErr w:type="spellEnd"/>
+            <w:r>
+              <w:t xml:space="preserve"> 40% </w:t>
+            </w:r>
+            <w:proofErr w:type="spellStart"/>
+            <w:r>
+              <w:t>for</w:t>
+            </w:r>
+            <w:proofErr w:type="spellEnd"/>
+            <w:r>
+              <w:t xml:space="preserve"> BRCA1 and 18% </w:t>
+            </w:r>
+            <w:proofErr w:type="spellStart"/>
+            <w:r>
+              <w:t>for</w:t>
+            </w:r>
+            <w:proofErr w:type="spellEnd"/>
+            <w:r>
+              <w:t xml:space="preserve"> BRCA2 muta </w:t>
+            </w:r>
+            <w:proofErr w:type="spellStart"/>
+            <w:r>
+              <w:t>tion</w:t>
+            </w:r>
+            <w:proofErr w:type="spellEnd"/>
+            <w:r>
+              <w:t xml:space="preserve"> </w:t>
+            </w:r>
+            <w:proofErr w:type="spellStart"/>
+            <w:r>
+              <w:t>carriers</w:t>
+            </w:r>
+            <w:proofErr w:type="spellEnd"/>
           </w:p>
         </w:tc>
         <w:tc>
@@ -6689,7 +8137,167 @@
               </w:tabs>
             </w:pPr>
             <w:r>
-              <w:t>BRCA1 and BRCA2 are the most common mutated susceptibility genes in both tumors, followed by PALB2 (in BC) and genes with pathogenic variants that confer moderate penetrance cancer risk, such as ATM/CHEK2 (in BC) and BRIP1, RAD51C, RAD51D, MLH1, MSH2, and MSH6 (in OvC).</w:t>
+              <w:t xml:space="preserve">BRCA1 and BRCA2 are </w:t>
+            </w:r>
+            <w:proofErr w:type="spellStart"/>
+            <w:r>
+              <w:t>the</w:t>
+            </w:r>
+            <w:proofErr w:type="spellEnd"/>
+            <w:r>
+              <w:t xml:space="preserve"> </w:t>
+            </w:r>
+            <w:proofErr w:type="spellStart"/>
+            <w:r>
+              <w:t>most</w:t>
+            </w:r>
+            <w:proofErr w:type="spellEnd"/>
+            <w:r>
+              <w:t xml:space="preserve"> </w:t>
+            </w:r>
+            <w:proofErr w:type="spellStart"/>
+            <w:r>
+              <w:t>common</w:t>
+            </w:r>
+            <w:proofErr w:type="spellEnd"/>
+            <w:r>
+              <w:t xml:space="preserve"> </w:t>
+            </w:r>
+            <w:proofErr w:type="spellStart"/>
+            <w:r>
+              <w:t>mutated</w:t>
+            </w:r>
+            <w:proofErr w:type="spellEnd"/>
+            <w:r>
+              <w:t xml:space="preserve"> </w:t>
+            </w:r>
+            <w:proofErr w:type="spellStart"/>
+            <w:r>
+              <w:t>susceptibility</w:t>
+            </w:r>
+            <w:proofErr w:type="spellEnd"/>
+            <w:r>
+              <w:t xml:space="preserve"> genes in </w:t>
+            </w:r>
+            <w:proofErr w:type="spellStart"/>
+            <w:r>
+              <w:t>both</w:t>
+            </w:r>
+            <w:proofErr w:type="spellEnd"/>
+            <w:r>
+              <w:t xml:space="preserve"> </w:t>
+            </w:r>
+            <w:proofErr w:type="spellStart"/>
+            <w:r>
+              <w:t>tumors</w:t>
+            </w:r>
+            <w:proofErr w:type="spellEnd"/>
+            <w:r>
+              <w:t xml:space="preserve">, </w:t>
+            </w:r>
+            <w:proofErr w:type="spellStart"/>
+            <w:r>
+              <w:t>followed</w:t>
+            </w:r>
+            <w:proofErr w:type="spellEnd"/>
+            <w:r>
+              <w:t xml:space="preserve"> </w:t>
+            </w:r>
+            <w:proofErr w:type="spellStart"/>
+            <w:r>
+              <w:t>by</w:t>
+            </w:r>
+            <w:proofErr w:type="spellEnd"/>
+            <w:r>
+              <w:t xml:space="preserve"> PALB2 (in BC) and genes </w:t>
+            </w:r>
+            <w:proofErr w:type="spellStart"/>
+            <w:r>
+              <w:t>with</w:t>
+            </w:r>
+            <w:proofErr w:type="spellEnd"/>
+            <w:r>
+              <w:t xml:space="preserve"> </w:t>
+            </w:r>
+            <w:proofErr w:type="spellStart"/>
+            <w:r>
+              <w:t>pathogenic</w:t>
+            </w:r>
+            <w:proofErr w:type="spellEnd"/>
+            <w:r>
+              <w:t xml:space="preserve"> </w:t>
+            </w:r>
+            <w:proofErr w:type="spellStart"/>
+            <w:r>
+              <w:t>variants</w:t>
+            </w:r>
+            <w:proofErr w:type="spellEnd"/>
+            <w:r>
+              <w:t xml:space="preserve"> </w:t>
+            </w:r>
+            <w:proofErr w:type="spellStart"/>
+            <w:r>
+              <w:t>that</w:t>
+            </w:r>
+            <w:proofErr w:type="spellEnd"/>
+            <w:r>
+              <w:t xml:space="preserve"> </w:t>
+            </w:r>
+            <w:proofErr w:type="spellStart"/>
+            <w:r>
+              <w:t>confer</w:t>
+            </w:r>
+            <w:proofErr w:type="spellEnd"/>
+            <w:r>
+              <w:t xml:space="preserve"> </w:t>
+            </w:r>
+            <w:proofErr w:type="spellStart"/>
+            <w:r>
+              <w:t>moderate</w:t>
+            </w:r>
+            <w:proofErr w:type="spellEnd"/>
+            <w:r>
+              <w:t xml:space="preserve"> </w:t>
+            </w:r>
+            <w:proofErr w:type="spellStart"/>
+            <w:r>
+              <w:t>penetrance</w:t>
+            </w:r>
+            <w:proofErr w:type="spellEnd"/>
+            <w:r>
+              <w:t xml:space="preserve"> </w:t>
+            </w:r>
+            <w:proofErr w:type="spellStart"/>
+            <w:r>
+              <w:t>cancer</w:t>
+            </w:r>
+            <w:proofErr w:type="spellEnd"/>
+            <w:r>
+              <w:t xml:space="preserve"> </w:t>
+            </w:r>
+            <w:proofErr w:type="spellStart"/>
+            <w:r>
+              <w:t>risk</w:t>
+            </w:r>
+            <w:proofErr w:type="spellEnd"/>
+            <w:r>
+              <w:t xml:space="preserve">, </w:t>
+            </w:r>
+            <w:proofErr w:type="spellStart"/>
+            <w:r>
+              <w:t>such</w:t>
+            </w:r>
+            <w:proofErr w:type="spellEnd"/>
+            <w:r>
+              <w:t xml:space="preserve"> as ATM/CHEK2 (in BC) and BRIP1, RAD51C, RAD51D, MLH1, MSH2, and MSH6 (in </w:t>
+            </w:r>
+            <w:proofErr w:type="spellStart"/>
+            <w:r>
+              <w:t>OvC</w:t>
+            </w:r>
+            <w:proofErr w:type="spellEnd"/>
+            <w:r>
+              <w:t>).</w:t>
             </w:r>
           </w:p>
         </w:tc>
@@ -6865,7 +8473,159 @@
               </w:tabs>
             </w:pPr>
             <w:r>
-              <w:t>BRCA and BRCA2 are high-penetrance cancer susceptibility genes [...] mutated in 5% of unselected BC patients. [...] incidence can be higher among males with either genetic disorders or germline mutations in cancer susceptibility genes (BRCA2, CHEK2, ATM and PALB2)</w:t>
+              <w:t xml:space="preserve">BRCA and BRCA2 are </w:t>
+            </w:r>
+            <w:proofErr w:type="spellStart"/>
+            <w:r>
+              <w:t>high-penetrance</w:t>
+            </w:r>
+            <w:proofErr w:type="spellEnd"/>
+            <w:r>
+              <w:t xml:space="preserve"> </w:t>
+            </w:r>
+            <w:proofErr w:type="spellStart"/>
+            <w:r>
+              <w:t>cancer</w:t>
+            </w:r>
+            <w:proofErr w:type="spellEnd"/>
+            <w:r>
+              <w:t xml:space="preserve"> </w:t>
+            </w:r>
+            <w:proofErr w:type="spellStart"/>
+            <w:r>
+              <w:t>susceptibility</w:t>
+            </w:r>
+            <w:proofErr w:type="spellEnd"/>
+            <w:r>
+              <w:t xml:space="preserve"> genes [...] </w:t>
+            </w:r>
+            <w:proofErr w:type="spellStart"/>
+            <w:r>
+              <w:t>mutated</w:t>
+            </w:r>
+            <w:proofErr w:type="spellEnd"/>
+            <w:r>
+              <w:t xml:space="preserve"> in 5% </w:t>
+            </w:r>
+            <w:proofErr w:type="spellStart"/>
+            <w:r>
+              <w:t>of</w:t>
+            </w:r>
+            <w:proofErr w:type="spellEnd"/>
+            <w:r>
+              <w:t xml:space="preserve"> </w:t>
+            </w:r>
+            <w:proofErr w:type="spellStart"/>
+            <w:r>
+              <w:t>unselected</w:t>
+            </w:r>
+            <w:proofErr w:type="spellEnd"/>
+            <w:r>
+              <w:t xml:space="preserve"> BC </w:t>
+            </w:r>
+            <w:proofErr w:type="spellStart"/>
+            <w:r>
+              <w:t>patients</w:t>
+            </w:r>
+            <w:proofErr w:type="spellEnd"/>
+            <w:r>
+              <w:t xml:space="preserve">. [...] </w:t>
+            </w:r>
+            <w:proofErr w:type="spellStart"/>
+            <w:r>
+              <w:t>incidence</w:t>
+            </w:r>
+            <w:proofErr w:type="spellEnd"/>
+            <w:r>
+              <w:t xml:space="preserve"> can be </w:t>
+            </w:r>
+            <w:proofErr w:type="spellStart"/>
+            <w:r>
+              <w:t>higher</w:t>
+            </w:r>
+            <w:proofErr w:type="spellEnd"/>
+            <w:r>
+              <w:t xml:space="preserve"> </w:t>
+            </w:r>
+            <w:proofErr w:type="spellStart"/>
+            <w:r>
+              <w:t>among</w:t>
+            </w:r>
+            <w:proofErr w:type="spellEnd"/>
+            <w:r>
+              <w:t xml:space="preserve"> males </w:t>
+            </w:r>
+            <w:proofErr w:type="spellStart"/>
+            <w:r>
+              <w:t>with</w:t>
+            </w:r>
+            <w:proofErr w:type="spellEnd"/>
+            <w:r>
+              <w:t xml:space="preserve"> </w:t>
+            </w:r>
+            <w:proofErr w:type="spellStart"/>
+            <w:r>
+              <w:t>either</w:t>
+            </w:r>
+            <w:proofErr w:type="spellEnd"/>
+            <w:r>
+              <w:t xml:space="preserve"> </w:t>
+            </w:r>
+            <w:proofErr w:type="spellStart"/>
+            <w:r>
+              <w:t>genetic</w:t>
+            </w:r>
+            <w:proofErr w:type="spellEnd"/>
+            <w:r>
+              <w:t xml:space="preserve"> </w:t>
+            </w:r>
+            <w:proofErr w:type="spellStart"/>
+            <w:r>
+              <w:t>disorders</w:t>
+            </w:r>
+            <w:proofErr w:type="spellEnd"/>
+            <w:r>
+              <w:t xml:space="preserve"> </w:t>
+            </w:r>
+            <w:proofErr w:type="spellStart"/>
+            <w:r>
+              <w:t>or</w:t>
+            </w:r>
+            <w:proofErr w:type="spellEnd"/>
+            <w:r>
+              <w:t xml:space="preserve"> </w:t>
+            </w:r>
+            <w:proofErr w:type="spellStart"/>
+            <w:r>
+              <w:t>germline</w:t>
+            </w:r>
+            <w:proofErr w:type="spellEnd"/>
+            <w:r>
+              <w:t xml:space="preserve"> </w:t>
+            </w:r>
+            <w:proofErr w:type="spellStart"/>
+            <w:r>
+              <w:t>mutations</w:t>
+            </w:r>
+            <w:proofErr w:type="spellEnd"/>
+            <w:r>
+              <w:t xml:space="preserve"> in </w:t>
+            </w:r>
+            <w:proofErr w:type="spellStart"/>
+            <w:r>
+              <w:t>cancer</w:t>
+            </w:r>
+            <w:proofErr w:type="spellEnd"/>
+            <w:r>
+              <w:t xml:space="preserve"> </w:t>
+            </w:r>
+            <w:proofErr w:type="spellStart"/>
+            <w:r>
+              <w:t>susceptibility</w:t>
+            </w:r>
+            <w:proofErr w:type="spellEnd"/>
+            <w:r>
+              <w:t xml:space="preserve"> genes (BRCA2, CHEK2, ATM and PALB2)</w:t>
             </w:r>
           </w:p>
         </w:tc>
@@ -6896,7 +8656,7 @@
       <w:pPr>
         <w:pStyle w:val="Resalte"/>
       </w:pPr>
-      <w:bookmarkStart w:id="29" w:name="_Toc231500567"/>
+      <w:bookmarkStart w:id="29" w:name="_Toc233126388"/>
       <w:r>
         <w:t>Pregunta 2</w:t>
       </w:r>
@@ -7005,7 +8765,7 @@
       <w:pPr>
         <w:pStyle w:val="Resalte"/>
       </w:pPr>
-      <w:bookmarkStart w:id="30" w:name="_Toc231500568"/>
+      <w:bookmarkStart w:id="30" w:name="_Toc233126389"/>
       <w:r>
         <w:t xml:space="preserve">Pregunta </w:t>
       </w:r>
@@ -7225,7 +8985,7 @@
       <w:pPr>
         <w:pStyle w:val="Resalte"/>
       </w:pPr>
-      <w:bookmarkStart w:id="31" w:name="_Toc231500569"/>
+      <w:bookmarkStart w:id="31" w:name="_Toc233126390"/>
       <w:r>
         <w:t>Pregunta 3</w:t>
       </w:r>

</xml_diff>